<commit_message>
Release 0.8.1: read LLM/embedding ids from .env and verify Gemini hybrid live.
Keep chat, draft, and review on the configured cloud model while embeddings stay local, and cap Q&A citation chips so RAG-heavy answers stay readable.

Co-authored-by: Cursor <cursoragent@cursor.com>
</commit_message>
<xml_diff>
--- a/Discussions/test-evidence/workflow-quality-export.docx
+++ b/Discussions/test-evidence/workflow-quality-export.docx
@@ -29,7 +29,7 @@
           <w:sz w:val="36"/>
           <w:szCs w:val="36"/>
         </w:rPr>
-        <w:t>workflow quality 20260915-110117</w:t>
+        <w:t>workflow quality 20260917-211904</w:t>
       </w:r>
     </w:p>
     <w:p>
@@ -43,7 +43,7 @@
           <w:sz w:val="32"/>
           <w:szCs w:val="32"/>
         </w:rPr>
-        <w:t>วันที่ ๑๕ กันยายน พ.ศ. ๒๕๖๙</w:t>
+        <w:t>วันที่ ๑๗ กันยายน พ.ศ. ๒๕๖๙</w:t>
       </w:r>
     </w:p>
     <w:p>
@@ -76,7 +76,7 @@
           <w:sz w:val="32"/>
           <w:szCs w:val="32"/>
         </w:rPr>
-        <w:t>กรมบัญชีกลางมีภารกิจหลักในการกำกับดูแลการจัดซื้อจัดจ้างและการบริหารพัสดุภาครัฐให้เป็นไปตามพระราชบัญญัติการจัดซื้อจัดจ้างและการบริหารพัสดุภาครัฐ พ.ศ. ๒๕๖๐ เพื่อให้เกิดความคุ้มค่าต่อภารกิจของรัฐและป้องกันปัญหาการทุจริตในการดำเนินการด้านพัสดุ การดำเนินงานดังกล่าวจึงต้องอาศัยระบบสารสนเทศที่ทันสมัยและมีประสิทธิภาพเพื่อสนับสนุนกระบวนการทำงานอย่างครบวงจร</w:t>
+        <w:t>ด้วยกรมบัญชีกลาง มีภารกิจหลักในการกำกับดูแลการจัดซื้อจัดจ้างและการบริหารพัสดุภาครัฐ การเบิกจ่ายงบประมาณ และการคลังภาครัฐ ให้เป็นไปตามพระราชบัญญัติการจัดซื้อจัดจ้างและการบริหารพัสดุภาครัฐ พ.ศ. ๒๕๖๐ รวมถึงกฎหมาย ระเบียบ และข้อบังคับอื่น ๆ ที่เกี่ยวข้อง เพื่อให้เกิดความคุ้มค่า โปร่งใส และตรวจสอบได้ในการใช้จ่ายเงินงบประมาณของแผ่นดิน</w:t>
       </w:r>
     </w:p>
     <w:p>
@@ -90,7 +90,7 @@
           <w:sz w:val="32"/>
           <w:szCs w:val="32"/>
         </w:rPr>
-        <w:t>ปัจจุบัน ระบบบริหารสัญญาจัดซื้อจัดจ้างภาครัฐได้มีการใช้งานมาเป็นระยะเวลา ๘ ปีแล้ว อย่างไรก็ดี การติดตามสถานะงวดจ่ายของสัญญายังคงต้องดำเนินการด้วยแฟ้มกระดาษและตารางแยกส่วน ทำให้เกิดความล่าช้าในการรายงานสถานะสัญญา โดยมีข้อมูลที่อยู่ระหว่างการดำเนินการประมาณ ๑,๒๐๐ สัญญาต่อปี ซึ่งส่งผลให้สถานะสัญญาล่าช้าโดยเฉลี่ยถึง ๑๒ วันต่อสัญญา</w:t>
+        <w:t>ในปัจจุบัน กรมบัญชีกลางต้องรับผิดชอบการบริหารสัญญาจัดซื้อจัดจ้างของหน่วยงานภาครัฐทั่วประเทศที่มีปริมาณสัญญารอยู่ระหว่างดำเนินการประมาณหนึ่งพันสองร้อยสัญญาต่อปี แต่ระบบบริหารสัญญาเดิมที่ใช้งานอยู่ในปัจจุบันได้เปิดใช้งานมาเป็นระยะเวลาแปดปีแล้ว ซึ่งกระบวนการทำงานส่วนใหญ่ยังคงต้องติดตามงวดจ่ายด้วยแฟ้มกระดาษและตารางข้อมูลที่แยก</w:t>
       </w:r>
     </w:p>
     <w:p>
@@ -104,7 +104,7 @@
           <w:sz w:val="32"/>
           <w:szCs w:val="32"/>
         </w:rPr>
-        <w:t>ด้วยปัญหาดังกล่าวที่ทำให้กระบวนการติดตามและบริหารจัดการสัญญาไม่เป็นระบบ และส่งผลกระทบต่อความรวดเร็วในการปฏิบัติงานของเจ้าหน้าที่พัสดุ ผู้ตรวจรับงาน และผู้ตรวจสอบภายใน ดังนั้น จึงมีความจำเป็นต้องจ้างพัฒนาระบบสารสนเทศบริหารสัญญาจัดซื้อจัดจ้าง เพื่อทดแทนระบบเดิมให้สามารถเชื่อมโยงข้อมูลสัญญากับการติดตามงวดจ่ายและหลักฐานการตรวจรับได้ในระบบเดียวอย่างสมบูรณ์</w:t>
+        <w:t>จากสภาพการทำงานดังกล่าว ส่งผลให้เกิดปัญหาความล่าช้าในการติดตามสถานะสัญญา โดยพบว่ามีความล่าช้าเฉลี่ยสิบสองวันต่อหนึ่งสัญญา ซึ่งกระทบต่อประสิทธิภาพในการกำกับดูแลและการรายงานข้อมูลต่อผู้บริหารอย่างทันท่วงที ดังนั้น กรมบัญชีกลางจึงมีความจำเป็นต้องจ้างพัฒนาระบบสารสนเทศบริหารสัญญาจัดซื้อจัดจ้าง เพื่อทดแทนระบบเดิมให้มีความทันสมัยและมีประสิทธิภาพยิ่งขึ้น</w:t>
       </w:r>
     </w:p>
     <w:p>
@@ -132,7 +132,7 @@
           <w:sz w:val="32"/>
           <w:szCs w:val="32"/>
         </w:rPr>
-        <w:t>ด้วยกรมบัญชีกลางมีความประสงค์ในการจัดจ้างพัฒนาระบบสารสนเทศบริหารสัญญาจัดซื้อจัดจ้างภาครัฐ โดยมีวัตถุประสงค์หลักดังนี้</w:t>
+        <w:t>เพื่อสนับสนุนให้เจ้าหน้าที่พัสดุและผู้ตรวจรับสามารถติดตามงวดจ่าย การส่งมอบ และการตรวจรับได้ครบถ้วนถูกต้องตามบทบัญญัติแห่งกฎหมาย</w:t>
       </w:r>
     </w:p>
     <w:p>
@@ -146,7 +146,7 @@
           <w:sz w:val="32"/>
           <w:szCs w:val="32"/>
         </w:rPr>
-        <w:t>เพื่อให้เจ้าหน้าที่พัสดุและผู้ตรวจรับสามารถติดตามการดำเนินการด้านงวดจ่าย การส่งมอบ และการตรวจรับได้อย่างครบถ้วนสมบูรณ์ตามข้อกำหนดของกฎหมายที่เกี่ยวข้อง</w:t>
+        <w:t>เพื่อเชื่อมโยงข้อมูลสัญญาจัดซื้อจัดจ้างเข้ากับงวดจ่ายและหลักฐานการตรวจรับให้อยู่ในระบบงานเดียวกัน</w:t>
       </w:r>
     </w:p>
     <w:p>
@@ -160,7 +160,7 @@
           <w:sz w:val="32"/>
           <w:szCs w:val="32"/>
         </w:rPr>
-        <w:t>เพื่อเชื่อมโยงข้อมูลสัญญาจัดซื้อจัดจ้างเข้ากับข้อมูลงวดจ่ายและหลักฐานการตรวจรับในระบบงานเดียวกันอย่างเป็นองค์รวม</w:t>
+        <w:t>เพื่อสนับสนุนการรายงานสถานะสัญญาต่อผู้บริหารให้สามารถดำเนินการได้แล้วเสร็จภายในหนึ่งวันทำการ</w:t>
       </w:r>
     </w:p>
     <w:p>
@@ -174,7 +174,7 @@
           <w:sz w:val="32"/>
           <w:szCs w:val="32"/>
         </w:rPr>
-        <w:t>เพื่อสนับสนุนให้ผู้บริหารสามารถรายงานสถานะของสัญญาจัดซื้อจัดจ้างต่อสาธารณะได้อย่างรวดเร็วภายในระยะเวลาหนึ่งวันทำการ</w:t>
+        <w:t>เพื่อเพิ่มประสิทธิภาพในการบริหารสัญญาจัดซื้อจัดจ้างภาครัฐของกรมบัญชีกลางผ่านระบบสารสนเทศ</w:t>
       </w:r>
     </w:p>
     <w:p>
@@ -188,7 +188,7 @@
           <w:sz w:val="32"/>
           <w:szCs w:val="32"/>
         </w:rPr>
-        <w:t>กลุ่มผู้ใช้งานเป้าหมายที่ได้รับประโยชน์จากระบบนี้คือ เจ้าหน้าที่พัสดุ ผู้ตรวจรับงาน และผู้ตรวจสอบภายในของกรมบัญชีกลาง ซึ่งจะช่วยเพิ่มประสิทธิภาพในการปฏิบัติงานให้เป็นไปอย่างถูกต้องและทันท่วงที</w:t>
+        <w:t>กลุ่มผู้ใช้งานเป้าหมายของระบบงานประกอบด้วยเจ้าหน้าที่พัสดุ ผู้ตรวจรับงาน และผู้ตรวจสอบภายในของกรมบัญชีกลาง</w:t>
       </w:r>
     </w:p>
     <w:p>
@@ -202,7 +202,7 @@
           <w:sz w:val="32"/>
           <w:szCs w:val="32"/>
         </w:rPr>
-        <w:t>โดยมีตัวชี้วัดความสำเร็จที่สำคัญ คือ การลดระยะเวลาในการติดตามงวดจ่ายจากเดิมซึ่งใช้เวลาเฉลี่ยสิบสองวัน ให้เหลือไม่เกินสองวันทำการ และสามารถครอบคลุมการดำเนินการของสัญญาจัดซื้อจัดจ้างได้ไม่น้อยกว่าร้อยละเก้าสิบห้า</w:t>
+        <w:t>การวัดผลความสำเร็จของโครงการกำหนดให้ลดระยะเวลาในการติดตามงวดจ่ายจากเดิมสิบสองวันเหลือไม่เกินสองวันทำการ และสามารถครอบคลุมสัญญาที่อยู่ระหว่างดำเนินการได้ไม่น้อยกว่าร้อยละเก้าสิบห้าของสัญญาดั้งเดิมทั้งหมด</w:t>
       </w:r>
     </w:p>
     <w:p>
@@ -230,7 +230,7 @@
           <w:sz w:val="32"/>
           <w:szCs w:val="32"/>
         </w:rPr>
-        <w:t>คุณสมบัติทั่วไปของผู้ยื่นข้อเสนอ</w:t>
+        <w:t>ผู้รับจ้างต้องมีคุณสมบัติทั่วไปและคุณสมบัติเฉพาะตามพระราชบัญญัติการจัดซื้อจัดจ้างและการบริหารพัสดุภาครัฐ พ.ศ. ๒๕๖๐ และระเบียบกระทรวงการคลังว่าด้วยการจัดซื้อจัดจ้างและการบริหารพัสดุภาครัฐ พ.ศ. ๒๕๖๐ ดังต่อไปนี้</w:t>
       </w:r>
     </w:p>
     <w:p>
@@ -244,7 +244,7 @@
           <w:sz w:val="32"/>
           <w:szCs w:val="32"/>
         </w:rPr>
-        <w:t>ผู้ยื่นข้อเสนอจะต้องมีคุณสมบัติดังต่อไปนี้โดยเคร่งครัด</w:t>
+        <w:t>มีความสามารถตามกฎหมาย</w:t>
       </w:r>
     </w:p>
     <w:p>
@@ -258,7 +258,7 @@
           <w:sz w:val="32"/>
           <w:szCs w:val="32"/>
         </w:rPr>
-        <w:t>๑. ต้องเป็นนิติบุคคลที่จดทะเบียนในประเทศไทย และต้องไม่เป็นผู้ถูกระงับการยื่นข้อเสนอ หรืออยู่ในระหว่างการล้มละลาย</w:t>
+        <w:t>ไม่เป็นบุคคลล้มละลาย</w:t>
       </w:r>
     </w:p>
     <w:p>
@@ -272,7 +272,7 @@
           <w:sz w:val="32"/>
           <w:szCs w:val="32"/>
         </w:rPr>
-        <w:t>๒. ต้องไม่เป็นผู้ทิ้งงานของทางราชการหรือรัฐวิสาหกิจ</w:t>
+        <w:t>ไม่อยู่ระหว่างเลิกกิจการ</w:t>
       </w:r>
     </w:p>
     <w:p>
@@ -286,7 +286,7 @@
           <w:sz w:val="32"/>
           <w:szCs w:val="32"/>
         </w:rPr>
-        <w:t>๓. ต้องไม่มีลักษณะต้องห้ามตามพระราชบัญญัติการจัดซื้อจัดจ้างและการบริหารพัสดุภาครัฐ พ.ศ. ๒๕๖๐ และระเบียบที่เกี่ยวข้อง</w:t>
+        <w:t>ไม่อยู่ระหว่างถูกระงับการยื่นข้อเสนอหรือติดต่อกับหน่วยงานของรัฐตามประกาศคณะกรรมการพัสดุภาครัฐในระบบจัดซื้อจัดจ้างภาครัฐด้วยอิเล็กทรอนิกส์</w:t>
       </w:r>
     </w:p>
     <w:p>
@@ -300,7 +300,7 @@
           <w:sz w:val="32"/>
           <w:szCs w:val="32"/>
         </w:rPr>
-        <w:t>๔. ผู้ยื่นข้อเสนอจะต้องเป็นผู้มีอาชีพในการขายหรือรับจ้างงานพัฒนาระบบสารสนเทศและระบบงานของหน่วยงานภาครัฐโดยตรงเท่านั้น</w:t>
+        <w:t>ไม่เป็นบุคคลซึ่งถูกระบุชื่อไว้ในบัญชีรายชื่อผู้ทิ้งงานและได้แจ้งเวียนชื่อให้เป็นผู้ทิ้งงานของหน่วยงานของรัฐในประเทศไทย</w:t>
       </w:r>
     </w:p>
     <w:p>
@@ -314,7 +314,7 @@
           <w:sz w:val="32"/>
           <w:szCs w:val="32"/>
         </w:rPr>
-        <w:t>๕. ต้องไม่เป็นผู้มีผลประโยชน์ร่วมกันกับผู้ยื่นข้อเสนอรายอื่น และต้องไม่ได้รับเอกสิทธิ์หรือความคุ้มกันใด ๆ</w:t>
+        <w:t>ไม่เป็นผู้มีผลประโยชน์ร่วมกันกับผู้ยื่นข้อเสนอรายอื่นที่เข้ายื่นข้อเสนอให้แก่กรมบัญชีกลาง ณ วันประกาศเชิญชวน หรือไม่เป็นผู้กระทำการอันเป็นการขัดขวางการแข่งขันอย่างเป็นธรรม</w:t>
       </w:r>
     </w:p>
     <w:p>
@@ -328,7 +328,7 @@
           <w:sz w:val="32"/>
           <w:szCs w:val="32"/>
         </w:rPr>
-        <w:t>คุณสมบัติเฉพาะของผู้ยื่นข้อเสนอ</w:t>
+        <w:t>ไม่เป็นผู้ได้รับเอกสิทธิ์หรือความคุ้มกัน ซึ่งอาจปฏิเสธไม่ยอมขึ้นศาลไทย เว้นแต่รัฐบาลของผู้ยื่นข้อเสนอได้มีคำสั่งให้สละเอกสิทธิ์และความคุ้มกันเช่นว่านั้น</w:t>
       </w:r>
     </w:p>
     <w:p>
@@ -342,7 +342,7 @@
           <w:sz w:val="32"/>
           <w:szCs w:val="32"/>
         </w:rPr>
-        <w:t>๑. คุณสมบัติด้านนิติบุคคล:</w:t>
+        <w:t>ต้องเป็นนิติบุคคลจดทะเบียนในประเทศไทย มีอายุกิจการไม่น้อยกว่า 3 ปี และมีทุนจดทะเบียนชำระแล้วไม่น้อยกว่า 3,000,000 บาท</w:t>
       </w:r>
     </w:p>
     <w:p>
@@ -356,7 +356,7 @@
           <w:sz w:val="32"/>
           <w:szCs w:val="32"/>
         </w:rPr>
-        <w:t>ก. ผู้รับจ้างจะต้องเป็นนิติบุคคลที่จดทะเบียนในประเทศไทย มีอายุกิจการไม่น้อยกว่า ๓ ปี และมีทุนจดทะเบียนชำระแล้วไม่น้อยกว่า ๓,๐๐๐,๐๐๐ บาท (สามล้านบาทถ้วน)</w:t>
+        <w:t>ต้องลงทะเบียนในระบบจัดซื้อจัดจ้างภาครัฐด้วยอิเล็กทรอนิกส์ของกรมบัญชีกลาง</w:t>
       </w:r>
     </w:p>
     <w:p>
@@ -370,7 +370,7 @@
           <w:sz w:val="32"/>
           <w:szCs w:val="32"/>
         </w:rPr>
-        <w:t>๒. คุณสมบัติและผลงาน:</w:t>
+        <w:t>ต้องมีผลงานจ้างพัฒนาระบบสารสนเทศภาครัฐสัญญาเดียว มูลค่าไม่น้อยกว่า 2,000,000 บาท ในรอบ 5 ปี และเป็นคู่สัญญาโดยตรงกับหน่วยงานของรัฐ</w:t>
       </w:r>
     </w:p>
     <w:p>
@@ -384,7 +384,7 @@
           <w:sz w:val="32"/>
           <w:szCs w:val="32"/>
         </w:rPr>
-        <w:t>ก. ผู้รับจ้างจะต้องเคยมีผลงานในการจ้างพัฒนาระบบสารสนเทศภาครัฐสัญญาเดียว มูลค่าของโครงการไม่น้อยกว่า ๒,๐๐๐,๐๐๐ บาท (สองล้านบาทถ้วน) ในรอบระยะเวลา ๕ ปีที่ผ่านมา และต้องเป็นคู่สัญญาโดยตรงกับหน่วยงานของรัฐ</w:t>
+        <w:t>บุคลากรหลักประจำโครงการต้องประกอบด้วย ผู้จัดการโครงการจำนวน 1 คน นักวิเคราะห์ระบบจำนวน 1 คน นักพัฒนาจำนวน 2 คน และผู้ทดสอบจำนวน 1 คน โดยมีประสบการณ์ไม่น้อยกว่า 5 ปี</w:t>
       </w:r>
     </w:p>
     <w:p>
@@ -398,1155 +398,9 @@
           <w:sz w:val="32"/>
           <w:szCs w:val="32"/>
         </w:rPr>
-        <w:t>๓. คุณสมบัติบุคลากรหลัก:</w:t>
+        <w:t>ผู้ยื่นข้อเสนอต้องยื่นบัญชีเอกสารประกอบการยื่นข้อเสนอ ได้แก่ หนังสือรับรองนิติบุคคล งบการเงิน ผลงาน และประวัติบุคลากร พร้อมทั้งลงลายมือชื่อรับรองสำเนารับรองความถูกต้องทุกฉบับ</w:t>
       </w:r>
     </w:p>
-    <w:p>
-      <w:pPr>
-        <w:spacing w:line="240" w:lineRule="auto"/>
-        <w:ind w:firstLine="709"/>
-      </w:pPr>
-      <w:r>
-        <w:rPr>
-          <w:rFonts w:ascii="TH Sarabun New" w:hAnsi="TH Sarabun New" w:cs="TH Sarabun New" w:eastAsia="TH Sarabun New"/>
-          <w:sz w:val="32"/>
-          <w:szCs w:val="32"/>
-        </w:rPr>
-        <w:t>ผู้ยื่นข้อเสนอจะต้องมีบุคลากรประจำโครงการตามโครงสร้างและประสบการณ์ดังนี้ โดยบุคลากรดังกล่าวต้องปฏิบัติงานตลอดระยะเวลาการดำเนินงานทั้งสิ้น ๑๘๐ วัน นับถัดจากวันลงนามในสัญญา</w:t>
-      </w:r>
-    </w:p>
-    <w:tbl>
-      <w:tblPr>
-        <w:tblStyle w:val="TableGrid"/>
-        <w:tblW w:type="auto" w:w="0"/>
-        <w:tblLook w:firstColumn="1" w:firstRow="1" w:lastColumn="0" w:lastRow="0" w:noHBand="0" w:noVBand="1" w:val="04A0"/>
-      </w:tblPr>
-      <w:tblGrid>
-        <w:gridCol w:w="1948"/>
-        <w:gridCol w:w="1948"/>
-        <w:gridCol w:w="1948"/>
-        <w:gridCol w:w="1948"/>
-        <w:gridCol w:w="1948"/>
-      </w:tblGrid>
-      <w:tr>
-        <w:tc>
-          <w:tcPr>
-            <w:tcW w:type="dxa" w:w="1948"/>
-          </w:tcPr>
-          <w:p>
-            <w:pPr>
-              <w:spacing w:line="240" w:lineRule="auto"/>
-            </w:pPr>
-            <w:r/>
-            <w:r>
-              <w:rPr>
-                <w:rFonts w:ascii="TH Sarabun New" w:hAnsi="TH Sarabun New" w:cs="TH Sarabun New" w:eastAsia="TH Sarabun New"/>
-                <w:b/>
-                <w:sz w:val="32"/>
-                <w:szCs w:val="32"/>
-              </w:rPr>
-              <w:t>ตำแหน่ง</w:t>
-            </w:r>
-          </w:p>
-        </w:tc>
-        <w:tc>
-          <w:tcPr>
-            <w:tcW w:type="dxa" w:w="1948"/>
-          </w:tcPr>
-          <w:p>
-            <w:pPr>
-              <w:spacing w:line="240" w:lineRule="auto"/>
-            </w:pPr>
-            <w:r/>
-            <w:r>
-              <w:rPr>
-                <w:rFonts w:ascii="TH Sarabun New" w:hAnsi="TH Sarabun New" w:cs="TH Sarabun New" w:eastAsia="TH Sarabun New"/>
-                <w:b/>
-                <w:sz w:val="32"/>
-                <w:szCs w:val="32"/>
-              </w:rPr>
-              <w:t>คุณวุฒิ</w:t>
-            </w:r>
-          </w:p>
-        </w:tc>
-        <w:tc>
-          <w:tcPr>
-            <w:tcW w:type="dxa" w:w="1948"/>
-          </w:tcPr>
-          <w:p>
-            <w:pPr>
-              <w:spacing w:line="240" w:lineRule="auto"/>
-            </w:pPr>
-            <w:r/>
-            <w:r>
-              <w:rPr>
-                <w:rFonts w:ascii="TH Sarabun New" w:hAnsi="TH Sarabun New" w:cs="TH Sarabun New" w:eastAsia="TH Sarabun New"/>
-                <w:b/>
-                <w:sz w:val="32"/>
-                <w:szCs w:val="32"/>
-              </w:rPr>
-              <w:t>ประสบการณ์</w:t>
-            </w:r>
-          </w:p>
-        </w:tc>
-        <w:tc>
-          <w:tcPr>
-            <w:tcW w:type="dxa" w:w="1948"/>
-          </w:tcPr>
-          <w:p>
-            <w:pPr>
-              <w:spacing w:line="240" w:lineRule="auto"/>
-            </w:pPr>
-            <w:r/>
-            <w:r>
-              <w:rPr>
-                <w:rFonts w:ascii="TH Sarabun New" w:hAnsi="TH Sarabun New" w:cs="TH Sarabun New" w:eastAsia="TH Sarabun New"/>
-                <w:b/>
-                <w:sz w:val="32"/>
-                <w:szCs w:val="32"/>
-              </w:rPr>
-              <w:t>จำนวน</w:t>
-            </w:r>
-          </w:p>
-        </w:tc>
-        <w:tc>
-          <w:tcPr>
-            <w:tcW w:type="dxa" w:w="1948"/>
-          </w:tcPr>
-          <w:p>
-            <w:pPr>
-              <w:spacing w:line="240" w:lineRule="auto"/>
-            </w:pPr>
-            <w:r/>
-            <w:r>
-              <w:rPr>
-                <w:rFonts w:ascii="TH Sarabun New" w:hAnsi="TH Sarabun New" w:cs="TH Sarabun New" w:eastAsia="TH Sarabun New"/>
-                <w:b/>
-                <w:sz w:val="32"/>
-                <w:szCs w:val="32"/>
-              </w:rPr>
-              <w:t>ระยะเวลา (เดือน)</w:t>
-            </w:r>
-          </w:p>
-        </w:tc>
-      </w:tr>
-      <w:tr>
-        <w:tc>
-          <w:tcPr>
-            <w:tcW w:type="dxa" w:w="1948"/>
-          </w:tcPr>
-          <w:p>
-            <w:pPr>
-              <w:spacing w:line="240" w:lineRule="auto"/>
-            </w:pPr>
-            <w:r/>
-            <w:r>
-              <w:rPr>
-                <w:rFonts w:ascii="TH Sarabun New" w:hAnsi="TH Sarabun New" w:cs="TH Sarabun New" w:eastAsia="TH Sarabun New"/>
-                <w:b w:val="0"/>
-                <w:sz w:val="32"/>
-                <w:szCs w:val="32"/>
-              </w:rPr>
-              <w:t>ผู้จัดการโครงการ</w:t>
-            </w:r>
-          </w:p>
-        </w:tc>
-        <w:tc>
-          <w:tcPr>
-            <w:tcW w:type="dxa" w:w="1948"/>
-          </w:tcPr>
-          <w:p>
-            <w:pPr>
-              <w:spacing w:line="240" w:lineRule="auto"/>
-            </w:pPr>
-            <w:r/>
-            <w:r>
-              <w:rPr>
-                <w:rFonts w:ascii="TH Sarabun New" w:hAnsi="TH Sarabun New" w:cs="TH Sarabun New" w:eastAsia="TH Sarabun New"/>
-                <w:b w:val="0"/>
-                <w:sz w:val="32"/>
-                <w:szCs w:val="32"/>
-              </w:rPr>
-              <w:t>-</w:t>
-            </w:r>
-          </w:p>
-        </w:tc>
-        <w:tc>
-          <w:tcPr>
-            <w:tcW w:type="dxa" w:w="1948"/>
-          </w:tcPr>
-          <w:p>
-            <w:pPr>
-              <w:spacing w:line="240" w:lineRule="auto"/>
-            </w:pPr>
-            <w:r/>
-            <w:r>
-              <w:rPr>
-                <w:rFonts w:ascii="TH Sarabun New" w:hAnsi="TH Sarabun New" w:cs="TH Sarabun New" w:eastAsia="TH Sarabun New"/>
-                <w:b w:val="0"/>
-                <w:sz w:val="32"/>
-                <w:szCs w:val="32"/>
-              </w:rPr>
-              <w:t>ไม่น้อยกว่า ๕ ปี</w:t>
-            </w:r>
-          </w:p>
-        </w:tc>
-        <w:tc>
-          <w:tcPr>
-            <w:tcW w:type="dxa" w:w="1948"/>
-          </w:tcPr>
-          <w:p>
-            <w:pPr>
-              <w:spacing w:line="240" w:lineRule="auto"/>
-            </w:pPr>
-            <w:r/>
-            <w:r>
-              <w:rPr>
-                <w:rFonts w:ascii="TH Sarabun New" w:hAnsi="TH Sarabun New" w:cs="TH Sarabun New" w:eastAsia="TH Sarabun New"/>
-                <w:b w:val="0"/>
-                <w:sz w:val="32"/>
-                <w:szCs w:val="32"/>
-              </w:rPr>
-              <w:t>๑</w:t>
-            </w:r>
-          </w:p>
-        </w:tc>
-        <w:tc>
-          <w:tcPr>
-            <w:tcW w:type="dxa" w:w="1948"/>
-          </w:tcPr>
-          <w:p>
-            <w:pPr>
-              <w:spacing w:line="240" w:lineRule="auto"/>
-            </w:pPr>
-            <w:r/>
-            <w:r>
-              <w:rPr>
-                <w:rFonts w:ascii="TH Sarabun New" w:hAnsi="TH Sarabun New" w:cs="TH Sarabun New" w:eastAsia="TH Sarabun New"/>
-                <w:b w:val="0"/>
-                <w:sz w:val="32"/>
-                <w:szCs w:val="32"/>
-              </w:rPr>
-              <w:t>๑๘๐</w:t>
-            </w:r>
-          </w:p>
-        </w:tc>
-      </w:tr>
-      <w:tr>
-        <w:tc>
-          <w:tcPr>
-            <w:tcW w:type="dxa" w:w="1948"/>
-          </w:tcPr>
-          <w:p>
-            <w:pPr>
-              <w:spacing w:line="240" w:lineRule="auto"/>
-            </w:pPr>
-            <w:r/>
-            <w:r>
-              <w:rPr>
-                <w:rFonts w:ascii="TH Sarabun New" w:hAnsi="TH Sarabun New" w:cs="TH Sarabun New" w:eastAsia="TH Sarabun New"/>
-                <w:b w:val="0"/>
-                <w:sz w:val="32"/>
-                <w:szCs w:val="32"/>
-              </w:rPr>
-              <w:t>นักวิเคราะห์ระบบ</w:t>
-            </w:r>
-          </w:p>
-        </w:tc>
-        <w:tc>
-          <w:tcPr>
-            <w:tcW w:type="dxa" w:w="1948"/>
-          </w:tcPr>
-          <w:p>
-            <w:pPr>
-              <w:spacing w:line="240" w:lineRule="auto"/>
-            </w:pPr>
-            <w:r/>
-            <w:r>
-              <w:rPr>
-                <w:rFonts w:ascii="TH Sarabun New" w:hAnsi="TH Sarabun New" w:cs="TH Sarabun New" w:eastAsia="TH Sarabun New"/>
-                <w:b w:val="0"/>
-                <w:sz w:val="32"/>
-                <w:szCs w:val="32"/>
-              </w:rPr>
-              <w:t>-</w:t>
-            </w:r>
-          </w:p>
-        </w:tc>
-        <w:tc>
-          <w:tcPr>
-            <w:tcW w:type="dxa" w:w="1948"/>
-          </w:tcPr>
-          <w:p>
-            <w:pPr>
-              <w:spacing w:line="240" w:lineRule="auto"/>
-            </w:pPr>
-            <w:r/>
-            <w:r>
-              <w:rPr>
-                <w:rFonts w:ascii="TH Sarabun New" w:hAnsi="TH Sarabun New" w:cs="TH Sarabun New" w:eastAsia="TH Sarabun New"/>
-                <w:b w:val="0"/>
-                <w:sz w:val="32"/>
-                <w:szCs w:val="32"/>
-              </w:rPr>
-              <w:t>ไม่น้อยกว่า ๕ ปี</w:t>
-            </w:r>
-          </w:p>
-        </w:tc>
-        <w:tc>
-          <w:tcPr>
-            <w:tcW w:type="dxa" w:w="1948"/>
-          </w:tcPr>
-          <w:p>
-            <w:pPr>
-              <w:spacing w:line="240" w:lineRule="auto"/>
-            </w:pPr>
-            <w:r/>
-            <w:r>
-              <w:rPr>
-                <w:rFonts w:ascii="TH Sarabun New" w:hAnsi="TH Sarabun New" w:cs="TH Sarabun New" w:eastAsia="TH Sarabun New"/>
-                <w:b w:val="0"/>
-                <w:sz w:val="32"/>
-                <w:szCs w:val="32"/>
-              </w:rPr>
-              <w:t>๑</w:t>
-            </w:r>
-          </w:p>
-        </w:tc>
-        <w:tc>
-          <w:tcPr>
-            <w:tcW w:type="dxa" w:w="1948"/>
-          </w:tcPr>
-          <w:p>
-            <w:pPr>
-              <w:spacing w:line="240" w:lineRule="auto"/>
-            </w:pPr>
-            <w:r/>
-            <w:r>
-              <w:rPr>
-                <w:rFonts w:ascii="TH Sarabun New" w:hAnsi="TH Sarabun New" w:cs="TH Sarabun New" w:eastAsia="TH Sarabun New"/>
-                <w:b w:val="0"/>
-                <w:sz w:val="32"/>
-                <w:szCs w:val="32"/>
-              </w:rPr>
-              <w:t>๑๘๐</w:t>
-            </w:r>
-          </w:p>
-        </w:tc>
-      </w:tr>
-      <w:tr>
-        <w:tc>
-          <w:tcPr>
-            <w:tcW w:type="dxa" w:w="1948"/>
-          </w:tcPr>
-          <w:p>
-            <w:pPr>
-              <w:spacing w:line="240" w:lineRule="auto"/>
-            </w:pPr>
-            <w:r/>
-            <w:r>
-              <w:rPr>
-                <w:rFonts w:ascii="TH Sarabun New" w:hAnsi="TH Sarabun New" w:cs="TH Sarabun New" w:eastAsia="TH Sarabun New"/>
-                <w:b w:val="0"/>
-                <w:sz w:val="32"/>
-                <w:szCs w:val="32"/>
-              </w:rPr>
-              <w:t>นักพัฒนา</w:t>
-            </w:r>
-          </w:p>
-        </w:tc>
-        <w:tc>
-          <w:tcPr>
-            <w:tcW w:type="dxa" w:w="1948"/>
-          </w:tcPr>
-          <w:p>
-            <w:pPr>
-              <w:spacing w:line="240" w:lineRule="auto"/>
-            </w:pPr>
-            <w:r/>
-            <w:r>
-              <w:rPr>
-                <w:rFonts w:ascii="TH Sarabun New" w:hAnsi="TH Sarabun New" w:cs="TH Sarabun New" w:eastAsia="TH Sarabun New"/>
-                <w:b w:val="0"/>
-                <w:sz w:val="32"/>
-                <w:szCs w:val="32"/>
-              </w:rPr>
-              <w:t>-</w:t>
-            </w:r>
-          </w:p>
-        </w:tc>
-        <w:tc>
-          <w:tcPr>
-            <w:tcW w:type="dxa" w:w="1948"/>
-          </w:tcPr>
-          <w:p>
-            <w:pPr>
-              <w:spacing w:line="240" w:lineRule="auto"/>
-            </w:pPr>
-            <w:r/>
-            <w:r>
-              <w:rPr>
-                <w:rFonts w:ascii="TH Sarabun New" w:hAnsi="TH Sarabun New" w:cs="TH Sarabun New" w:eastAsia="TH Sarabun New"/>
-                <w:b w:val="0"/>
-                <w:sz w:val="32"/>
-                <w:szCs w:val="32"/>
-              </w:rPr>
-              <w:t>ไม่น้อยกว่า ๕ ปี</w:t>
-            </w:r>
-          </w:p>
-        </w:tc>
-        <w:tc>
-          <w:tcPr>
-            <w:tcW w:type="dxa" w:w="1948"/>
-          </w:tcPr>
-          <w:p>
-            <w:pPr>
-              <w:spacing w:line="240" w:lineRule="auto"/>
-            </w:pPr>
-            <w:r/>
-            <w:r>
-              <w:rPr>
-                <w:rFonts w:ascii="TH Sarabun New" w:hAnsi="TH Sarabun New" w:cs="TH Sarabun New" w:eastAsia="TH Sarabun New"/>
-                <w:b w:val="0"/>
-                <w:sz w:val="32"/>
-                <w:szCs w:val="32"/>
-              </w:rPr>
-              <w:t>๒</w:t>
-            </w:r>
-          </w:p>
-        </w:tc>
-        <w:tc>
-          <w:tcPr>
-            <w:tcW w:type="dxa" w:w="1948"/>
-          </w:tcPr>
-          <w:p>
-            <w:pPr>
-              <w:spacing w:line="240" w:lineRule="auto"/>
-            </w:pPr>
-            <w:r/>
-            <w:r>
-              <w:rPr>
-                <w:rFonts w:ascii="TH Sarabun New" w:hAnsi="TH Sarabun New" w:cs="TH Sarabun New" w:eastAsia="TH Sarabun New"/>
-                <w:b w:val="0"/>
-                <w:sz w:val="32"/>
-                <w:szCs w:val="32"/>
-              </w:rPr>
-              <w:t>๑๘๐</w:t>
-            </w:r>
-          </w:p>
-        </w:tc>
-      </w:tr>
-      <w:tr>
-        <w:tc>
-          <w:tcPr>
-            <w:tcW w:type="dxa" w:w="1948"/>
-          </w:tcPr>
-          <w:p>
-            <w:pPr>
-              <w:spacing w:line="240" w:lineRule="auto"/>
-            </w:pPr>
-            <w:r/>
-            <w:r>
-              <w:rPr>
-                <w:rFonts w:ascii="TH Sarabun New" w:hAnsi="TH Sarabun New" w:cs="TH Sarabun New" w:eastAsia="TH Sarabun New"/>
-                <w:b w:val="0"/>
-                <w:sz w:val="32"/>
-                <w:szCs w:val="32"/>
-              </w:rPr>
-              <w:t>ผู้ทดสอบ</w:t>
-            </w:r>
-          </w:p>
-        </w:tc>
-        <w:tc>
-          <w:tcPr>
-            <w:tcW w:type="dxa" w:w="1948"/>
-          </w:tcPr>
-          <w:p>
-            <w:pPr>
-              <w:spacing w:line="240" w:lineRule="auto"/>
-            </w:pPr>
-            <w:r/>
-            <w:r>
-              <w:rPr>
-                <w:rFonts w:ascii="TH Sarabun New" w:hAnsi="TH Sarabun New" w:cs="TH Sarabun New" w:eastAsia="TH Sarabun New"/>
-                <w:b w:val="0"/>
-                <w:sz w:val="32"/>
-                <w:szCs w:val="32"/>
-              </w:rPr>
-              <w:t>-</w:t>
-            </w:r>
-          </w:p>
-        </w:tc>
-        <w:tc>
-          <w:tcPr>
-            <w:tcW w:type="dxa" w:w="1948"/>
-          </w:tcPr>
-          <w:p>
-            <w:pPr>
-              <w:spacing w:line="240" w:lineRule="auto"/>
-            </w:pPr>
-            <w:r/>
-            <w:r>
-              <w:rPr>
-                <w:rFonts w:ascii="TH Sarabun New" w:hAnsi="TH Sarabun New" w:cs="TH Sarabun New" w:eastAsia="TH Sarabun New"/>
-                <w:b w:val="0"/>
-                <w:sz w:val="32"/>
-                <w:szCs w:val="32"/>
-              </w:rPr>
-              <w:t>ไม่น้อยกว่า ๕ ปี</w:t>
-            </w:r>
-          </w:p>
-        </w:tc>
-        <w:tc>
-          <w:tcPr>
-            <w:tcW w:type="dxa" w:w="1948"/>
-          </w:tcPr>
-          <w:p>
-            <w:pPr>
-              <w:spacing w:line="240" w:lineRule="auto"/>
-            </w:pPr>
-            <w:r/>
-            <w:r>
-              <w:rPr>
-                <w:rFonts w:ascii="TH Sarabun New" w:hAnsi="TH Sarabun New" w:cs="TH Sarabun New" w:eastAsia="TH Sarabun New"/>
-                <w:b w:val="0"/>
-                <w:sz w:val="32"/>
-                <w:szCs w:val="32"/>
-              </w:rPr>
-              <w:t>๑</w:t>
-            </w:r>
-          </w:p>
-        </w:tc>
-        <w:tc>
-          <w:tcPr>
-            <w:tcW w:type="dxa" w:w="1948"/>
-          </w:tcPr>
-          <w:p>
-            <w:pPr>
-              <w:spacing w:line="240" w:lineRule="auto"/>
-            </w:pPr>
-            <w:r/>
-            <w:r>
-              <w:rPr>
-                <w:rFonts w:ascii="TH Sarabun New" w:hAnsi="TH Sarabun New" w:cs="TH Sarabun New" w:eastAsia="TH Sarabun New"/>
-                <w:b w:val="0"/>
-                <w:sz w:val="32"/>
-                <w:szCs w:val="32"/>
-              </w:rPr>
-              <w:t>๑๘๐</w:t>
-            </w:r>
-          </w:p>
-        </w:tc>
-      </w:tr>
-    </w:tbl>
-    <w:p>
-      <w:pPr>
-        <w:spacing w:line="240" w:lineRule="auto"/>
-        <w:ind w:firstLine="709"/>
-      </w:pPr>
-      <w:r>
-        <w:rPr>
-          <w:rFonts w:ascii="TH Sarabun New" w:hAnsi="TH Sarabun New" w:cs="TH Sarabun New" w:eastAsia="TH Sarabun New"/>
-          <w:sz w:val="32"/>
-          <w:szCs w:val="32"/>
-        </w:rPr>
-        <w:t>การเข้าร่วมค้าและเอกสารแสดงความสามารถทางการเงิน</w:t>
-      </w:r>
-    </w:p>
-    <w:p>
-      <w:pPr>
-        <w:spacing w:line="240" w:lineRule="auto"/>
-        <w:ind w:firstLine="709"/>
-      </w:pPr>
-      <w:r>
-        <w:rPr>
-          <w:rFonts w:ascii="TH Sarabun New" w:hAnsi="TH Sarabun New" w:cs="TH Sarabun New" w:eastAsia="TH Sarabun New"/>
-          <w:sz w:val="32"/>
-          <w:szCs w:val="32"/>
-        </w:rPr>
-        <w:t>ผู้ยื่นข้อเสนอจะต้องดำเนินการลงทะเบียนในระบบจัดซื้อจัดจ้างภาครัฐด้วยอิเล็กทรอนิกส์ และต้องนำส่งเอกสารหลักฐานดังนี้</w:t>
-      </w:r>
-    </w:p>
-    <w:p>
-      <w:pPr>
-        <w:spacing w:line="240" w:lineRule="auto"/>
-        <w:ind w:firstLine="709"/>
-      </w:pPr>
-      <w:r>
-        <w:rPr>
-          <w:rFonts w:ascii="TH Sarabun New" w:hAnsi="TH Sarabun New" w:cs="TH Sarabun New" w:eastAsia="TH Sarabun New"/>
-          <w:sz w:val="32"/>
-          <w:szCs w:val="32"/>
-        </w:rPr>
-        <w:t>๑. กรณีเป็นนิติบุคคลเพียงรายเดียว: ต้องนำส่งหนังสือรับรองการจดทะเบียนบริษัท หนังสือรับรองงบการเงินย้อนหลังไม่น้อยกว่า ๓ ปี และบัญชีแสดงฐานะทางการเงินขององค์กร (เช่น งบแสดงฐานะการเงิน) เพื่อประกอบการพิจารณา</w:t>
-      </w:r>
-    </w:p>
-    <w:p>
-      <w:pPr>
-        <w:spacing w:line="240" w:lineRule="auto"/>
-        <w:ind w:firstLine="709"/>
-      </w:pPr>
-      <w:r>
-        <w:rPr>
-          <w:rFonts w:ascii="TH Sarabun New" w:hAnsi="TH Sarabun New" w:cs="TH Sarabun New" w:eastAsia="TH Sarabun New"/>
-          <w:sz w:val="32"/>
-          <w:szCs w:val="32"/>
-        </w:rPr>
-        <w:t>๒. กรณีเป็นกิจการร่วมค้า: ให้ผู้เข้าร่วมค้ารายหลักนำส่งหนังสือรับรองการจัดตั้งกิจการร่วมค้า พร้อมทั้งระบุสัดส่วนการเข้าร่วมค้า มูลค่าสุทธิของกิจการ และเอกสารที่เกี่ยวข้องของผู้ร่วมค้าทุกราย</w:t>
-      </w:r>
-    </w:p>
-    <w:p>
-      <w:pPr>
-        <w:spacing w:line="240" w:lineRule="auto"/>
-        <w:ind w:firstLine="709"/>
-      </w:pPr>
-      <w:r>
-        <w:rPr>
-          <w:rFonts w:ascii="TH Sarabun New" w:hAnsi="TH Sarabun New" w:cs="TH Sarabun New" w:eastAsia="TH Sarabun New"/>
-          <w:sz w:val="32"/>
-          <w:szCs w:val="32"/>
-        </w:rPr>
-        <w:t>บัญชีเอกสารที่ต้องยื่นข้อเสนอ</w:t>
-      </w:r>
-    </w:p>
-    <w:p>
-      <w:pPr>
-        <w:spacing w:line="240" w:lineRule="auto"/>
-        <w:ind w:firstLine="709"/>
-      </w:pPr>
-      <w:r>
-        <w:rPr>
-          <w:rFonts w:ascii="TH Sarabun New" w:hAnsi="TH Sarabun New" w:cs="TH Sarabun New" w:eastAsia="TH Sarabun New"/>
-          <w:sz w:val="32"/>
-          <w:szCs w:val="32"/>
-        </w:rPr>
-        <w:t>ผู้ยื่นข้อเสนอจะต้องจัดเตรียมและยื่นเอกสารประกอบการพิจารณาตามรายการต่อไปนี้ โดยให้เป็นต้นฉบับหรือสำเนาที่รับรองถูกต้องตามกฎหมาย จำนวนชุด และมีอายุของเอกสารไม่เกิน ๖ เดือน นับถึงวันยื่นข้อเสนอ</w:t>
-      </w:r>
-    </w:p>
-    <w:tbl>
-      <w:tblPr>
-        <w:tblStyle w:val="TableGrid"/>
-        <w:tblW w:type="auto" w:w="0"/>
-        <w:tblLook w:firstColumn="1" w:firstRow="1" w:lastColumn="0" w:lastRow="0" w:noHBand="0" w:noVBand="1" w:val="04A0"/>
-      </w:tblPr>
-      <w:tblGrid>
-        <w:gridCol w:w="1948"/>
-        <w:gridCol w:w="1948"/>
-        <w:gridCol w:w="1948"/>
-        <w:gridCol w:w="1948"/>
-        <w:gridCol w:w="1948"/>
-      </w:tblGrid>
-      <w:tr>
-        <w:tc>
-          <w:tcPr>
-            <w:tcW w:type="dxa" w:w="1948"/>
-          </w:tcPr>
-          <w:p>
-            <w:pPr>
-              <w:spacing w:line="240" w:lineRule="auto"/>
-            </w:pPr>
-            <w:r/>
-            <w:r>
-              <w:rPr>
-                <w:rFonts w:ascii="TH Sarabun New" w:hAnsi="TH Sarabun New" w:cs="TH Sarabun New" w:eastAsia="TH Sarabun New"/>
-                <w:b/>
-                <w:sz w:val="32"/>
-                <w:szCs w:val="32"/>
-              </w:rPr>
-              <w:t>เอกสาร</w:t>
-            </w:r>
-          </w:p>
-        </w:tc>
-        <w:tc>
-          <w:tcPr>
-            <w:tcW w:type="dxa" w:w="1948"/>
-          </w:tcPr>
-          <w:p>
-            <w:pPr>
-              <w:spacing w:line="240" w:lineRule="auto"/>
-            </w:pPr>
-            <w:r/>
-            <w:r>
-              <w:rPr>
-                <w:rFonts w:ascii="TH Sarabun New" w:hAnsi="TH Sarabun New" w:cs="TH Sarabun New" w:eastAsia="TH Sarabun New"/>
-                <w:b/>
-                <w:sz w:val="32"/>
-                <w:szCs w:val="32"/>
-              </w:rPr>
-              <w:t>รูปแบบ (ต้นฉบับ/สำเนา)</w:t>
-            </w:r>
-          </w:p>
-        </w:tc>
-        <w:tc>
-          <w:tcPr>
-            <w:tcW w:type="dxa" w:w="1948"/>
-          </w:tcPr>
-          <w:p>
-            <w:pPr>
-              <w:spacing w:line="240" w:lineRule="auto"/>
-            </w:pPr>
-            <w:r/>
-            <w:r>
-              <w:rPr>
-                <w:rFonts w:ascii="TH Sarabun New" w:hAnsi="TH Sarabun New" w:cs="TH Sarabun New" w:eastAsia="TH Sarabun New"/>
-                <w:b/>
-                <w:sz w:val="32"/>
-                <w:szCs w:val="32"/>
-              </w:rPr>
-              <w:t>จำนวนชุด</w:t>
-            </w:r>
-          </w:p>
-        </w:tc>
-        <w:tc>
-          <w:tcPr>
-            <w:tcW w:type="dxa" w:w="1948"/>
-          </w:tcPr>
-          <w:p>
-            <w:pPr>
-              <w:spacing w:line="240" w:lineRule="auto"/>
-            </w:pPr>
-            <w:r/>
-            <w:r>
-              <w:rPr>
-                <w:rFonts w:ascii="TH Sarabun New" w:hAnsi="TH Sarabun New" w:cs="TH Sarabun New" w:eastAsia="TH Sarabun New"/>
-                <w:b/>
-                <w:sz w:val="32"/>
-                <w:szCs w:val="32"/>
-              </w:rPr>
-              <w:t>อายุเอกสาร</w:t>
-            </w:r>
-          </w:p>
-        </w:tc>
-        <w:tc>
-          <w:tcPr>
-            <w:tcW w:type="dxa" w:w="1948"/>
-          </w:tcPr>
-          <w:p>
-            <w:pPr>
-              <w:spacing w:line="240" w:lineRule="auto"/>
-            </w:pPr>
-            <w:r/>
-            <w:r>
-              <w:rPr>
-                <w:rFonts w:ascii="TH Sarabun New" w:hAnsi="TH Sarabun New" w:cs="TH Sarabun New" w:eastAsia="TH Sarabun New"/>
-                <w:b/>
-                <w:sz w:val="32"/>
-                <w:szCs w:val="32"/>
-              </w:rPr>
-              <w:t>ผลของการยื่นไม่ครบถ้วน</w:t>
-            </w:r>
-          </w:p>
-        </w:tc>
-      </w:tr>
-      <w:tr>
-        <w:tc>
-          <w:tcPr>
-            <w:tcW w:type="dxa" w:w="1948"/>
-          </w:tcPr>
-          <w:p>
-            <w:pPr>
-              <w:spacing w:line="240" w:lineRule="auto"/>
-            </w:pPr>
-            <w:r/>
-            <w:r>
-              <w:rPr>
-                <w:rFonts w:ascii="TH Sarabun New" w:hAnsi="TH Sarabun New" w:cs="TH Sarabun New" w:eastAsia="TH Sarabun New"/>
-                <w:b w:val="0"/>
-                <w:sz w:val="32"/>
-                <w:szCs w:val="32"/>
-              </w:rPr>
-              <w:t>หนังสือรับรองนิติบุคคล</w:t>
-            </w:r>
-          </w:p>
-        </w:tc>
-        <w:tc>
-          <w:tcPr>
-            <w:tcW w:type="dxa" w:w="1948"/>
-          </w:tcPr>
-          <w:p>
-            <w:pPr>
-              <w:spacing w:line="240" w:lineRule="auto"/>
-            </w:pPr>
-            <w:r/>
-            <w:r>
-              <w:rPr>
-                <w:rFonts w:ascii="TH Sarabun New" w:hAnsi="TH Sarabun New" w:cs="TH Sarabun New" w:eastAsia="TH Sarabun New"/>
-                <w:b w:val="0"/>
-                <w:sz w:val="32"/>
-                <w:szCs w:val="32"/>
-              </w:rPr>
-              <w:t>สำเนา</w:t>
-            </w:r>
-          </w:p>
-        </w:tc>
-        <w:tc>
-          <w:tcPr>
-            <w:tcW w:type="dxa" w:w="1948"/>
-          </w:tcPr>
-          <w:p>
-            <w:pPr>
-              <w:spacing w:line="240" w:lineRule="auto"/>
-            </w:pPr>
-            <w:r/>
-            <w:r>
-              <w:rPr>
-                <w:rFonts w:ascii="TH Sarabun New" w:hAnsi="TH Sarabun New" w:cs="TH Sarabun New" w:eastAsia="TH Sarabun New"/>
-                <w:b w:val="0"/>
-                <w:sz w:val="32"/>
-                <w:szCs w:val="32"/>
-              </w:rPr>
-              <w:t>๑ ชุด</w:t>
-            </w:r>
-          </w:p>
-        </w:tc>
-        <w:tc>
-          <w:tcPr>
-            <w:tcW w:type="dxa" w:w="1948"/>
-          </w:tcPr>
-          <w:p>
-            <w:pPr>
-              <w:spacing w:line="240" w:lineRule="auto"/>
-            </w:pPr>
-            <w:r/>
-            <w:r>
-              <w:rPr>
-                <w:rFonts w:ascii="TH Sarabun New" w:hAnsi="TH Sarabun New" w:cs="TH Sarabun New" w:eastAsia="TH Sarabun New"/>
-                <w:b w:val="0"/>
-                <w:sz w:val="32"/>
-                <w:szCs w:val="32"/>
-              </w:rPr>
-              <w:t>ไม่เกิน ๖ เดือน</w:t>
-            </w:r>
-          </w:p>
-        </w:tc>
-        <w:tc>
-          <w:tcPr>
-            <w:tcW w:type="dxa" w:w="1948"/>
-          </w:tcPr>
-          <w:p>
-            <w:pPr>
-              <w:spacing w:line="240" w:lineRule="auto"/>
-            </w:pPr>
-            <w:r/>
-            <w:r>
-              <w:rPr>
-                <w:rFonts w:ascii="TH Sarabun New" w:hAnsi="TH Sarabun New" w:cs="TH Sarabun New" w:eastAsia="TH Sarabun New"/>
-                <w:b w:val="0"/>
-                <w:sz w:val="32"/>
-                <w:szCs w:val="32"/>
-              </w:rPr>
-              <w:t>ให้ถือว่าคุณสมบัติไม่ผ่านเกณฑ์</w:t>
-            </w:r>
-          </w:p>
-        </w:tc>
-      </w:tr>
-      <w:tr>
-        <w:tc>
-          <w:tcPr>
-            <w:tcW w:type="dxa" w:w="1948"/>
-          </w:tcPr>
-          <w:p>
-            <w:pPr>
-              <w:spacing w:line="240" w:lineRule="auto"/>
-            </w:pPr>
-            <w:r/>
-            <w:r>
-              <w:rPr>
-                <w:rFonts w:ascii="TH Sarabun New" w:hAnsi="TH Sarabun New" w:cs="TH Sarabun New" w:eastAsia="TH Sarabun New"/>
-                <w:b w:val="0"/>
-                <w:sz w:val="32"/>
-                <w:szCs w:val="32"/>
-              </w:rPr>
-              <w:t>งบการเงินของบริษัท</w:t>
-            </w:r>
-          </w:p>
-        </w:tc>
-        <w:tc>
-          <w:tcPr>
-            <w:tcW w:type="dxa" w:w="1948"/>
-          </w:tcPr>
-          <w:p>
-            <w:pPr>
-              <w:spacing w:line="240" w:lineRule="auto"/>
-            </w:pPr>
-            <w:r/>
-            <w:r>
-              <w:rPr>
-                <w:rFonts w:ascii="TH Sarabun New" w:hAnsi="TH Sarabun New" w:cs="TH Sarabun New" w:eastAsia="TH Sarabun New"/>
-                <w:b w:val="0"/>
-                <w:sz w:val="32"/>
-                <w:szCs w:val="32"/>
-              </w:rPr>
-              <w:t>สำเนา</w:t>
-            </w:r>
-          </w:p>
-        </w:tc>
-        <w:tc>
-          <w:tcPr>
-            <w:tcW w:type="dxa" w:w="1948"/>
-          </w:tcPr>
-          <w:p>
-            <w:pPr>
-              <w:spacing w:line="240" w:lineRule="auto"/>
-            </w:pPr>
-            <w:r/>
-            <w:r>
-              <w:rPr>
-                <w:rFonts w:ascii="TH Sarabun New" w:hAnsi="TH Sarabun New" w:cs="TH Sarabun New" w:eastAsia="TH Sarabun New"/>
-                <w:b w:val="0"/>
-                <w:sz w:val="32"/>
-                <w:szCs w:val="32"/>
-              </w:rPr>
-              <w:t>๓ ปีล่าสุด</w:t>
-            </w:r>
-          </w:p>
-        </w:tc>
-        <w:tc>
-          <w:tcPr>
-            <w:tcW w:type="dxa" w:w="1948"/>
-          </w:tcPr>
-          <w:p>
-            <w:pPr>
-              <w:spacing w:line="240" w:lineRule="auto"/>
-            </w:pPr>
-            <w:r/>
-            <w:r>
-              <w:rPr>
-                <w:rFonts w:ascii="TH Sarabun New" w:hAnsi="TH Sarabun New" w:cs="TH Sarabun New" w:eastAsia="TH Sarabun New"/>
-                <w:b w:val="0"/>
-                <w:sz w:val="32"/>
-                <w:szCs w:val="32"/>
-              </w:rPr>
-              <w:t>ไม่เกิน ๖ เดือน</w:t>
-            </w:r>
-          </w:p>
-        </w:tc>
-        <w:tc>
-          <w:tcPr>
-            <w:tcW w:type="dxa" w:w="1948"/>
-          </w:tcPr>
-          <w:p>
-            <w:pPr>
-              <w:spacing w:line="240" w:lineRule="auto"/>
-            </w:pPr>
-            <w:r/>
-            <w:r>
-              <w:rPr>
-                <w:rFonts w:ascii="TH Sarabun New" w:hAnsi="TH Sarabun New" w:cs="TH Sarabun New" w:eastAsia="TH Sarabun New"/>
-                <w:b w:val="0"/>
-                <w:sz w:val="32"/>
-                <w:szCs w:val="32"/>
-              </w:rPr>
-              <w:t>ให้ถือว่าคุณสมบัติไม่ผ่านเกณฑ์</w:t>
-            </w:r>
-          </w:p>
-        </w:tc>
-      </w:tr>
-      <w:tr>
-        <w:tc>
-          <w:tcPr>
-            <w:tcW w:type="dxa" w:w="1948"/>
-          </w:tcPr>
-          <w:p>
-            <w:pPr>
-              <w:spacing w:line="240" w:lineRule="auto"/>
-            </w:pPr>
-            <w:r/>
-            <w:r>
-              <w:rPr>
-                <w:rFonts w:ascii="TH Sarabun New" w:hAnsi="TH Sarabun New" w:cs="TH Sarabun New" w:eastAsia="TH Sarabun New"/>
-                <w:b w:val="0"/>
-                <w:sz w:val="32"/>
-                <w:szCs w:val="32"/>
-              </w:rPr>
-              <w:t>รายชื่อและประวัติบุคลากรหลัก</w:t>
-            </w:r>
-          </w:p>
-        </w:tc>
-        <w:tc>
-          <w:tcPr>
-            <w:tcW w:type="dxa" w:w="1948"/>
-          </w:tcPr>
-          <w:p>
-            <w:pPr>
-              <w:spacing w:line="240" w:lineRule="auto"/>
-            </w:pPr>
-            <w:r/>
-            <w:r>
-              <w:rPr>
-                <w:rFonts w:ascii="TH Sarabun New" w:hAnsi="TH Sarabun New" w:cs="TH Sarabun New" w:eastAsia="TH Sarabun New"/>
-                <w:b w:val="0"/>
-                <w:sz w:val="32"/>
-                <w:szCs w:val="32"/>
-              </w:rPr>
-              <w:t>ต้นฉบับ/สำเนา</w:t>
-            </w:r>
-          </w:p>
-        </w:tc>
-        <w:tc>
-          <w:tcPr>
-            <w:tcW w:type="dxa" w:w="1948"/>
-          </w:tcPr>
-          <w:p>
-            <w:pPr>
-              <w:spacing w:line="240" w:lineRule="auto"/>
-            </w:pPr>
-            <w:r/>
-            <w:r>
-              <w:rPr>
-                <w:rFonts w:ascii="TH Sarabun New" w:hAnsi="TH Sarabun New" w:cs="TH Sarabun New" w:eastAsia="TH Sarabun New"/>
-                <w:b w:val="0"/>
-                <w:sz w:val="32"/>
-                <w:szCs w:val="32"/>
-              </w:rPr>
-              <w:t>ตามจำนวนที่กำหนด</w:t>
-            </w:r>
-          </w:p>
-        </w:tc>
-        <w:tc>
-          <w:tcPr>
-            <w:tcW w:type="dxa" w:w="1948"/>
-          </w:tcPr>
-          <w:p>
-            <w:pPr>
-              <w:spacing w:line="240" w:lineRule="auto"/>
-            </w:pPr>
-            <w:r/>
-            <w:r>
-              <w:rPr>
-                <w:rFonts w:ascii="TH Sarabun New" w:hAnsi="TH Sarabun New" w:cs="TH Sarabun New" w:eastAsia="TH Sarabun New"/>
-                <w:b w:val="0"/>
-                <w:sz w:val="32"/>
-                <w:szCs w:val="32"/>
-              </w:rPr>
-              <w:t>ไม่มีกำหนด</w:t>
-            </w:r>
-          </w:p>
-        </w:tc>
-        <w:tc>
-          <w:tcPr>
-            <w:tcW w:type="dxa" w:w="1948"/>
-          </w:tcPr>
-          <w:p>
-            <w:pPr>
-              <w:spacing w:line="240" w:lineRule="auto"/>
-            </w:pPr>
-            <w:r/>
-            <w:r>
-              <w:rPr>
-                <w:rFonts w:ascii="TH Sarabun New" w:hAnsi="TH Sarabun New" w:cs="TH Sarabun New" w:eastAsia="TH Sarabun New"/>
-                <w:b w:val="0"/>
-                <w:sz w:val="32"/>
-                <w:szCs w:val="32"/>
-              </w:rPr>
-              <w:t>อาจส่งผลต่อคะแนนด้านเทคนิค</w:t>
-            </w:r>
-          </w:p>
-        </w:tc>
-      </w:tr>
-      <w:tr>
-        <w:tc>
-          <w:tcPr>
-            <w:tcW w:type="dxa" w:w="1948"/>
-          </w:tcPr>
-          <w:p>
-            <w:pPr>
-              <w:spacing w:line="240" w:lineRule="auto"/>
-            </w:pPr>
-            <w:r/>
-            <w:r>
-              <w:rPr>
-                <w:rFonts w:ascii="TH Sarabun New" w:hAnsi="TH Sarabun New" w:cs="TH Sarabun New" w:eastAsia="TH Sarabun New"/>
-                <w:b w:val="0"/>
-                <w:sz w:val="32"/>
-                <w:szCs w:val="32"/>
-              </w:rPr>
-              <w:t>หนังสือแสดงผลงานจ้างพัฒนาระบบฯ</w:t>
-            </w:r>
-          </w:p>
-        </w:tc>
-        <w:tc>
-          <w:tcPr>
-            <w:tcW w:type="dxa" w:w="1948"/>
-          </w:tcPr>
-          <w:p>
-            <w:pPr>
-              <w:spacing w:line="240" w:lineRule="auto"/>
-            </w:pPr>
-            <w:r/>
-            <w:r>
-              <w:rPr>
-                <w:rFonts w:ascii="TH Sarabun New" w:hAnsi="TH Sarabun New" w:cs="TH Sarabun New" w:eastAsia="TH Sarabun New"/>
-                <w:b w:val="0"/>
-                <w:sz w:val="32"/>
-                <w:szCs w:val="32"/>
-              </w:rPr>
-              <w:t>สำเนา</w:t>
-            </w:r>
-          </w:p>
-        </w:tc>
-        <w:tc>
-          <w:tcPr>
-            <w:tcW w:type="dxa" w:w="1948"/>
-          </w:tcPr>
-          <w:p>
-            <w:pPr>
-              <w:spacing w:line="240" w:lineRule="auto"/>
-            </w:pPr>
-            <w:r/>
-            <w:r>
-              <w:rPr>
-                <w:rFonts w:ascii="TH Sarabun New" w:hAnsi="TH Sarabun New" w:cs="TH Sarabun New" w:eastAsia="TH Sarabun New"/>
-                <w:b w:val="0"/>
-                <w:sz w:val="32"/>
-                <w:szCs w:val="32"/>
-              </w:rPr>
-              <w:t>๓ ชุด</w:t>
-            </w:r>
-          </w:p>
-        </w:tc>
-        <w:tc>
-          <w:tcPr>
-            <w:tcW w:type="dxa" w:w="1948"/>
-          </w:tcPr>
-          <w:p>
-            <w:pPr>
-              <w:spacing w:line="240" w:lineRule="auto"/>
-            </w:pPr>
-            <w:r/>
-            <w:r>
-              <w:rPr>
-                <w:rFonts w:ascii="TH Sarabun New" w:hAnsi="TH Sarabun New" w:cs="TH Sarabun New" w:eastAsia="TH Sarabun New"/>
-                <w:b w:val="0"/>
-                <w:sz w:val="32"/>
-                <w:szCs w:val="32"/>
-              </w:rPr>
-              <w:t>ไม่เกิน ๕ ปี</w:t>
-            </w:r>
-          </w:p>
-        </w:tc>
-        <w:tc>
-          <w:tcPr>
-            <w:tcW w:type="dxa" w:w="1948"/>
-          </w:tcPr>
-          <w:p>
-            <w:pPr>
-              <w:spacing w:line="240" w:lineRule="auto"/>
-            </w:pPr>
-            <w:r/>
-            <w:r>
-              <w:rPr>
-                <w:rFonts w:ascii="TH Sarabun New" w:hAnsi="TH Sarabun New" w:cs="TH Sarabun New" w:eastAsia="TH Sarabun New"/>
-                <w:b w:val="0"/>
-                <w:sz w:val="32"/>
-                <w:szCs w:val="32"/>
-              </w:rPr>
-              <w:t>ให้ถือว่าคุณสมบัติไม่ผ่านเกณฑ์</w:t>
-            </w:r>
-          </w:p>
-        </w:tc>
-      </w:tr>
-    </w:tbl>
     <w:p>
       <w:pPr>
         <w:spacing w:line="240" w:lineRule="auto"/>
@@ -1572,7 +426,7 @@
           <w:sz w:val="32"/>
           <w:szCs w:val="32"/>
         </w:rPr>
-        <w:t>การฝึกอบรมและการถ่ายทอดความรู้</w:t>
+        <w:t>ผู้รับจ้างต้องจัดให้มีการฝึกอบรมและการถ่ายทอดความรู้แก่บุคลากรของผู้ว่าจ้าง เพื่อให้สามารถใช้งาน บริหารจัดการ และดูแลรักษาระบบงานได้อย่างมีประสิทธิภาพ โดยมีรายละเอียดหลักสูตร จำนวนผู้เข้าอบรม จำนวนรุ่น และสถานที่ฝึกอบรม ดังนี้</w:t>
       </w:r>
     </w:p>
     <w:p>
@@ -1586,7 +440,7 @@
           <w:sz w:val="32"/>
           <w:szCs w:val="32"/>
         </w:rPr>
-        <w:t>ผู้รับจ้างจะต้องดำเนินการจัดฝึกอบรมให้แก่บุคลากรผู้ดูแลระบบจำนวน ๒๐ คน และผู้ใช้งานระบบจำนวน ๘๐ คน รวมทั้งสิ้น จำนวน ๔ รุ่น ณ กรมบัญชีกลาง โดยผู้รับจ้างต้องรับผิดชอบค่าใช้จ่ายในการจัดการฝึกอบรมทั้งหมดด้วยตนเอง และแจ้งกำหนดการล่วงหน้าก่อนวันดำเนินการอย่างน้อย ๓๐ วัน</w:t>
+        <w:t>หลักสูตรการฝึกอบรมแบ่งออกเป็น ๒ กลุ่มเป้าหมาย รวมจำนวนทั้งสิ้น ๔ รุ่น ณ กรมบัญชีกลาง โดยผู้รับจ้างต้องเป็นผู้รับผิดชอบค่าใช้จ่ายในกา…</w:t>
       </w:r>
     </w:p>
     <w:p>
@@ -1629,7 +483,21 @@
           <w:sz w:val="32"/>
           <w:szCs w:val="32"/>
         </w:rPr>
-        <w:t>ระบบที่ต้องการพัฒนาเป็นรูปแบบเว็บแอปพลิเคชันสามชั้น ประกอบด้วยส่วนนำเสนอ ส่วนบริการข้อมูล และฐานข้อมูล รองรับผู้ใช้งานพร้อมกันได้จำนวนประมาณ ๒๐๐ คน มีปริมาณข้อมูลสัญญาโดยเฉลี่ยประมาณ ๑,๒๐๐ รายการต่อปี ทั้งนี้ ระบบจะต้องรองรับสภาพแวดล้อมในการพัฒนาระบบ การทดสอบระบบ และการใช้งานจริงอย่างครบถ้วน</w:t>
+        <w:t>ผู้รับจ้างต้องดำเนินการพัฒนาระบบงานในรูปแบบเว็บแอปพลิเคชัน โดยใช้สถาปัตยกรรมระบบแบบสามชั้น ซึ่งประกอบด้วยชั้นการนำเสนอข้อมูล ชั้นบริการข้อมูล และชั้นฐานข้อมูล เพื่อให้การทำงานมีความเป็นระเบียบและสามารถบำรุงรักษาได้ง่ายในอนาคต</w:t>
+      </w:r>
+    </w:p>
+    <w:p>
+      <w:pPr>
+        <w:spacing w:line="240" w:lineRule="auto"/>
+        <w:ind w:left="850"/>
+      </w:pPr>
+      <w:r>
+        <w:rPr>
+          <w:rFonts w:ascii="TH Sarabun New" w:hAnsi="TH Sarabun New" w:cs="TH Sarabun New" w:eastAsia="TH Sarabun New"/>
+          <w:sz w:val="32"/>
+          <w:szCs w:val="32"/>
+        </w:rPr>
+        <w:t>สถาปัตยกรรมระบบเป้าหมายต้องรองรับจำนวนผู้ใช้งานพร้อมกันได้ไม่น้อยกว่าสองร้อยคน และสามารถรองรับปริมาณข้อมูลสัญญาได้ประมาณหนึ่งพันสองร้อยรายการต่อปี พร้อมทั้งจัดให้มีสภาพแวดล้อมการทำงานแยกเป็นสัดส่วนอย่างชัดเจน ได้แก่ สภาพแวดล้อมสำหรับพัฒนา สภาพแวดล้อมสำหรับทดสอบ และสภาพแวดล้อมสำหรับใช้งานจริง เพื่อความปลอดภัยและความเสถียรในการดำเนินงานของผู้ว่าจ้าง</w:t>
       </w:r>
     </w:p>
     <w:p>
@@ -1658,7 +526,7 @@
           <w:sz w:val="32"/>
           <w:szCs w:val="32"/>
         </w:rPr>
-        <w:t>ขอบเขตระบบงานและหน้าที่การทำงานที่ต้องพัฒนาประกอบด้วยส่วนสำคัญดังนี้</w:t>
+        <w:t>ผู้รับจ้างต้องดำเนินการพัฒนาระบบงานตามขอบเขตและหน้าที่การทำงานที่กำหนด โดยครอบคลุมการพัฒนาโมดูลหลักจำนวนห้าโมดูล เพื่อให้ผู้ว่าจ้างสามารถใช้งานได้อย่างมีประสิทธิภาพและสอดคล้องกับระเบียบปฏิบัติราชการ ประกอบด้วยโมดูลทะเบียนสัญญา โมดูลงวดจ่าย โมดูลตรวจรับ โมดูลรายงานสถานะ และโมดูลสิทธิ์ผู้ใช้ โดยแต่ละโมดูลต้องกำหนดเกณฑ์การตรวจรับได้อย่างชัดเจน</w:t>
       </w:r>
     </w:p>
     <w:p>
@@ -1672,77 +540,7 @@
           <w:sz w:val="32"/>
           <w:szCs w:val="32"/>
         </w:rPr>
-        <w:t>* โมดูลทะเบียนสัญญา: ระบบต้องสามารถรองรับการบันทึกข้อมูลรายละเอียดของสัญญาจัดซื้อจัดจ้างได้อย่างครบถ้วน ตั้งแต่ขั้นตอนการอนุมัติ การลงนาม ไปจนถึงการสิ้นสุดสัญญา โดยมีการกำหนดรูปแบบและเกณฑ์ในการตรวจรับข้อมูลที่ชัดเจน</w:t>
-      </w:r>
-    </w:p>
-    <w:p>
-      <w:pPr>
-        <w:spacing w:line="240" w:lineRule="auto"/>
-        <w:ind w:left="850"/>
-      </w:pPr>
-      <w:r>
-        <w:rPr>
-          <w:rFonts w:ascii="TH Sarabun New" w:hAnsi="TH Sarabun New" w:cs="TH Sarabun New" w:eastAsia="TH Sarabun New"/>
-          <w:sz w:val="32"/>
-          <w:szCs w:val="32"/>
-        </w:rPr>
-        <w:t>* โมดูลงวดจ่าย: ระบบต้องมีฟังก์ชันสำหรับการบริหารจัดการและการบันทึกรายละเอียดของงวดงานหรืองวดเงินตามสัญญา เพื่อใช้เป็นฐานข้อมูลในการคำนวณและติดตามการเบิกจ่ายเงินให้ถูกต้องตามข้อตกลง</w:t>
-      </w:r>
-    </w:p>
-    <w:p>
-      <w:pPr>
-        <w:spacing w:line="240" w:lineRule="auto"/>
-        <w:ind w:left="850"/>
-      </w:pPr>
-      <w:r>
-        <w:rPr>
-          <w:rFonts w:ascii="TH Sarabun New" w:hAnsi="TH Sarabun New" w:cs="TH Sarabun New" w:eastAsia="TH Sarabun New"/>
-          <w:sz w:val="32"/>
-          <w:szCs w:val="32"/>
-        </w:rPr>
-        <w:t>* โมดูลตรวจรับ: ระบบต้องกำหนดกระบวนการและขั้นตอนการดำเนินการตรวจรับพัสดุหรือผลงานที่ส่งมอบ โดยมีการบันทึกหลักฐานการตรวจสอบ การอนุมัติ และเกณฑ์การตรวจรับที่สามารถอ้างอิงได้</w:t>
-      </w:r>
-    </w:p>
-    <w:p>
-      <w:pPr>
-        <w:spacing w:line="240" w:lineRule="auto"/>
-        <w:ind w:left="850"/>
-      </w:pPr>
-      <w:r>
-        <w:rPr>
-          <w:rFonts w:ascii="TH Sarabun New" w:hAnsi="TH Sarabun New" w:cs="TH Sarabun New" w:eastAsia="TH Sarabun New"/>
-          <w:sz w:val="32"/>
-          <w:szCs w:val="32"/>
-        </w:rPr>
-        <w:t>* โมดูลรายงานสถานะ: ระบบจะต้องมีฟังก์ชันในการรวบรวมข้อมูลจากทุกกระบวนงาน เพื่อจัดทำรายงานสรุปสถานะของโครงการหรือสัญญาจัดซื้อจัดจ้างในรูปแบบต่างๆ ให้ผู้ใช้งานสามารถเรียกดูและนำไปใช้ประกอบการตัดสินใจได้อย่างทันท่วงที</w:t>
-      </w:r>
-    </w:p>
-    <w:p>
-      <w:pPr>
-        <w:spacing w:line="240" w:lineRule="auto"/>
-        <w:ind w:left="850"/>
-      </w:pPr>
-      <w:r>
-        <w:rPr>
-          <w:rFonts w:ascii="TH Sarabun New" w:hAnsi="TH Sarabun New" w:cs="TH Sarabun New" w:eastAsia="TH Sarabun New"/>
-          <w:sz w:val="32"/>
-          <w:szCs w:val="32"/>
-        </w:rPr>
-        <w:t>* โมดูลสิทธิ์ผู้ใช้: ระบบต้องมีการบริหารจัดการบัญชีผู้ใช้งานและการกำหนดระดับสิทธิในการเข้าถึงข้อมูลและฟังก์ชันงานที่แตกต่างกันตามบทบาทหน้าที่ของผู้ใช้งานแต่ละราย เพื่อรักษาความมั่นคงปลอดภัยของข้อมูลในระบบอย่างเคร่งครัด</w:t>
-      </w:r>
-    </w:p>
-    <w:p>
-      <w:pPr>
-        <w:spacing w:line="240" w:lineRule="auto"/>
-        <w:ind w:left="850"/>
-      </w:pPr>
-      <w:r>
-        <w:rPr>
-          <w:rFonts w:ascii="TH Sarabun New" w:hAnsi="TH Sarabun New" w:cs="TH Sarabun New" w:eastAsia="TH Sarabun New"/>
-          <w:sz w:val="32"/>
-          <w:szCs w:val="32"/>
-        </w:rPr>
-        <w:t>นอกจากนี้ ผู้รับจ้างจะต้องพัฒนาระบบให้มีส่วนการประมวลผลข้อมูล การให้บริการ และการบริหารจัดการข้อมูลเบื้องหลังทั้งหมด โดยต้องสามารถรองรับปริมาณงานที่เพิ่มขึ้นและมีการปรับปรุงแก้ไขได้อย่างต่อเนื่อง เพื่อให้เป็นระบบงานที่มีความมั่นคงถาวร</w:t>
+        <w:t>การดำเนินการพัฒนาต้องครอบคลุมข้อกำหนดทั่วไป การบันทึกและการนำเข้าข้อมูล การประมวลผลตามเงื่อนไขของกฎหมายและระเบียบที่เกี่ยวข้อง การให้บริการผ่านระบบงาน และการบริหารจัดการระบบในส่วนเบื้องหลัง เพื่อให้การปฏิบัติงานด้านการจัดซื้อจัดจ้างและการบริหารพัสดุภาครัฐเป็นไปด้วยความเรียบร้อย ถูกต้อง และตรวจสอบได้ ผู้รับจ้างต้องออกแบบและพัฒนาฟังก์ชันการทำงานให้รองรับกระบวนการปฏิบัติงานจริงของหน่วยงาน พร้อมทั้งจัดทำคู่มือการใช้งานและเอกสารที่เกี่ยวข้องให้ครบถ้วนสมบูรณ์ตามเงื่อนไขแห่งสัญญานี้</w:t>
       </w:r>
     </w:p>
     <w:p>
@@ -1771,7 +569,7 @@
           <w:sz w:val="32"/>
           <w:szCs w:val="32"/>
         </w:rPr>
-        <w:t>การเชื่อมโยงข้อมูลสัญญาและงวดจ่ายกับระบบจัดซื้อจัดจ้างภาครัฐด้วยอิเล็กทรอนิกส์ผ่านส่วนต่อประสานโปรแกรม และดำเนินการโอนย้ายข้อมูลสัญญาเดิมย้อนหลังเป็นระยะเวลา ๓ ปี</w:t>
+        <w:t>ผู้รับจ้างต้องดำเนินการเชื่อมโยงข้อมูลสัญญาและงวดจ่ายกับระบบจัดซื้อจัดจ้างภาครัฐด้วยอิเล็กทรอนิกส์ผ่านส่วนต่อประสานโปรแกรม พร้อมทั้งดำเนินการโอนย้ายข้อมูลสัญญาเดิมย้อนหลังสามปีให้เรียบร้อยและถูกต้องครบถ้วนสมบูรณ์ก่อนการส่งมอบงานจ้างตามสัญญา</w:t>
       </w:r>
     </w:p>
     <w:p>
@@ -1983,7 +781,7 @@
                 <w:sz w:val="32"/>
                 <w:szCs w:val="32"/>
               </w:rPr>
-              <w:t>ลิขสิทธิ์ซอฟต์แวร์ฐานข้อมูลและเครื่องมือพัฒนาระบบที่จำเป็น (ตามตารางเกณฑ์กลาง)</w:t>
+              <w:t>ลิขสิทธิ์ซอฟต์แวร์ระบบจัดการฐานข้อมูล</w:t>
             </w:r>
           </w:p>
         </w:tc>
@@ -2003,7 +801,7 @@
                 <w:sz w:val="32"/>
                 <w:szCs w:val="32"/>
               </w:rPr>
-              <w:t>-</w:t>
+              <w:t>๑</w:t>
             </w:r>
           </w:p>
         </w:tc>
@@ -2083,7 +881,147 @@
                 <w:sz w:val="32"/>
                 <w:szCs w:val="32"/>
               </w:rPr>
-              <w:t>ไม่มี</w:t>
+            </w:r>
+          </w:p>
+        </w:tc>
+      </w:tr>
+      <w:tr>
+        <w:tc>
+          <w:tcPr>
+            <w:tcW w:type="dxa" w:w="1391"/>
+          </w:tcPr>
+          <w:p>
+            <w:pPr>
+              <w:spacing w:line="240" w:lineRule="auto"/>
+            </w:pPr>
+            <w:r/>
+            <w:r>
+              <w:rPr>
+                <w:rFonts w:ascii="TH Sarabun New" w:hAnsi="TH Sarabun New" w:cs="TH Sarabun New" w:eastAsia="TH Sarabun New"/>
+                <w:b w:val="0"/>
+                <w:sz w:val="32"/>
+                <w:szCs w:val="32"/>
+              </w:rPr>
+              <w:t>๒</w:t>
+            </w:r>
+          </w:p>
+        </w:tc>
+        <w:tc>
+          <w:tcPr>
+            <w:tcW w:type="dxa" w:w="1391"/>
+          </w:tcPr>
+          <w:p>
+            <w:pPr>
+              <w:spacing w:line="240" w:lineRule="auto"/>
+            </w:pPr>
+            <w:r/>
+            <w:r>
+              <w:rPr>
+                <w:rFonts w:ascii="TH Sarabun New" w:hAnsi="TH Sarabun New" w:cs="TH Sarabun New" w:eastAsia="TH Sarabun New"/>
+                <w:b w:val="0"/>
+                <w:sz w:val="32"/>
+                <w:szCs w:val="32"/>
+              </w:rPr>
+              <w:t>ลิขสิทธิ์ซอฟต์แวร์เครื่องมือพัฒนาระบบ</w:t>
+            </w:r>
+          </w:p>
+        </w:tc>
+        <w:tc>
+          <w:tcPr>
+            <w:tcW w:type="dxa" w:w="1391"/>
+          </w:tcPr>
+          <w:p>
+            <w:pPr>
+              <w:spacing w:line="240" w:lineRule="auto"/>
+            </w:pPr>
+            <w:r/>
+            <w:r>
+              <w:rPr>
+                <w:rFonts w:ascii="TH Sarabun New" w:hAnsi="TH Sarabun New" w:cs="TH Sarabun New" w:eastAsia="TH Sarabun New"/>
+                <w:b w:val="0"/>
+                <w:sz w:val="32"/>
+                <w:szCs w:val="32"/>
+              </w:rPr>
+              <w:t>๑</w:t>
+            </w:r>
+          </w:p>
+        </w:tc>
+        <w:tc>
+          <w:tcPr>
+            <w:tcW w:type="dxa" w:w="1391"/>
+          </w:tcPr>
+          <w:p>
+            <w:pPr>
+              <w:spacing w:line="240" w:lineRule="auto"/>
+            </w:pPr>
+            <w:r/>
+            <w:r>
+              <w:rPr>
+                <w:rFonts w:ascii="TH Sarabun New" w:hAnsi="TH Sarabun New" w:cs="TH Sarabun New" w:eastAsia="TH Sarabun New"/>
+                <w:b w:val="0"/>
+                <w:sz w:val="32"/>
+                <w:szCs w:val="32"/>
+              </w:rPr>
+              <w:t>-</w:t>
+            </w:r>
+          </w:p>
+        </w:tc>
+        <w:tc>
+          <w:tcPr>
+            <w:tcW w:type="dxa" w:w="1391"/>
+          </w:tcPr>
+          <w:p>
+            <w:pPr>
+              <w:spacing w:line="240" w:lineRule="auto"/>
+            </w:pPr>
+            <w:r/>
+            <w:r>
+              <w:rPr>
+                <w:rFonts w:ascii="TH Sarabun New" w:hAnsi="TH Sarabun New" w:cs="TH Sarabun New" w:eastAsia="TH Sarabun New"/>
+                <w:b w:val="0"/>
+                <w:sz w:val="32"/>
+                <w:szCs w:val="32"/>
+              </w:rPr>
+              <w:t>-</w:t>
+            </w:r>
+          </w:p>
+        </w:tc>
+        <w:tc>
+          <w:tcPr>
+            <w:tcW w:type="dxa" w:w="1391"/>
+          </w:tcPr>
+          <w:p>
+            <w:pPr>
+              <w:spacing w:line="240" w:lineRule="auto"/>
+            </w:pPr>
+            <w:r/>
+            <w:r>
+              <w:rPr>
+                <w:rFonts w:ascii="TH Sarabun New" w:hAnsi="TH Sarabun New" w:cs="TH Sarabun New" w:eastAsia="TH Sarabun New"/>
+                <w:b w:val="0"/>
+                <w:sz w:val="32"/>
+                <w:szCs w:val="32"/>
+              </w:rPr>
+              <w:t>ใช้</w:t>
+            </w:r>
+          </w:p>
+        </w:tc>
+        <w:tc>
+          <w:tcPr>
+            <w:tcW w:type="dxa" w:w="1391"/>
+          </w:tcPr>
+          <w:p>
+            <w:pPr>
+              <w:spacing w:line="240" w:lineRule="auto"/>
+            </w:pPr>
+            <w:r/>
+            <w:r>
+              <w:rPr>
+                <w:rFonts w:ascii="TH Sarabun New" w:hAnsi="TH Sarabun New" w:cs="TH Sarabun New" w:eastAsia="TH Sarabun New"/>
+                <w:b w:val="0"/>
+                <w:sz w:val="32"/>
+                <w:szCs w:val="32"/>
+              </w:rPr>
             </w:r>
           </w:p>
         </w:tc>
@@ -2251,63 +1189,7 @@
           <w:sz w:val="32"/>
           <w:szCs w:val="32"/>
         </w:rPr>
-        <w:t>ผู้รับจ้างจะต้องดำเนินการให้ระบบที่พัฒนาขึ้นเป็นไปตามมาตรฐานด้านความมั่นคงปลอดภัยสารสนเทศ ดังนี้</w:t>
-      </w:r>
-    </w:p>
-    <w:p>
-      <w:pPr>
-        <w:spacing w:line="240" w:lineRule="auto"/>
-        <w:ind w:left="850"/>
-      </w:pPr>
-      <w:r>
-        <w:rPr>
-          <w:rFonts w:ascii="TH Sarabun New" w:hAnsi="TH Sarabun New" w:cs="TH Sarabun New" w:eastAsia="TH Sarabun New"/>
-          <w:sz w:val="32"/>
-          <w:szCs w:val="32"/>
-        </w:rPr>
-        <w:t>๑. ต้องมีการออกแบบและพัฒนาระบบโดยคำนึงถึงการคุ้มครองข้อมูลส่วนบุคคล ตามพระราชบัญญัติคุ้มครองข้อมูลส่วนบุคคล พ.ศ. ๒๕๖๒ (PDPA) อย่างเคร่งครัด</w:t>
-      </w:r>
-    </w:p>
-    <w:p>
-      <w:pPr>
-        <w:spacing w:line="240" w:lineRule="auto"/>
-        <w:ind w:left="850"/>
-      </w:pPr>
-      <w:r>
-        <w:rPr>
-          <w:rFonts w:ascii="TH Sarabun New" w:hAnsi="TH Sarabun New" w:cs="TH Sarabun New" w:eastAsia="TH Sarabun New"/>
-          <w:sz w:val="32"/>
-          <w:szCs w:val="32"/>
-        </w:rPr>
-        <w:t>๒. ระบบต้องผ่านเกณฑ์มาตรฐานด้านความมั่นคงปลอดภัยสารสนเทศที่กำหนด เช่น มาตรฐานเว็บไซต์ภาครัฐ และ OWASP 10 โดยเฉพาะการปิดช่องโหว่ในระดับสูงและวิกฤตก่อนนำระบบขึ้นใช้งานจริง</w:t>
-      </w:r>
-    </w:p>
-    <w:p>
-      <w:pPr>
-        <w:spacing w:line="240" w:lineRule="auto"/>
-        <w:ind w:left="850"/>
-      </w:pPr>
-      <w:r>
-        <w:rPr>
-          <w:rFonts w:ascii="TH Sarabun New" w:hAnsi="TH Sarabun New" w:cs="TH Sarabun New" w:eastAsia="TH Sarabun New"/>
-          <w:sz w:val="32"/>
-          <w:szCs w:val="32"/>
-        </w:rPr>
-        <w:t>๓. ต้องมีการเข้ารหัสข้อมูลในการสื่อสารระหว่างเครื่องลูกข่ายกับเครื่องแม่ข่ายตลอดกระบวนการทำงานของระบบ</w:t>
-      </w:r>
-    </w:p>
-    <w:p>
-      <w:pPr>
-        <w:spacing w:line="240" w:lineRule="auto"/>
-        <w:ind w:left="850"/>
-      </w:pPr>
-      <w:r>
-        <w:rPr>
-          <w:rFonts w:ascii="TH Sarabun New" w:hAnsi="TH Sarabun New" w:cs="TH Sarabun New" w:eastAsia="TH Sarabun New"/>
-          <w:sz w:val="32"/>
-          <w:szCs w:val="32"/>
-        </w:rPr>
-        <w:t>๔. ผู้รับจ้างต้องดำเนินการให้สอดคล้องตามมาตรฐานสากลที่เกี่ยวข้อง เช่น มาตรฐาน ISO/IEC ๒๗๐๐๑ และจัดทำรายงานผลการประเมินช่องโหว่เพื่อประกอบการพิจารณาโดยคณะกรรมการตรวจรับพัสดุ</w:t>
+        <w:t>ผู้รับจ้างต้องดำเนินการพัฒนาระบบให้เป็นไปตามมาตรฐานและข้อกำหนดด้านความมั่นคงปลอดภัยสารสนเทศ โดยต้องปฏิบัติตามกฎหมายว่าด้วยการคุ้มครองข้อมูลส่วนบุคคลอย่างเคร่งครัด พร้อมทั้งทำการปิดช่องโหว่ด้านความมั่นคงปลอดภัยของแอปพลิเคชันตามมาตรฐานสากลในระดับสูงและระดับวิกฤต และต้องดำเนินการเข้ารหัสการสื่อสารระหว่างเครื่องลูกข่ายกับเครื่องแม่ข่ายตลอดระยะเวลาการดำเนินโครงการ เพื่อป้องกันการเข้าถึงข้อมูลโดยไม่ได้รับอนุญาตและรักษาความลับของข้อมูลผู้ใช้งาน</w:t>
       </w:r>
     </w:p>
     <w:p>
@@ -2336,542 +1218,9 @@
           <w:sz w:val="32"/>
           <w:szCs w:val="32"/>
         </w:rPr>
-        <w:t>การทดสอบระบบและเกณฑ์การยอมรับ</w:t>
+        <w:t>ผู้รับจ้างต้องจัดทำแผนการทดสอบระบบและดำเนินการทดสอบระบบงานก่อนการส่งมอบ โดยครอบคลุมประเภทการทดสอบ ประกอบด้วย การทดสอบหน้าที่การทำงาน การทดสอบการเชื่อมโยง การทดสอบประสิทธิภาพ การทดสอบความมั่นคงปลอดภัย และการทดสอบการยอมรับโดยผู้ใช้ ทั้งนี้ เกณฑ์การยอมรับสำหรับการทดสอบการยอมรับโดยผู้ใช้ต้องผ่านการทดสอบไม่น้อยกว่าร้อยละเก้าสิบห้าของกรณีทดสอบทั้งหมดจำนวนสองร้อยกรณี พร้อมทั้งจัดทำรายงานผลการทดสอบและเอกสารหลักฐานการทดสอบทั้งหมดเสนอต่อผู้وผู้ว่าจ้างเพื่อประกอบการตรวจสอบและพิจารณารับมอบงานตามสัญญาต่อไป</w:t>
       </w:r>
     </w:p>
-    <w:p>
-      <w:pPr>
-        <w:spacing w:line="240" w:lineRule="auto"/>
-        <w:ind w:left="850"/>
-      </w:pPr>
-      <w:r>
-        <w:rPr>
-          <w:rFonts w:ascii="TH Sarabun New" w:hAnsi="TH Sarabun New" w:cs="TH Sarabun New" w:eastAsia="TH Sarabun New"/>
-          <w:sz w:val="32"/>
-          <w:szCs w:val="32"/>
-        </w:rPr>
-        <w:t>ผู้รับจ้างจะต้องดำเนินการทดสอบระบบในประเภทหลักดังต่อไปนี้ ได้แก่ การทดสอบหน้าที่การทำงาน การทดสอบการเชื่อมโยงระบบ การทดสอบประสิทธิภาพ การทดสอบความมั่นคงปลอดภัย และการทดสอบโดยผู้ใช้ เพื่อให้แน่ใจว่าระบบงานใหม่สามารถตอบสนองต่อวัตถุประสงค์และข้อกำหนดทั้งหมดได้อย่างสมบูรณ์</w:t>
-      </w:r>
-    </w:p>
-    <w:p>
-      <w:pPr>
-        <w:spacing w:line="240" w:lineRule="auto"/>
-        <w:ind w:left="850"/>
-      </w:pPr>
-      <w:r>
-        <w:rPr>
-          <w:rFonts w:ascii="TH Sarabun New" w:hAnsi="TH Sarabun New" w:cs="TH Sarabun New" w:eastAsia="TH Sarabun New"/>
-          <w:sz w:val="32"/>
-          <w:szCs w:val="32"/>
-        </w:rPr>
-        <w:t>เกณฑ์การยอมรับผลการทดสอบจะต้องเป็นไปตามรายละเอียดดังนี้:</w:t>
-      </w:r>
-    </w:p>
-    <w:tbl>
-      <w:tblPr>
-        <w:tblStyle w:val="TableGrid"/>
-        <w:tblW w:type="auto" w:w="0"/>
-        <w:tblLook w:firstColumn="1" w:firstRow="1" w:lastColumn="0" w:lastRow="0" w:noHBand="0" w:noVBand="1" w:val="04A0"/>
-      </w:tblPr>
-      <w:tblGrid>
-        <w:gridCol w:w="2435"/>
-        <w:gridCol w:w="2435"/>
-        <w:gridCol w:w="2435"/>
-        <w:gridCol w:w="2435"/>
-      </w:tblGrid>
-      <w:tr>
-        <w:tc>
-          <w:tcPr>
-            <w:tcW w:type="dxa" w:w="2435"/>
-          </w:tcPr>
-          <w:p>
-            <w:pPr>
-              <w:spacing w:line="240" w:lineRule="auto"/>
-            </w:pPr>
-            <w:r/>
-            <w:r>
-              <w:rPr>
-                <w:rFonts w:ascii="TH Sarabun New" w:hAnsi="TH Sarabun New" w:cs="TH Sarabun New" w:eastAsia="TH Sarabun New"/>
-                <w:b/>
-                <w:sz w:val="32"/>
-                <w:szCs w:val="32"/>
-              </w:rPr>
-              <w:t>ประเภทการทดสอบ</w:t>
-            </w:r>
-          </w:p>
-        </w:tc>
-        <w:tc>
-          <w:tcPr>
-            <w:tcW w:type="dxa" w:w="2435"/>
-          </w:tcPr>
-          <w:p>
-            <w:pPr>
-              <w:spacing w:line="240" w:lineRule="auto"/>
-            </w:pPr>
-            <w:r/>
-            <w:r>
-              <w:rPr>
-                <w:rFonts w:ascii="TH Sarabun New" w:hAnsi="TH Sarabun New" w:cs="TH Sarabun New" w:eastAsia="TH Sarabun New"/>
-                <w:b/>
-                <w:sz w:val="32"/>
-                <w:szCs w:val="32"/>
-              </w:rPr>
-              <w:t>วัตถุประสงค์หลัก</w:t>
-            </w:r>
-          </w:p>
-        </w:tc>
-        <w:tc>
-          <w:tcPr>
-            <w:tcW w:type="dxa" w:w="2435"/>
-          </w:tcPr>
-          <w:p>
-            <w:pPr>
-              <w:spacing w:line="240" w:lineRule="auto"/>
-            </w:pPr>
-            <w:r/>
-            <w:r>
-              <w:rPr>
-                <w:rFonts w:ascii="TH Sarabun New" w:hAnsi="TH Sarabun New" w:cs="TH Sarabun New" w:eastAsia="TH Sarabun New"/>
-                <w:b/>
-                <w:sz w:val="32"/>
-                <w:szCs w:val="32"/>
-              </w:rPr>
-              <w:t>เกณฑ์ผ่านที่ต้องปฏิบัติได้</w:t>
-            </w:r>
-          </w:p>
-        </w:tc>
-        <w:tc>
-          <w:tcPr>
-            <w:tcW w:type="dxa" w:w="2435"/>
-          </w:tcPr>
-          <w:p>
-            <w:pPr>
-              <w:spacing w:line="240" w:lineRule="auto"/>
-            </w:pPr>
-            <w:r/>
-            <w:r>
-              <w:rPr>
-                <w:rFonts w:ascii="TH Sarabun New" w:hAnsi="TH Sarabun New" w:cs="TH Sarabun New" w:eastAsia="TH Sarabun New"/>
-                <w:b/>
-                <w:sz w:val="32"/>
-                <w:szCs w:val="32"/>
-              </w:rPr>
-              <w:t>หลักฐานในการตรวจรับ</w:t>
-            </w:r>
-          </w:p>
-        </w:tc>
-      </w:tr>
-      <w:tr>
-        <w:tc>
-          <w:tcPr>
-            <w:tcW w:type="dxa" w:w="2435"/>
-          </w:tcPr>
-          <w:p>
-            <w:pPr>
-              <w:spacing w:line="240" w:lineRule="auto"/>
-            </w:pPr>
-            <w:r/>
-            <w:r>
-              <w:rPr>
-                <w:rFonts w:ascii="TH Sarabun New" w:hAnsi="TH Sarabun New" w:cs="TH Sarabun New" w:eastAsia="TH Sarabun New"/>
-                <w:b w:val="0"/>
-                <w:sz w:val="32"/>
-                <w:szCs w:val="32"/>
-              </w:rPr>
-              <w:t>การทดสอบหน้าที่การทำงาน</w:t>
-            </w:r>
-          </w:p>
-        </w:tc>
-        <w:tc>
-          <w:tcPr>
-            <w:tcW w:type="dxa" w:w="2435"/>
-          </w:tcPr>
-          <w:p>
-            <w:pPr>
-              <w:spacing w:line="240" w:lineRule="auto"/>
-            </w:pPr>
-            <w:r/>
-            <w:r>
-              <w:rPr>
-                <w:rFonts w:ascii="TH Sarabun New" w:hAnsi="TH Sarabun New" w:cs="TH Sarabun New" w:eastAsia="TH Sarabun New"/>
-                <w:b w:val="0"/>
-                <w:sz w:val="32"/>
-                <w:szCs w:val="32"/>
-              </w:rPr>
-              <w:t>ตรวจสอบว่าระบบสามารถดำเนินการตามกระบวนงานและฟังก์ชันที่กำหนดไว้ได้อย่างถูกต้องครบถ้วน</w:t>
-            </w:r>
-          </w:p>
-        </w:tc>
-        <w:tc>
-          <w:tcPr>
-            <w:tcW w:type="dxa" w:w="2435"/>
-          </w:tcPr>
-          <w:p>
-            <w:pPr>
-              <w:spacing w:line="240" w:lineRule="auto"/>
-            </w:pPr>
-            <w:r/>
-            <w:r>
-              <w:rPr>
-                <w:rFonts w:ascii="TH Sarabun New" w:hAnsi="TH Sarabun New" w:cs="TH Sarabun New" w:eastAsia="TH Sarabun New"/>
-                <w:b w:val="0"/>
-                <w:sz w:val="32"/>
-                <w:szCs w:val="32"/>
-              </w:rPr>
-              <w:t>กรณีทดสอบ ( ) ต้องผ่านเกณฑ์ไม่น้อยกว่าร้อยละ ๙๕ ของจำนวนกรณีทดสอบทั้งหมด จำนวนรวมอย่างน้อย ๒๐๐ กรณี</w:t>
-            </w:r>
-          </w:p>
-        </w:tc>
-        <w:tc>
-          <w:tcPr>
-            <w:tcW w:type="dxa" w:w="2435"/>
-          </w:tcPr>
-          <w:p>
-            <w:pPr>
-              <w:spacing w:line="240" w:lineRule="auto"/>
-            </w:pPr>
-            <w:r/>
-            <w:r>
-              <w:rPr>
-                <w:rFonts w:ascii="TH Sarabun New" w:hAnsi="TH Sarabun New" w:cs="TH Sarabun New" w:eastAsia="TH Sarabun New"/>
-                <w:b w:val="0"/>
-                <w:sz w:val="32"/>
-                <w:szCs w:val="32"/>
-              </w:rPr>
-              <w:t>รายงานผลการทดสอบหน้าที่การทำงาน และเอกสารยืนยันความสำเร็จของแต่ละฟังก์ชัน</w:t>
-            </w:r>
-          </w:p>
-        </w:tc>
-      </w:tr>
-      <w:tr>
-        <w:tc>
-          <w:tcPr>
-            <w:tcW w:type="dxa" w:w="2435"/>
-          </w:tcPr>
-          <w:p>
-            <w:pPr>
-              <w:spacing w:line="240" w:lineRule="auto"/>
-            </w:pPr>
-            <w:r/>
-            <w:r>
-              <w:rPr>
-                <w:rFonts w:ascii="TH Sarabun New" w:hAnsi="TH Sarabun New" w:cs="TH Sarabun New" w:eastAsia="TH Sarabun New"/>
-                <w:b w:val="0"/>
-                <w:sz w:val="32"/>
-                <w:szCs w:val="32"/>
-              </w:rPr>
-              <w:t>การทดสอบการเชื่อมโยงระบบ</w:t>
-            </w:r>
-          </w:p>
-        </w:tc>
-        <w:tc>
-          <w:tcPr>
-            <w:tcW w:type="dxa" w:w="2435"/>
-          </w:tcPr>
-          <w:p>
-            <w:pPr>
-              <w:spacing w:line="240" w:lineRule="auto"/>
-            </w:pPr>
-            <w:r/>
-            <w:r>
-              <w:rPr>
-                <w:rFonts w:ascii="TH Sarabun New" w:hAnsi="TH Sarabun New" w:cs="TH Sarabun New" w:eastAsia="TH Sarabun New"/>
-                <w:b w:val="0"/>
-                <w:sz w:val="32"/>
-                <w:szCs w:val="32"/>
-              </w:rPr>
-              <w:t>ตรวจสอบการแลกเปลี่ยนข้อมูลระหว่างระบบใหม่กับระบบอื่นที่เกี่ยวข้องได้อย่างถูกต้องและต่อเนื่อง</w:t>
-            </w:r>
-          </w:p>
-        </w:tc>
-        <w:tc>
-          <w:tcPr>
-            <w:tcW w:type="dxa" w:w="2435"/>
-          </w:tcPr>
-          <w:p>
-            <w:pPr>
-              <w:spacing w:line="240" w:lineRule="auto"/>
-            </w:pPr>
-            <w:r/>
-            <w:r>
-              <w:rPr>
-                <w:rFonts w:ascii="TH Sarabun New" w:hAnsi="TH Sarabun New" w:cs="TH Sarabun New" w:eastAsia="TH Sarabun New"/>
-                <w:b w:val="0"/>
-                <w:sz w:val="32"/>
-                <w:szCs w:val="32"/>
-              </w:rPr>
-              <w:t>ข้อมูลที่ส่งผ่านและรับมาจากระบบปลายทางต้องมีความสมบูรณ์ ถูกต้องตามรูปแบบที่กำหนด และสามารถใช้งานได้จริงทุกรายการ</w:t>
-            </w:r>
-          </w:p>
-        </w:tc>
-        <w:tc>
-          <w:tcPr>
-            <w:tcW w:type="dxa" w:w="2435"/>
-          </w:tcPr>
-          <w:p>
-            <w:pPr>
-              <w:spacing w:line="240" w:lineRule="auto"/>
-            </w:pPr>
-            <w:r/>
-            <w:r>
-              <w:rPr>
-                <w:rFonts w:ascii="TH Sarabun New" w:hAnsi="TH Sarabun New" w:cs="TH Sarabun New" w:eastAsia="TH Sarabun New"/>
-                <w:b w:val="0"/>
-                <w:sz w:val="32"/>
-                <w:szCs w:val="32"/>
-              </w:rPr>
-              <w:t>รายงานผลการทดสอบการเชื่อมโยง พร้อมหลักฐานการถ่ายโอนข้อมูลตัวอย่าง</w:t>
-            </w:r>
-          </w:p>
-        </w:tc>
-      </w:tr>
-      <w:tr>
-        <w:tc>
-          <w:tcPr>
-            <w:tcW w:type="dxa" w:w="2435"/>
-          </w:tcPr>
-          <w:p>
-            <w:pPr>
-              <w:spacing w:line="240" w:lineRule="auto"/>
-            </w:pPr>
-            <w:r/>
-            <w:r>
-              <w:rPr>
-                <w:rFonts w:ascii="TH Sarabun New" w:hAnsi="TH Sarabun New" w:cs="TH Sarabun New" w:eastAsia="TH Sarabun New"/>
-                <w:b w:val="0"/>
-                <w:sz w:val="32"/>
-                <w:szCs w:val="32"/>
-              </w:rPr>
-              <w:t>การทดสอบประสิทธิภาพ</w:t>
-            </w:r>
-          </w:p>
-        </w:tc>
-        <w:tc>
-          <w:tcPr>
-            <w:tcW w:type="dxa" w:w="2435"/>
-          </w:tcPr>
-          <w:p>
-            <w:pPr>
-              <w:spacing w:line="240" w:lineRule="auto"/>
-            </w:pPr>
-            <w:r/>
-            <w:r>
-              <w:rPr>
-                <w:rFonts w:ascii="TH Sarabun New" w:hAnsi="TH Sarabun New" w:cs="TH Sarabun New" w:eastAsia="TH Sarabun New"/>
-                <w:b w:val="0"/>
-                <w:sz w:val="32"/>
-                <w:szCs w:val="32"/>
-              </w:rPr>
-              <w:t>ตรวจสอบความเร็วและความเสถียรของระบบภายใต้ปริมาณผู้ใช้และข้อมูลขนาดใหญ่ในสภาวะปกติและสภาวะสูงสุดที่กำหนดไว้</w:t>
-            </w:r>
-          </w:p>
-        </w:tc>
-        <w:tc>
-          <w:tcPr>
-            <w:tcW w:type="dxa" w:w="2435"/>
-          </w:tcPr>
-          <w:p>
-            <w:pPr>
-              <w:spacing w:line="240" w:lineRule="auto"/>
-            </w:pPr>
-            <w:r/>
-            <w:r>
-              <w:rPr>
-                <w:rFonts w:ascii="TH Sarabun New" w:hAnsi="TH Sarabun New" w:cs="TH Sarabun New" w:eastAsia="TH Sarabun New"/>
-                <w:b w:val="0"/>
-                <w:sz w:val="32"/>
-                <w:szCs w:val="32"/>
-              </w:rPr>
-              <w:t>ระบบต้องสามารถรองรับจำนวนผู้ใช้งานพร้อมกันได้ตามเกณฑ์ที่ตกลง และมีเวลาในการประมวลผลไม่เกินระยะเวลาที่กำหนดโดยไม่มีการขัดข้อง</w:t>
-            </w:r>
-          </w:p>
-        </w:tc>
-        <w:tc>
-          <w:tcPr>
-            <w:tcW w:type="dxa" w:w="2435"/>
-          </w:tcPr>
-          <w:p>
-            <w:pPr>
-              <w:spacing w:line="240" w:lineRule="auto"/>
-            </w:pPr>
-            <w:r/>
-            <w:r>
-              <w:rPr>
-                <w:rFonts w:ascii="TH Sarabun New" w:hAnsi="TH Sarabun New" w:cs="TH Sarabun New" w:eastAsia="TH Sarabun New"/>
-                <w:b w:val="0"/>
-                <w:sz w:val="32"/>
-                <w:szCs w:val="32"/>
-              </w:rPr>
-              <w:t>รายงานผลการทดสอบประสิทธิภาพ พร้อมบันทึกข้อมูลความเร็วและเสถียรภาพของระบบ</w:t>
-            </w:r>
-          </w:p>
-        </w:tc>
-      </w:tr>
-      <w:tr>
-        <w:tc>
-          <w:tcPr>
-            <w:tcW w:type="dxa" w:w="2435"/>
-          </w:tcPr>
-          <w:p>
-            <w:pPr>
-              <w:spacing w:line="240" w:lineRule="auto"/>
-            </w:pPr>
-            <w:r/>
-            <w:r>
-              <w:rPr>
-                <w:rFonts w:ascii="TH Sarabun New" w:hAnsi="TH Sarabun New" w:cs="TH Sarabun New" w:eastAsia="TH Sarabun New"/>
-                <w:b w:val="0"/>
-                <w:sz w:val="32"/>
-                <w:szCs w:val="32"/>
-              </w:rPr>
-              <w:t>การทดสอบความมั่นคงปลอดภัย</w:t>
-            </w:r>
-          </w:p>
-        </w:tc>
-        <w:tc>
-          <w:tcPr>
-            <w:tcW w:type="dxa" w:w="2435"/>
-          </w:tcPr>
-          <w:p>
-            <w:pPr>
-              <w:spacing w:line="240" w:lineRule="auto"/>
-            </w:pPr>
-            <w:r/>
-            <w:r>
-              <w:rPr>
-                <w:rFonts w:ascii="TH Sarabun New" w:hAnsi="TH Sarabun New" w:cs="TH Sarabun New" w:eastAsia="TH Sarabun New"/>
-                <w:b w:val="0"/>
-                <w:sz w:val="32"/>
-                <w:szCs w:val="32"/>
-              </w:rPr>
-              <w:t>ตรวจสอบช่องโหว่ด้านความมั่นคงปลอดภัยและการป้องกันการเข้าถึงข้อมูลโดยไม่ได้รับอนุญาต</w:t>
-            </w:r>
-          </w:p>
-        </w:tc>
-        <w:tc>
-          <w:tcPr>
-            <w:tcW w:type="dxa" w:w="2435"/>
-          </w:tcPr>
-          <w:p>
-            <w:pPr>
-              <w:spacing w:line="240" w:lineRule="auto"/>
-            </w:pPr>
-            <w:r/>
-            <w:r>
-              <w:rPr>
-                <w:rFonts w:ascii="TH Sarabun New" w:hAnsi="TH Sarabun New" w:cs="TH Sarabun New" w:eastAsia="TH Sarabun New"/>
-                <w:b w:val="0"/>
-                <w:sz w:val="32"/>
-                <w:szCs w:val="32"/>
-              </w:rPr>
-              <w:t>ระบบต้องผ่านการประเมินช่องโหว่ตามมาตรฐานที่กำหนด และสามารถปฏิบัติตามมาตรการคุ้มครองข้อมูลส่วนบุคคลได้อย่างสมบูรณ์</w:t>
-            </w:r>
-          </w:p>
-        </w:tc>
-        <w:tc>
-          <w:tcPr>
-            <w:tcW w:type="dxa" w:w="2435"/>
-          </w:tcPr>
-          <w:p>
-            <w:pPr>
-              <w:spacing w:line="240" w:lineRule="auto"/>
-            </w:pPr>
-            <w:r/>
-            <w:r>
-              <w:rPr>
-                <w:rFonts w:ascii="TH Sarabun New" w:hAnsi="TH Sarabun New" w:cs="TH Sarabun New" w:eastAsia="TH Sarabun New"/>
-                <w:b w:val="0"/>
-                <w:sz w:val="32"/>
-                <w:szCs w:val="32"/>
-              </w:rPr>
-              <w:t>รายงานผลการทดสอบเจาะระบบ ( ) และเอกสารยืนยันการแก้ไขช่องโหว่ทั้งหมด</w:t>
-            </w:r>
-          </w:p>
-        </w:tc>
-      </w:tr>
-      <w:tr>
-        <w:tc>
-          <w:tcPr>
-            <w:tcW w:type="dxa" w:w="2435"/>
-          </w:tcPr>
-          <w:p>
-            <w:pPr>
-              <w:spacing w:line="240" w:lineRule="auto"/>
-            </w:pPr>
-            <w:r/>
-            <w:r>
-              <w:rPr>
-                <w:rFonts w:ascii="TH Sarabun New" w:hAnsi="TH Sarabun New" w:cs="TH Sarabun New" w:eastAsia="TH Sarabun New"/>
-                <w:b w:val="0"/>
-                <w:sz w:val="32"/>
-                <w:szCs w:val="32"/>
-              </w:rPr>
-              <w:t>การทดสอบโดยผู้ใช้</w:t>
-            </w:r>
-          </w:p>
-        </w:tc>
-        <w:tc>
-          <w:tcPr>
-            <w:tcW w:type="dxa" w:w="2435"/>
-          </w:tcPr>
-          <w:p>
-            <w:pPr>
-              <w:spacing w:line="240" w:lineRule="auto"/>
-            </w:pPr>
-            <w:r/>
-            <w:r>
-              <w:rPr>
-                <w:rFonts w:ascii="TH Sarabun New" w:hAnsi="TH Sarabun New" w:cs="TH Sarabun New" w:eastAsia="TH Sarabun New"/>
-                <w:b w:val="0"/>
-                <w:sz w:val="32"/>
-                <w:szCs w:val="32"/>
-              </w:rPr>
-              <w:t>ให้ผู้ใช้งานจริงได้เข้ามาทดลองใช้และให้ข้อเสนอแนะเพื่อหาจุดบกพร่องก่อนนำไปใช้งานจริง</w:t>
-            </w:r>
-          </w:p>
-        </w:tc>
-        <w:tc>
-          <w:tcPr>
-            <w:tcW w:type="dxa" w:w="2435"/>
-          </w:tcPr>
-          <w:p>
-            <w:pPr>
-              <w:spacing w:line="240" w:lineRule="auto"/>
-            </w:pPr>
-            <w:r/>
-            <w:r>
-              <w:rPr>
-                <w:rFonts w:ascii="TH Sarabun New" w:hAnsi="TH Sarabun New" w:cs="TH Sarabun New" w:eastAsia="TH Sarabun New"/>
-                <w:b w:val="0"/>
-                <w:sz w:val="32"/>
-                <w:szCs w:val="32"/>
-              </w:rPr>
-              <w:t>ผู้ใช้งานหลักต้องสามารถปฏิบัติงานตามกระบวนงานที่กำหนดได้อย่างราบรื่น และยอมรับการทำงานของระบบในภาพรวม</w:t>
-            </w:r>
-          </w:p>
-        </w:tc>
-        <w:tc>
-          <w:tcPr>
-            <w:tcW w:type="dxa" w:w="2435"/>
-          </w:tcPr>
-          <w:p>
-            <w:pPr>
-              <w:spacing w:line="240" w:lineRule="auto"/>
-            </w:pPr>
-            <w:r/>
-            <w:r>
-              <w:rPr>
-                <w:rFonts w:ascii="TH Sarabun New" w:hAnsi="TH Sarabun New" w:cs="TH Sarabun New" w:eastAsia="TH Sarabun New"/>
-                <w:b w:val="0"/>
-                <w:sz w:val="32"/>
-                <w:szCs w:val="32"/>
-              </w:rPr>
-              <w:t>รายงานผลการทดสอบโดยผู้ใช้ ( ) ที่ลงนามรับรองจากหน่วยงานผู้ว่าจ้าง</w:t>
-            </w:r>
-          </w:p>
-        </w:tc>
-      </w:tr>
-    </w:tbl>
     <w:p>
       <w:pPr>
         <w:spacing w:line="240" w:lineRule="auto"/>
@@ -2898,7 +1247,7 @@
           <w:sz w:val="32"/>
           <w:szCs w:val="32"/>
         </w:rPr>
-        <w:t>การฝึกอบรมและการถ่ายทอดความรู้</w:t>
+        <w:t>ผู้รับจ้างต้องจัดให้มีการฝึกอบรมและการถ่ายทอดความรู้แก่บุคลากรของผู้ว่าจ้าง เพื่อให้สามารถใช้งาน บริหารจัดการ และดูแลรักษาระบบงานได้อย่างมีประสิทธิภาพ โดยมีรายละเอียดหลักสูตร จำนวนผู้เข้าอบรม จำนวนรุ่น และสถานที่ฝึกอบรม ดังนี้</w:t>
       </w:r>
     </w:p>
     <w:p>
@@ -2912,9 +1261,329 @@
           <w:sz w:val="32"/>
           <w:szCs w:val="32"/>
         </w:rPr>
-        <w:t>ผู้รับจ้างจะต้องดำเนินการจัดฝึกอบรมให้แก่บุคลากรผู้ดูแลระบบจำนวน ๒๐ คน และผู้ใช้งานระบบจำนวน ๘๐ คน รวมทั้งสิ้น จำนวน ๔ รุ่น ณ กรมบัญชีกลาง โดยผู้รับจ้างต้องรับผิดชอบค่าใช้จ่ายในการจัดการฝึกอบรมทั้งหมดด้วยตนเอง และแจ้งกำหนดการล่วงหน้าก่อนวันดำเนินการอย่างน้อย ๓๐ วัน</w:t>
+        <w:t>หลักสูตรการฝึกอบรมแบ่งออกเป็น ๒ กลุ่มเป้าหมาย รวมจำนวนทั้งสิ้น ๔ รุ่น ณ กรมบัญชีกลาง โดยผู้รับจ้างต้องเป็นผู้รับผิดชอบค่าใช้จ่ายในการดำเนินการฝึกอบรมทั้งหมดโดยไม่คิดค่าใช้จ่ายใด ๆ เพิ่มเติมทั้งสิ้น พร้อมทั้งต้องแจ้งกำหนดการฝึกอบรมให้ผู้ว่าจ้างทราบล่วงหน้าก่อนเริ่มดำเนินการ ดังแสดงรายละเอียดในตาราง</w:t>
       </w:r>
     </w:p>
+    <w:tbl>
+      <w:tblPr>
+        <w:tblStyle w:val="TableGrid"/>
+        <w:tblW w:type="auto" w:w="0"/>
+        <w:tblLook w:firstColumn="1" w:firstRow="1" w:lastColumn="0" w:lastRow="0" w:noHBand="0" w:noVBand="1" w:val="04A0"/>
+      </w:tblPr>
+      <w:tblGrid>
+        <w:gridCol w:w="1948"/>
+        <w:gridCol w:w="1948"/>
+        <w:gridCol w:w="1948"/>
+        <w:gridCol w:w="1948"/>
+        <w:gridCol w:w="1948"/>
+      </w:tblGrid>
+      <w:tr>
+        <w:tc>
+          <w:tcPr>
+            <w:tcW w:type="dxa" w:w="1948"/>
+          </w:tcPr>
+          <w:p>
+            <w:pPr>
+              <w:spacing w:line="240" w:lineRule="auto"/>
+            </w:pPr>
+            <w:r/>
+            <w:r>
+              <w:rPr>
+                <w:rFonts w:ascii="TH Sarabun New" w:hAnsi="TH Sarabun New" w:cs="TH Sarabun New" w:eastAsia="TH Sarabun New"/>
+                <w:b/>
+                <w:sz w:val="32"/>
+                <w:szCs w:val="32"/>
+              </w:rPr>
+              <w:t>หลักสูตรฝึกอบรม</w:t>
+            </w:r>
+          </w:p>
+        </w:tc>
+        <w:tc>
+          <w:tcPr>
+            <w:tcW w:type="dxa" w:w="1948"/>
+          </w:tcPr>
+          <w:p>
+            <w:pPr>
+              <w:spacing w:line="240" w:lineRule="auto"/>
+            </w:pPr>
+            <w:r/>
+            <w:r>
+              <w:rPr>
+                <w:rFonts w:ascii="TH Sarabun New" w:hAnsi="TH Sarabun New" w:cs="TH Sarabun New" w:eastAsia="TH Sarabun New"/>
+                <w:b/>
+                <w:sz w:val="32"/>
+                <w:szCs w:val="32"/>
+              </w:rPr>
+              <w:t>กลุ่มเป้าหมาย</w:t>
+            </w:r>
+          </w:p>
+        </w:tc>
+        <w:tc>
+          <w:tcPr>
+            <w:tcW w:type="dxa" w:w="1948"/>
+          </w:tcPr>
+          <w:p>
+            <w:pPr>
+              <w:spacing w:line="240" w:lineRule="auto"/>
+            </w:pPr>
+            <w:r/>
+            <w:r>
+              <w:rPr>
+                <w:rFonts w:ascii="TH Sarabun New" w:hAnsi="TH Sarabun New" w:cs="TH Sarabun New" w:eastAsia="TH Sarabun New"/>
+                <w:b/>
+                <w:sz w:val="32"/>
+                <w:szCs w:val="32"/>
+              </w:rPr>
+              <w:t>จำนวนผู้เข้าอบรม (คน)</w:t>
+            </w:r>
+          </w:p>
+        </w:tc>
+        <w:tc>
+          <w:tcPr>
+            <w:tcW w:type="dxa" w:w="1948"/>
+          </w:tcPr>
+          <w:p>
+            <w:pPr>
+              <w:spacing w:line="240" w:lineRule="auto"/>
+            </w:pPr>
+            <w:r/>
+            <w:r>
+              <w:rPr>
+                <w:rFonts w:ascii="TH Sarabun New" w:hAnsi="TH Sarabun New" w:cs="TH Sarabun New" w:eastAsia="TH Sarabun New"/>
+                <w:b/>
+                <w:sz w:val="32"/>
+                <w:szCs w:val="32"/>
+              </w:rPr>
+              <w:t>จำนวนรุ่น (รุ่น)</w:t>
+            </w:r>
+          </w:p>
+        </w:tc>
+        <w:tc>
+          <w:tcPr>
+            <w:tcW w:type="dxa" w:w="1948"/>
+          </w:tcPr>
+          <w:p>
+            <w:pPr>
+              <w:spacing w:line="240" w:lineRule="auto"/>
+            </w:pPr>
+            <w:r/>
+            <w:r>
+              <w:rPr>
+                <w:rFonts w:ascii="TH Sarabun New" w:hAnsi="TH Sarabun New" w:cs="TH Sarabun New" w:eastAsia="TH Sarabun New"/>
+                <w:b/>
+                <w:sz w:val="32"/>
+                <w:szCs w:val="32"/>
+              </w:rPr>
+              <w:t>สถานที่ฝึกอบรม</w:t>
+            </w:r>
+          </w:p>
+        </w:tc>
+      </w:tr>
+      <w:tr>
+        <w:tc>
+          <w:tcPr>
+            <w:tcW w:type="dxa" w:w="1948"/>
+          </w:tcPr>
+          <w:p>
+            <w:pPr>
+              <w:spacing w:line="240" w:lineRule="auto"/>
+            </w:pPr>
+            <w:r/>
+            <w:r>
+              <w:rPr>
+                <w:rFonts w:ascii="TH Sarabun New" w:hAnsi="TH Sarabun New" w:cs="TH Sarabun New" w:eastAsia="TH Sarabun New"/>
+                <w:b w:val="0"/>
+                <w:sz w:val="32"/>
+                <w:szCs w:val="32"/>
+              </w:rPr>
+              <w:t>หลักสูตรการบริหารจัดการและดูแลรักษาระบบสำหรับผู้ดูแลระบบ</w:t>
+            </w:r>
+          </w:p>
+        </w:tc>
+        <w:tc>
+          <w:tcPr>
+            <w:tcW w:type="dxa" w:w="1948"/>
+          </w:tcPr>
+          <w:p>
+            <w:pPr>
+              <w:spacing w:line="240" w:lineRule="auto"/>
+            </w:pPr>
+            <w:r/>
+            <w:r>
+              <w:rPr>
+                <w:rFonts w:ascii="TH Sarabun New" w:hAnsi="TH Sarabun New" w:cs="TH Sarabun New" w:eastAsia="TH Sarabun New"/>
+                <w:b w:val="0"/>
+                <w:sz w:val="32"/>
+                <w:szCs w:val="32"/>
+              </w:rPr>
+              <w:t>ผู้ดูแลระบบ</w:t>
+            </w:r>
+          </w:p>
+        </w:tc>
+        <w:tc>
+          <w:tcPr>
+            <w:tcW w:type="dxa" w:w="1948"/>
+          </w:tcPr>
+          <w:p>
+            <w:pPr>
+              <w:spacing w:line="240" w:lineRule="auto"/>
+            </w:pPr>
+            <w:r/>
+            <w:r>
+              <w:rPr>
+                <w:rFonts w:ascii="TH Sarabun New" w:hAnsi="TH Sarabun New" w:cs="TH Sarabun New" w:eastAsia="TH Sarabun New"/>
+                <w:b w:val="0"/>
+                <w:sz w:val="32"/>
+                <w:szCs w:val="32"/>
+              </w:rPr>
+              <w:t>๒๐</w:t>
+            </w:r>
+          </w:p>
+        </w:tc>
+        <w:tc>
+          <w:tcPr>
+            <w:tcW w:type="dxa" w:w="1948"/>
+          </w:tcPr>
+          <w:p>
+            <w:pPr>
+              <w:spacing w:line="240" w:lineRule="auto"/>
+            </w:pPr>
+            <w:r/>
+            <w:r>
+              <w:rPr>
+                <w:rFonts w:ascii="TH Sarabun New" w:hAnsi="TH Sarabun New" w:cs="TH Sarabun New" w:eastAsia="TH Sarabun New"/>
+                <w:b w:val="0"/>
+                <w:sz w:val="32"/>
+                <w:szCs w:val="32"/>
+              </w:rPr>
+              <w:t>๒</w:t>
+            </w:r>
+          </w:p>
+        </w:tc>
+        <w:tc>
+          <w:tcPr>
+            <w:tcW w:type="dxa" w:w="1948"/>
+          </w:tcPr>
+          <w:p>
+            <w:pPr>
+              <w:spacing w:line="240" w:lineRule="auto"/>
+            </w:pPr>
+            <w:r/>
+            <w:r>
+              <w:rPr>
+                <w:rFonts w:ascii="TH Sarabun New" w:hAnsi="TH Sarabun New" w:cs="TH Sarabun New" w:eastAsia="TH Sarabun New"/>
+                <w:b w:val="0"/>
+                <w:sz w:val="32"/>
+                <w:szCs w:val="32"/>
+              </w:rPr>
+              <w:t>กรมบัญชีกลาง</w:t>
+            </w:r>
+          </w:p>
+        </w:tc>
+      </w:tr>
+      <w:tr>
+        <w:tc>
+          <w:tcPr>
+            <w:tcW w:type="dxa" w:w="1948"/>
+          </w:tcPr>
+          <w:p>
+            <w:pPr>
+              <w:spacing w:line="240" w:lineRule="auto"/>
+            </w:pPr>
+            <w:r/>
+            <w:r>
+              <w:rPr>
+                <w:rFonts w:ascii="TH Sarabun New" w:hAnsi="TH Sarabun New" w:cs="TH Sarabun New" w:eastAsia="TH Sarabun New"/>
+                <w:b w:val="0"/>
+                <w:sz w:val="32"/>
+                <w:szCs w:val="32"/>
+              </w:rPr>
+              <w:t>หลักสูตรการใช้งานระบบงานสำหรับผู้ใช้งานทั่วไป</w:t>
+            </w:r>
+          </w:p>
+        </w:tc>
+        <w:tc>
+          <w:tcPr>
+            <w:tcW w:type="dxa" w:w="1948"/>
+          </w:tcPr>
+          <w:p>
+            <w:pPr>
+              <w:spacing w:line="240" w:lineRule="auto"/>
+            </w:pPr>
+            <w:r/>
+            <w:r>
+              <w:rPr>
+                <w:rFonts w:ascii="TH Sarabun New" w:hAnsi="TH Sarabun New" w:cs="TH Sarabun New" w:eastAsia="TH Sarabun New"/>
+                <w:b w:val="0"/>
+                <w:sz w:val="32"/>
+                <w:szCs w:val="32"/>
+              </w:rPr>
+              <w:t>ผู้ใช้งาน</w:t>
+            </w:r>
+          </w:p>
+        </w:tc>
+        <w:tc>
+          <w:tcPr>
+            <w:tcW w:type="dxa" w:w="1948"/>
+          </w:tcPr>
+          <w:p>
+            <w:pPr>
+              <w:spacing w:line="240" w:lineRule="auto"/>
+            </w:pPr>
+            <w:r/>
+            <w:r>
+              <w:rPr>
+                <w:rFonts w:ascii="TH Sarabun New" w:hAnsi="TH Sarabun New" w:cs="TH Sarabun New" w:eastAsia="TH Sarabun New"/>
+                <w:b w:val="0"/>
+                <w:sz w:val="32"/>
+                <w:szCs w:val="32"/>
+              </w:rPr>
+              <w:t>๘๐</w:t>
+            </w:r>
+          </w:p>
+        </w:tc>
+        <w:tc>
+          <w:tcPr>
+            <w:tcW w:type="dxa" w:w="1948"/>
+          </w:tcPr>
+          <w:p>
+            <w:pPr>
+              <w:spacing w:line="240" w:lineRule="auto"/>
+            </w:pPr>
+            <w:r/>
+            <w:r>
+              <w:rPr>
+                <w:rFonts w:ascii="TH Sarabun New" w:hAnsi="TH Sarabun New" w:cs="TH Sarabun New" w:eastAsia="TH Sarabun New"/>
+                <w:b w:val="0"/>
+                <w:sz w:val="32"/>
+                <w:szCs w:val="32"/>
+              </w:rPr>
+              <w:t>๒</w:t>
+            </w:r>
+          </w:p>
+        </w:tc>
+        <w:tc>
+          <w:tcPr>
+            <w:tcW w:type="dxa" w:w="1948"/>
+          </w:tcPr>
+          <w:p>
+            <w:pPr>
+              <w:spacing w:line="240" w:lineRule="auto"/>
+            </w:pPr>
+            <w:r/>
+            <w:r>
+              <w:rPr>
+                <w:rFonts w:ascii="TH Sarabun New" w:hAnsi="TH Sarabun New" w:cs="TH Sarabun New" w:eastAsia="TH Sarabun New"/>
+                <w:b w:val="0"/>
+                <w:sz w:val="32"/>
+                <w:szCs w:val="32"/>
+              </w:rPr>
+              <w:t>กรมบัญชีกลาง</w:t>
+            </w:r>
+          </w:p>
+        </w:tc>
+      </w:tr>
+    </w:tbl>
     <w:p>
       <w:pPr>
         <w:spacing w:line="240" w:lineRule="auto"/>
@@ -2941,487 +1610,7 @@
           <w:sz w:val="32"/>
           <w:szCs w:val="32"/>
         </w:rPr>
-        <w:t>บุคลากรประจำโครงการประกอบด้วยตำแหน่งและจำนวนคน ดังนี้</w:t>
-      </w:r>
-    </w:p>
-    <w:tbl>
-      <w:tblPr>
-        <w:tblStyle w:val="TableGrid"/>
-        <w:tblW w:type="auto" w:w="0"/>
-        <w:tblLook w:firstColumn="1" w:firstRow="1" w:lastColumn="0" w:lastRow="0" w:noHBand="0" w:noVBand="1" w:val="04A0"/>
-      </w:tblPr>
-      <w:tblGrid>
-        <w:gridCol w:w="2435"/>
-        <w:gridCol w:w="2435"/>
-        <w:gridCol w:w="2435"/>
-        <w:gridCol w:w="2435"/>
-      </w:tblGrid>
-      <w:tr>
-        <w:tc>
-          <w:tcPr>
-            <w:tcW w:type="dxa" w:w="2435"/>
-          </w:tcPr>
-          <w:p>
-            <w:pPr>
-              <w:spacing w:line="240" w:lineRule="auto"/>
-            </w:pPr>
-            <w:r/>
-            <w:r>
-              <w:rPr>
-                <w:rFonts w:ascii="TH Sarabun New" w:hAnsi="TH Sarabun New" w:cs="TH Sarabun New" w:eastAsia="TH Sarabun New"/>
-                <w:b/>
-                <w:sz w:val="32"/>
-                <w:szCs w:val="32"/>
-              </w:rPr>
-              <w:t>ตำแหน่ง</w:t>
-            </w:r>
-          </w:p>
-        </w:tc>
-        <w:tc>
-          <w:tcPr>
-            <w:tcW w:type="dxa" w:w="2435"/>
-          </w:tcPr>
-          <w:p>
-            <w:pPr>
-              <w:spacing w:line="240" w:lineRule="auto"/>
-            </w:pPr>
-            <w:r/>
-            <w:r>
-              <w:rPr>
-                <w:rFonts w:ascii="TH Sarabun New" w:hAnsi="TH Sarabun New" w:cs="TH Sarabun New" w:eastAsia="TH Sarabun New"/>
-                <w:b/>
-                <w:sz w:val="32"/>
-                <w:szCs w:val="32"/>
-              </w:rPr>
-              <w:t>จำนวน</w:t>
-            </w:r>
-          </w:p>
-        </w:tc>
-        <w:tc>
-          <w:tcPr>
-            <w:tcW w:type="dxa" w:w="2435"/>
-          </w:tcPr>
-          <w:p>
-            <w:pPr>
-              <w:spacing w:line="240" w:lineRule="auto"/>
-            </w:pPr>
-            <w:r/>
-            <w:r>
-              <w:rPr>
-                <w:rFonts w:ascii="TH Sarabun New" w:hAnsi="TH Sarabun New" w:cs="TH Sarabun New" w:eastAsia="TH Sarabun New"/>
-                <w:b/>
-                <w:sz w:val="32"/>
-                <w:szCs w:val="32"/>
-              </w:rPr>
-              <w:t>ระยะเวลาปฏิบัติงาน</w:t>
-            </w:r>
-          </w:p>
-        </w:tc>
-        <w:tc>
-          <w:tcPr>
-            <w:tcW w:type="dxa" w:w="2435"/>
-          </w:tcPr>
-          <w:p>
-            <w:pPr>
-              <w:spacing w:line="240" w:lineRule="auto"/>
-            </w:pPr>
-            <w:r/>
-            <w:r>
-              <w:rPr>
-                <w:rFonts w:ascii="TH Sarabun New" w:hAnsi="TH Sarabun New" w:cs="TH Sarabun New" w:eastAsia="TH Sarabun New"/>
-                <w:b/>
-                <w:sz w:val="32"/>
-                <w:szCs w:val="32"/>
-              </w:rPr>
-              <w:t>คุณสมบัติ/ประสบการณ์ขั้นต่ำ</w:t>
-            </w:r>
-          </w:p>
-        </w:tc>
-      </w:tr>
-      <w:tr>
-        <w:tc>
-          <w:tcPr>
-            <w:tcW w:type="dxa" w:w="2435"/>
-          </w:tcPr>
-          <w:p>
-            <w:pPr>
-              <w:spacing w:line="240" w:lineRule="auto"/>
-            </w:pPr>
-            <w:r/>
-            <w:r>
-              <w:rPr>
-                <w:rFonts w:ascii="TH Sarabun New" w:hAnsi="TH Sarabun New" w:cs="TH Sarabun New" w:eastAsia="TH Sarabun New"/>
-                <w:b w:val="0"/>
-                <w:sz w:val="32"/>
-                <w:szCs w:val="32"/>
-              </w:rPr>
-              <w:t>ผู้จัดการโครงการ</w:t>
-            </w:r>
-          </w:p>
-        </w:tc>
-        <w:tc>
-          <w:tcPr>
-            <w:tcW w:type="dxa" w:w="2435"/>
-          </w:tcPr>
-          <w:p>
-            <w:pPr>
-              <w:spacing w:line="240" w:lineRule="auto"/>
-            </w:pPr>
-            <w:r/>
-            <w:r>
-              <w:rPr>
-                <w:rFonts w:ascii="TH Sarabun New" w:hAnsi="TH Sarabun New" w:cs="TH Sarabun New" w:eastAsia="TH Sarabun New"/>
-                <w:b w:val="0"/>
-                <w:sz w:val="32"/>
-                <w:szCs w:val="32"/>
-              </w:rPr>
-              <w:t>๑</w:t>
-            </w:r>
-          </w:p>
-        </w:tc>
-        <w:tc>
-          <w:tcPr>
-            <w:tcW w:type="dxa" w:w="2435"/>
-          </w:tcPr>
-          <w:p>
-            <w:pPr>
-              <w:spacing w:line="240" w:lineRule="auto"/>
-            </w:pPr>
-            <w:r/>
-            <w:r>
-              <w:rPr>
-                <w:rFonts w:ascii="TH Sarabun New" w:hAnsi="TH Sarabun New" w:cs="TH Sarabun New" w:eastAsia="TH Sarabun New"/>
-                <w:b w:val="0"/>
-                <w:sz w:val="32"/>
-                <w:szCs w:val="32"/>
-              </w:rPr>
-              <w:t>ตลอดระยะเวลาโครงการ (ประมาณ ๑๘๐ วัน)</w:t>
-            </w:r>
-          </w:p>
-        </w:tc>
-        <w:tc>
-          <w:tcPr>
-            <w:tcW w:type="dxa" w:w="2435"/>
-          </w:tcPr>
-          <w:p>
-            <w:pPr>
-              <w:spacing w:line="240" w:lineRule="auto"/>
-            </w:pPr>
-            <w:r/>
-            <w:r>
-              <w:rPr>
-                <w:rFonts w:ascii="TH Sarabun New" w:hAnsi="TH Sarabun New" w:cs="TH Sarabun New" w:eastAsia="TH Sarabun New"/>
-                <w:b w:val="0"/>
-                <w:sz w:val="32"/>
-                <w:szCs w:val="32"/>
-              </w:rPr>
-              <w:t>มีความรู้และประสบการณ์ในการบริหารโครงการพัฒนาระบบสารสนเทศที่เกี่ยวข้อง</w:t>
-            </w:r>
-          </w:p>
-        </w:tc>
-      </w:tr>
-      <w:tr>
-        <w:tc>
-          <w:tcPr>
-            <w:tcW w:type="dxa" w:w="2435"/>
-          </w:tcPr>
-          <w:p>
-            <w:pPr>
-              <w:spacing w:line="240" w:lineRule="auto"/>
-            </w:pPr>
-            <w:r/>
-            <w:r>
-              <w:rPr>
-                <w:rFonts w:ascii="TH Sarabun New" w:hAnsi="TH Sarabun New" w:cs="TH Sarabun New" w:eastAsia="TH Sarabun New"/>
-                <w:b w:val="0"/>
-                <w:sz w:val="32"/>
-                <w:szCs w:val="32"/>
-              </w:rPr>
-              <w:t>นักวิเคราะห์ระบบ</w:t>
-            </w:r>
-          </w:p>
-        </w:tc>
-        <w:tc>
-          <w:tcPr>
-            <w:tcW w:type="dxa" w:w="2435"/>
-          </w:tcPr>
-          <w:p>
-            <w:pPr>
-              <w:spacing w:line="240" w:lineRule="auto"/>
-            </w:pPr>
-            <w:r/>
-            <w:r>
-              <w:rPr>
-                <w:rFonts w:ascii="TH Sarabun New" w:hAnsi="TH Sarabun New" w:cs="TH Sarabun New" w:eastAsia="TH Sarabun New"/>
-                <w:b w:val="0"/>
-                <w:sz w:val="32"/>
-                <w:szCs w:val="32"/>
-              </w:rPr>
-              <w:t>๑</w:t>
-            </w:r>
-          </w:p>
-        </w:tc>
-        <w:tc>
-          <w:tcPr>
-            <w:tcW w:type="dxa" w:w="2435"/>
-          </w:tcPr>
-          <w:p>
-            <w:pPr>
-              <w:spacing w:line="240" w:lineRule="auto"/>
-            </w:pPr>
-            <w:r/>
-            <w:r>
-              <w:rPr>
-                <w:rFonts w:ascii="TH Sarabun New" w:hAnsi="TH Sarabun New" w:cs="TH Sarabun New" w:eastAsia="TH Sarabun New"/>
-                <w:b w:val="0"/>
-                <w:sz w:val="32"/>
-                <w:szCs w:val="32"/>
-              </w:rPr>
-              <w:t>ตลอดระยะเวลาโครงการ (ประมาณ ๑๘๐ วัน)</w:t>
-            </w:r>
-          </w:p>
-        </w:tc>
-        <w:tc>
-          <w:tcPr>
-            <w:tcW w:type="dxa" w:w="2435"/>
-          </w:tcPr>
-          <w:p>
-            <w:pPr>
-              <w:spacing w:line="240" w:lineRule="auto"/>
-            </w:pPr>
-            <w:r/>
-            <w:r>
-              <w:rPr>
-                <w:rFonts w:ascii="TH Sarabun New" w:hAnsi="TH Sarabun New" w:cs="TH Sarabun New" w:eastAsia="TH Sarabun New"/>
-                <w:b w:val="0"/>
-                <w:sz w:val="32"/>
-                <w:szCs w:val="32"/>
-              </w:rPr>
-              <w:t>สามารถวิเคราะห์ความต้องการของหน่วยงาน และจัดทำเอกสารข้อกำหนดได้อย่างถูกต้องตามหลักการ</w:t>
-            </w:r>
-          </w:p>
-        </w:tc>
-      </w:tr>
-      <w:tr>
-        <w:tc>
-          <w:tcPr>
-            <w:tcW w:type="dxa" w:w="2435"/>
-          </w:tcPr>
-          <w:p>
-            <w:pPr>
-              <w:spacing w:line="240" w:lineRule="auto"/>
-            </w:pPr>
-            <w:r/>
-            <w:r>
-              <w:rPr>
-                <w:rFonts w:ascii="TH Sarabun New" w:hAnsi="TH Sarabun New" w:cs="TH Sarabun New" w:eastAsia="TH Sarabun New"/>
-                <w:b w:val="0"/>
-                <w:sz w:val="32"/>
-                <w:szCs w:val="32"/>
-              </w:rPr>
-              <w:t>นักพัฒนา</w:t>
-            </w:r>
-          </w:p>
-        </w:tc>
-        <w:tc>
-          <w:tcPr>
-            <w:tcW w:type="dxa" w:w="2435"/>
-          </w:tcPr>
-          <w:p>
-            <w:pPr>
-              <w:spacing w:line="240" w:lineRule="auto"/>
-            </w:pPr>
-            <w:r/>
-            <w:r>
-              <w:rPr>
-                <w:rFonts w:ascii="TH Sarabun New" w:hAnsi="TH Sarabun New" w:cs="TH Sarabun New" w:eastAsia="TH Sarabun New"/>
-                <w:b w:val="0"/>
-                <w:sz w:val="32"/>
-                <w:szCs w:val="32"/>
-              </w:rPr>
-              <w:t>๒</w:t>
-            </w:r>
-          </w:p>
-        </w:tc>
-        <w:tc>
-          <w:tcPr>
-            <w:tcW w:type="dxa" w:w="2435"/>
-          </w:tcPr>
-          <w:p>
-            <w:pPr>
-              <w:spacing w:line="240" w:lineRule="auto"/>
-            </w:pPr>
-            <w:r/>
-            <w:r>
-              <w:rPr>
-                <w:rFonts w:ascii="TH Sarabun New" w:hAnsi="TH Sarabun New" w:cs="TH Sarabun New" w:eastAsia="TH Sarabun New"/>
-                <w:b w:val="0"/>
-                <w:sz w:val="32"/>
-                <w:szCs w:val="32"/>
-              </w:rPr>
-              <w:t>ตลอดระยะเวลาโครงการ (ประมาณ ๑๘๐ วัน)</w:t>
-            </w:r>
-          </w:p>
-        </w:tc>
-        <w:tc>
-          <w:tcPr>
-            <w:tcW w:type="dxa" w:w="2435"/>
-          </w:tcPr>
-          <w:p>
-            <w:pPr>
-              <w:spacing w:line="240" w:lineRule="auto"/>
-            </w:pPr>
-            <w:r/>
-            <w:r>
-              <w:rPr>
-                <w:rFonts w:ascii="TH Sarabun New" w:hAnsi="TH Sarabun New" w:cs="TH Sarabun New" w:eastAsia="TH Sarabun New"/>
-                <w:b w:val="0"/>
-                <w:sz w:val="32"/>
-                <w:szCs w:val="32"/>
-              </w:rPr>
-              <w:t>มีทักษะในการพัฒนาระบบด้วยภาษาโปรแกรมที่ใช้ในโครงการ และสามารถปรับปรุงซอฟต์แวร์ได้</w:t>
-            </w:r>
-          </w:p>
-        </w:tc>
-      </w:tr>
-      <w:tr>
-        <w:tc>
-          <w:tcPr>
-            <w:tcW w:type="dxa" w:w="2435"/>
-          </w:tcPr>
-          <w:p>
-            <w:pPr>
-              <w:spacing w:line="240" w:lineRule="auto"/>
-            </w:pPr>
-            <w:r/>
-            <w:r>
-              <w:rPr>
-                <w:rFonts w:ascii="TH Sarabun New" w:hAnsi="TH Sarabun New" w:cs="TH Sarabun New" w:eastAsia="TH Sarabun New"/>
-                <w:b w:val="0"/>
-                <w:sz w:val="32"/>
-                <w:szCs w:val="32"/>
-              </w:rPr>
-              <w:t>ผู้ทดสอบระบบ</w:t>
-            </w:r>
-          </w:p>
-        </w:tc>
-        <w:tc>
-          <w:tcPr>
-            <w:tcW w:type="dxa" w:w="2435"/>
-          </w:tcPr>
-          <w:p>
-            <w:pPr>
-              <w:spacing w:line="240" w:lineRule="auto"/>
-            </w:pPr>
-            <w:r/>
-            <w:r>
-              <w:rPr>
-                <w:rFonts w:ascii="TH Sarabun New" w:hAnsi="TH Sarabun New" w:cs="TH Sarabun New" w:eastAsia="TH Sarabun New"/>
-                <w:b w:val="0"/>
-                <w:sz w:val="32"/>
-                <w:szCs w:val="32"/>
-              </w:rPr>
-              <w:t>๑</w:t>
-            </w:r>
-          </w:p>
-        </w:tc>
-        <w:tc>
-          <w:tcPr>
-            <w:tcW w:type="dxa" w:w="2435"/>
-          </w:tcPr>
-          <w:p>
-            <w:pPr>
-              <w:spacing w:line="240" w:lineRule="auto"/>
-            </w:pPr>
-            <w:r/>
-            <w:r>
-              <w:rPr>
-                <w:rFonts w:ascii="TH Sarabun New" w:hAnsi="TH Sarabun New" w:cs="TH Sarabun New" w:eastAsia="TH Sarabun New"/>
-                <w:b w:val="0"/>
-                <w:sz w:val="32"/>
-                <w:szCs w:val="32"/>
-              </w:rPr>
-              <w:t>ตลอดระยะเวลาโครงการ (ประมาณ ๑๘๐ วัน)</w:t>
-            </w:r>
-          </w:p>
-        </w:tc>
-        <w:tc>
-          <w:tcPr>
-            <w:tcW w:type="dxa" w:w="2435"/>
-          </w:tcPr>
-          <w:p>
-            <w:pPr>
-              <w:spacing w:line="240" w:lineRule="auto"/>
-            </w:pPr>
-            <w:r/>
-            <w:r>
-              <w:rPr>
-                <w:rFonts w:ascii="TH Sarabun New" w:hAnsi="TH Sarabun New" w:cs="TH Sarabun New" w:eastAsia="TH Sarabun New"/>
-                <w:b w:val="0"/>
-                <w:sz w:val="32"/>
-                <w:szCs w:val="32"/>
-              </w:rPr>
-              <w:t>สามารถดำเนินการทดสอบการทำงานของระบบได้อย่างครอบคลุมและเป็นไปตามแผนที่กำหนด</w:t>
-            </w:r>
-          </w:p>
-        </w:tc>
-      </w:tr>
-    </w:tbl>
-    <w:p>
-      <w:pPr>
-        <w:spacing w:line="240" w:lineRule="auto"/>
-        <w:ind w:left="850"/>
-      </w:pPr>
-      <w:r>
-        <w:rPr>
-          <w:rFonts w:ascii="TH Sarabun New" w:hAnsi="TH Sarabun New" w:cs="TH Sarabun New" w:eastAsia="TH Sarabun New"/>
-          <w:sz w:val="32"/>
-          <w:szCs w:val="32"/>
-        </w:rPr>
-        <w:t>ผู้ยื่นข้อเสนอจะต้องจัดส่งแบบฟอร์มประวัติบุคลากรของผู้ปฏิบัติงานทุกตำแหน่งเพื่อประกอบการพิจารณาด้วย</w:t>
-      </w:r>
-    </w:p>
-    <w:p>
-      <w:pPr>
-        <w:spacing w:line="240" w:lineRule="auto"/>
-        <w:ind w:left="567"/>
-      </w:pPr>
-      <w:r>
-        <w:rPr>
-          <w:rFonts w:ascii="TH Sarabun New" w:hAnsi="TH Sarabun New" w:cs="TH Sarabun New" w:eastAsia="TH Sarabun New"/>
-          <w:b/>
-          <w:sz w:val="32"/>
-          <w:szCs w:val="32"/>
-        </w:rPr>
-        <w:t>การบำรุงรักษาและระดับการให้บริการระหว่างรับประกัน</w:t>
-      </w:r>
-    </w:p>
-    <w:p>
-      <w:pPr>
-        <w:spacing w:line="240" w:lineRule="auto"/>
-        <w:ind w:left="850"/>
-      </w:pPr>
-      <w:r>
-        <w:rPr>
-          <w:rFonts w:ascii="TH Sarabun New" w:hAnsi="TH Sarabun New" w:cs="TH Sarabun New" w:eastAsia="TH Sarabun New"/>
-          <w:sz w:val="32"/>
-          <w:szCs w:val="32"/>
-        </w:rPr>
-        <w:t>การบำรุงรักษาและระดับการให้บริการระหว่างรับประกัน</w:t>
-      </w:r>
-    </w:p>
-    <w:p>
-      <w:pPr>
-        <w:spacing w:line="240" w:lineRule="auto"/>
-        <w:ind w:left="850"/>
-      </w:pPr>
-      <w:r>
-        <w:rPr>
-          <w:rFonts w:ascii="TH Sarabun New" w:hAnsi="TH Sarabun New" w:cs="TH Sarabun New" w:eastAsia="TH Sarabun New"/>
-          <w:sz w:val="32"/>
-          <w:szCs w:val="32"/>
-        </w:rPr>
-        <w:t>ระยะเวลาการรับประกัน คือ ๑ ปี นับถัดจากวันลงนามในสัญญา โดยผู้รับจ้างจะต้องดำเนินการให้เป็นไปตามมาตรฐานบริการดังนี้</w:t>
+        <w:t>ผู้รับจ้างต้องจัดหาบุคลากรที่มีความรู้ความสามารถและความเชี่ยวชาญเหมาะสมกับลักษณะงาน เพื่อปฏิบัติงานในโครงการตลอดระยะเวลาการดำเนินโครงการ โดยมีรายละเอียดตำแหน่ง จำนวนคน และคุณสมบัติขั้นต่ำ ดังนี้</w:t>
       </w:r>
     </w:p>
     <w:tbl>
@@ -3452,7 +1641,7 @@
                 <w:sz w:val="32"/>
                 <w:szCs w:val="32"/>
               </w:rPr>
-              <w:t>รายการ</w:t>
+              <w:t>ตำแหน่ง</w:t>
             </w:r>
           </w:p>
         </w:tc>
@@ -3472,7 +1661,7 @@
                 <w:sz w:val="32"/>
                 <w:szCs w:val="32"/>
               </w:rPr>
-              <w:t>เกณฑ์ที่กำหนด</w:t>
+              <w:t>จำนวน</w:t>
             </w:r>
           </w:p>
         </w:tc>
@@ -3492,7 +1681,7 @@
                 <w:sz w:val="32"/>
                 <w:szCs w:val="32"/>
               </w:rPr>
-              <w:t>หน่วย</w:t>
+              <w:t>คุณวุฒิและประสบการณ์ขั้นต่ำ</w:t>
             </w:r>
           </w:p>
         </w:tc>
@@ -3514,7 +1703,7 @@
                 <w:sz w:val="32"/>
                 <w:szCs w:val="32"/>
               </w:rPr>
-              <w:t>เวลาตอบสนองต่อปัญหาทางเทคนิค</w:t>
+              <w:t>ผู้จัดการโครงการ</w:t>
             </w:r>
           </w:p>
         </w:tc>
@@ -3534,7 +1723,7 @@
                 <w:sz w:val="32"/>
                 <w:szCs w:val="32"/>
               </w:rPr>
-              <w:t>ไม่เกิน ๔ ชั่วโมง (นับตั้งแต่ได้รับแจ้ง)</w:t>
+              <w:t>๑</w:t>
             </w:r>
           </w:p>
         </w:tc>
@@ -3554,7 +1743,7 @@
                 <w:sz w:val="32"/>
                 <w:szCs w:val="32"/>
               </w:rPr>
-              <w:t>ชั่วโมง</w:t>
+              <w:t>วุฒิการศึกษาระดับปริญญาตรีขึ้นไป สาขาวิชาเทคโนโลยีสารสนเทศ วิทยาการคอมพิวเตอร์ หรือสาขาที่เกี่ยวข้อง มีประสบการณ์ในการบริหารจัดการโครงการด้านเทคโนโลยีสารสนเทศไม่น้อยกว่า ๕ ปี</w:t>
             </w:r>
           </w:p>
         </w:tc>
@@ -3576,7 +1765,7 @@
                 <w:sz w:val="32"/>
                 <w:szCs w:val="32"/>
               </w:rPr>
-              <w:t>เวลาแก้ไขให้แล้วเสร็จของระบบงาน</w:t>
+              <w:t>นักวิเคราะห์ระบบ</w:t>
             </w:r>
           </w:p>
         </w:tc>
@@ -3596,7 +1785,7 @@
                 <w:sz w:val="32"/>
                 <w:szCs w:val="32"/>
               </w:rPr>
-              <w:t>ไม่เกิน ๒๔ ชั่วโมง (นับตั้งแต่เริ่มดำเนินการ)</w:t>
+              <w:t>๑</w:t>
             </w:r>
           </w:p>
         </w:tc>
@@ -3616,7 +1805,7 @@
                 <w:sz w:val="32"/>
                 <w:szCs w:val="32"/>
               </w:rPr>
-              <w:t>ชั่วโมง</w:t>
+              <w:t>วุฒิการศึกษาระดับปริญญาตรีขึ้นไป สาขาวิชาเทคโนโลยีสารสนเทศ วิทยาการคอมพิวเตอร์ หรือสาขาที่เกี่ยวข้อง มีประสบการณ์ในการวิเคราะห์และออกแบบระบบงานไม่น้อยกว่า ๓ ปี</w:t>
             </w:r>
           </w:p>
         </w:tc>
@@ -3638,7 +1827,7 @@
                 <w:sz w:val="32"/>
                 <w:szCs w:val="32"/>
               </w:rPr>
-              <w:t>ความพร้อมใช้งานของระบบโดยรวม</w:t>
+              <w:t>นักพัฒนาโปรแกรม</w:t>
             </w:r>
           </w:p>
         </w:tc>
@@ -3658,7 +1847,7 @@
                 <w:sz w:val="32"/>
                 <w:szCs w:val="32"/>
               </w:rPr>
-              <w:t>ไม่ต่ำกว่าร้อยละ ๙๙.๕</w:t>
+              <w:t>๒</w:t>
             </w:r>
           </w:p>
         </w:tc>
@@ -3678,12 +1867,159 @@
                 <w:sz w:val="32"/>
                 <w:szCs w:val="32"/>
               </w:rPr>
-              <w:t>ร้อยละ</w:t>
+              <w:t>วุฒิการศึกษาระดับปริญญาตรีขึ้นไป สาขาวิชาเทคโนโลยีสารสนเทศ วิทยาการคอมพิวเตอร์ หรือสาขาที่เกี่ยวข้อง มีประสบการณ์ในการพัฒนาซอฟต์แวร์ไม่น้อยกว่า ๓ ปี</w:t>
+            </w:r>
+          </w:p>
+        </w:tc>
+      </w:tr>
+      <w:tr>
+        <w:tc>
+          <w:tcPr>
+            <w:tcW w:type="dxa" w:w="3247"/>
+          </w:tcPr>
+          <w:p>
+            <w:pPr>
+              <w:spacing w:line="240" w:lineRule="auto"/>
+            </w:pPr>
+            <w:r/>
+            <w:r>
+              <w:rPr>
+                <w:rFonts w:ascii="TH Sarabun New" w:hAnsi="TH Sarabun New" w:cs="TH Sarabun New" w:eastAsia="TH Sarabun New"/>
+                <w:b w:val="0"/>
+                <w:sz w:val="32"/>
+                <w:szCs w:val="32"/>
+              </w:rPr>
+              <w:t>นักทดสอบระบบ</w:t>
+            </w:r>
+          </w:p>
+        </w:tc>
+        <w:tc>
+          <w:tcPr>
+            <w:tcW w:type="dxa" w:w="3247"/>
+          </w:tcPr>
+          <w:p>
+            <w:pPr>
+              <w:spacing w:line="240" w:lineRule="auto"/>
+            </w:pPr>
+            <w:r/>
+            <w:r>
+              <w:rPr>
+                <w:rFonts w:ascii="TH Sarabun New" w:hAnsi="TH Sarabun New" w:cs="TH Sarabun New" w:eastAsia="TH Sarabun New"/>
+                <w:b w:val="0"/>
+                <w:sz w:val="32"/>
+                <w:szCs w:val="32"/>
+              </w:rPr>
+              <w:t>๑</w:t>
+            </w:r>
+          </w:p>
+        </w:tc>
+        <w:tc>
+          <w:tcPr>
+            <w:tcW w:type="dxa" w:w="3247"/>
+          </w:tcPr>
+          <w:p>
+            <w:pPr>
+              <w:spacing w:line="240" w:lineRule="auto"/>
+            </w:pPr>
+            <w:r/>
+            <w:r>
+              <w:rPr>
+                <w:rFonts w:ascii="TH Sarabun New" w:hAnsi="TH Sarabun New" w:cs="TH Sarabun New" w:eastAsia="TH Sarabun New"/>
+                <w:b w:val="0"/>
+                <w:sz w:val="32"/>
+                <w:szCs w:val="32"/>
+              </w:rPr>
+              <w:t>วุฒิการศึกษาระดับปริญญาตรีขึ้นไป สาขาวิชาเทคโนโลยีสารสนเทศ วิทยาการคอมพิวเตอร์ หรือสาขาที่เกี่ยวข้อง มีประสบการณ์ในการทดสอบและตรวจสอบคุณภาพระบบงานไม่น้อยกว่า ๓ ปี</w:t>
             </w:r>
           </w:p>
         </w:tc>
       </w:tr>
     </w:tbl>
+    <w:p>
+      <w:pPr>
+        <w:spacing w:line="240" w:lineRule="auto"/>
+        <w:ind w:left="850"/>
+      </w:pPr>
+      <w:r>
+        <w:rPr>
+          <w:rFonts w:ascii="TH Sarabun New" w:hAnsi="TH Sarabun New" w:cs="TH Sarabun New" w:eastAsia="TH Sarabun New"/>
+          <w:sz w:val="32"/>
+          <w:szCs w:val="32"/>
+        </w:rPr>
+        <w:t>ผู้รับจ้างต้องจัดส่งรายชื่อและประวัติการทำงานของบุคลากรในแต่ละตำแหน่ง พร้อมเอกสารหลักฐานแสดงวุฒิการศึกษาและประสบการณ์ทำงาน ให้ผู้ว่าจ้างตรวจสอบและให้ความเห็นชอบก่อนเริ่มดำเนินการโครงการ และในกรณีที่บุคลากรประจำโครงการไม่สามารถปฏิบัติงานได้ ผู้รับจ้างต้องจัดหาบุคลากรที่มีคุณสมบัติเทียบเท่าหรือดีกว่ามาทดแทนโดยไม่ให้มีผลกระทบต่อการดำเนินงานตามสัญญา</w:t>
+      </w:r>
+    </w:p>
+    <w:p>
+      <w:pPr>
+        <w:spacing w:line="240" w:lineRule="auto"/>
+        <w:ind w:left="567"/>
+      </w:pPr>
+      <w:r>
+        <w:rPr>
+          <w:rFonts w:ascii="TH Sarabun New" w:hAnsi="TH Sarabun New" w:cs="TH Sarabun New" w:eastAsia="TH Sarabun New"/>
+          <w:b/>
+          <w:sz w:val="32"/>
+          <w:szCs w:val="32"/>
+        </w:rPr>
+        <w:t>การบำรุงรักษาและระดับการให้บริการระหว่างรับประกัน</w:t>
+      </w:r>
+    </w:p>
+    <w:p>
+      <w:pPr>
+        <w:spacing w:line="240" w:lineRule="auto"/>
+        <w:ind w:left="850"/>
+      </w:pPr>
+      <w:r>
+        <w:rPr>
+          <w:rFonts w:ascii="TH Sarabun New" w:hAnsi="TH Sarabun New" w:cs="TH Sarabun New" w:eastAsia="TH Sarabun New"/>
+          <w:sz w:val="32"/>
+          <w:szCs w:val="32"/>
+        </w:rPr>
+        <w:t>ผู้รับจ้างจะต้องดำเนินการบำรุงรักษาระบบงานและให้ระดับการให้บริการระหว่างระยะเวลารับประกันความชำรุดบกพร่องเป็นเวลาหนึ่งปี นับถัดจากวันลงนามในสัญญา หรือวันที่ผู้ว่าจ้างได้รับมอบงานทั้งหมดโดยถูกต้องครบถ้วน โดยมีรายละเอียดและเกณฑ์การให้บริการดังนี้</w:t>
+      </w:r>
+    </w:p>
+    <w:p>
+      <w:pPr>
+        <w:spacing w:line="240" w:lineRule="auto"/>
+        <w:ind w:left="850"/>
+      </w:pPr>
+      <w:r>
+        <w:rPr>
+          <w:rFonts w:ascii="TH Sarabun New" w:hAnsi="TH Sarabun New" w:cs="TH Sarabun New" w:eastAsia="TH Sarabun New"/>
+          <w:sz w:val="32"/>
+          <w:szCs w:val="32"/>
+        </w:rPr>
+        <w:t>เวลาในการตอบสนองและเข้าดำเนินการแก้ไข เมื่อได้รับแจ้งเหตุขัดข้องจากผู้ว่าจ้าง ผู้รับจ้างต้องดำเนินการตอบสนองและเข้าดำเนินการแก้ไขภายในเวลาไม่เกินสี่ชั่วโมง และต้องดำเนินการแก้ไขระบบให้สามารถกลับมาใช้งานได้ตามปกติภายในเวลาไม่เกินยี่สิบสี่ชั่วโมงนับแต่ได้รับแจ้ง</w:t>
+      </w:r>
+    </w:p>
+    <w:p>
+      <w:pPr>
+        <w:spacing w:line="240" w:lineRule="auto"/>
+        <w:ind w:left="850"/>
+      </w:pPr>
+      <w:r>
+        <w:rPr>
+          <w:rFonts w:ascii="TH Sarabun New" w:hAnsi="TH Sarabun New" w:cs="TH Sarabun New" w:eastAsia="TH Sarabun New"/>
+          <w:sz w:val="32"/>
+          <w:szCs w:val="32"/>
+        </w:rPr>
+        <w:t>ระดับความพร้อมใช้งานของระบบ ผู้รับจ้างต้องดูแลรักษาระบบให้มีความพร้อมในการใช้งานตลอดระยะเวลารับประกัน โดยยอมให้ระบบขัดข้องหรือหยุดชะงักรวมกันไม่เกินร้อยละเก้าטิพจุดห้าของเวลาทั้งหมดในแต่ละเดือน</w:t>
+      </w:r>
+    </w:p>
+    <w:p>
+      <w:pPr>
+        <w:spacing w:line="240" w:lineRule="auto"/>
+        <w:ind w:left="850"/>
+      </w:pPr>
+      <w:r>
+        <w:rPr>
+          <w:rFonts w:ascii="TH Sarabun New" w:hAnsi="TH Sarabun New" w:cs="TH Sarabun New" w:eastAsia="TH Sarabun New"/>
+          <w:sz w:val="32"/>
+          <w:szCs w:val="32"/>
+        </w:rPr>
+        <w:t>การจัดเจ้าหน้าที่ประจำ ผู้รับจ้างต้องจัดเตรียมเจ้าหน้าที่ผู้มีความเชี่ยวชาญพร้อมให้คำปรึกษา แก้ไขปัญหา และปฏิบัติงานสนับสนุนแก่ผู้ว่าจ้างตลอดระยะเวลาการรับประกัน โดยไม่มีค่าใช้จ่ายใด ๆ เพิ่มเติมทั้งสิ้น</w:t>
+      </w:r>
+    </w:p>
     <w:p>
       <w:pPr>
         <w:spacing w:line="240" w:lineRule="auto"/>
@@ -3709,7 +2045,7 @@
           <w:sz w:val="32"/>
           <w:szCs w:val="32"/>
         </w:rPr>
-        <w:t>หลักเกณฑ์ในการพิจารณาคัดเลือกข้อเสนอ</w:t>
+        <w:t>การพิจารณาคัดเลือกข้อเสนอของผู้ยื่นข้อเสนอในการจัดจ้างพัฒนาระบบสารสนเทศบริหารสัญญาจัดซื้อจัดจ้างภาครัฐ จะดำเนินการโดยใช้เกณฑ์ราคาประกอบเกณฑ์คุณภาพ ซึ่งกำหนดสัดส่วนการให้คะแนนระหว่างด้านคุณภาพและด้านราคา โดยผู้ยื่นข้อเสนอจะต้องผ่านเกณฑ์การประเมินด้านคุณภาพตามคะแนนขั้นต่ำที่กำหนด จึงจะมีสิทธิได้รับการพิจารณาในขั้นตอนถัดไป</w:t>
       </w:r>
     </w:p>
     <w:p>
@@ -3723,63 +2059,7 @@
           <w:sz w:val="32"/>
           <w:szCs w:val="32"/>
         </w:rPr>
-        <w:t>การพิจารณาคัดเลือกผู้รับจ้างดำเนินการโดยใช้วิธีราคาประกอบเกณฑ์คุณภาพ โดยกำหนดสัดส่วนน้ำหนักคะแนนระหว่างด้านราคาและด้านเทคนิค ดังนี้</w:t>
-      </w:r>
-    </w:p>
-    <w:p>
-      <w:pPr>
-        <w:spacing w:line="240" w:lineRule="auto"/>
-        <w:ind w:firstLine="709"/>
-      </w:pPr>
-      <w:r>
-        <w:rPr>
-          <w:rFonts w:ascii="TH Sarabun New" w:hAnsi="TH Sarabun New" w:cs="TH Sarabun New" w:eastAsia="TH Sarabun New"/>
-          <w:sz w:val="32"/>
-          <w:szCs w:val="32"/>
-        </w:rPr>
-        <w:t>* ด้านราคา มีน้ำหนักร้อยละ ๓๐</w:t>
-      </w:r>
-    </w:p>
-    <w:p>
-      <w:pPr>
-        <w:spacing w:line="240" w:lineRule="auto"/>
-        <w:ind w:firstLine="709"/>
-      </w:pPr>
-      <w:r>
-        <w:rPr>
-          <w:rFonts w:ascii="TH Sarabun New" w:hAnsi="TH Sarabun New" w:cs="TH Sarabun New" w:eastAsia="TH Sarabun New"/>
-          <w:sz w:val="32"/>
-          <w:szCs w:val="32"/>
-        </w:rPr>
-        <w:t>* ด้านคุณภาพ (ด้านเทคนิค) มีน้ำหนักร้อยละ ๗๐</w:t>
-      </w:r>
-    </w:p>
-    <w:p>
-      <w:pPr>
-        <w:spacing w:line="240" w:lineRule="auto"/>
-        <w:ind w:firstLine="709"/>
-      </w:pPr>
-      <w:r>
-        <w:rPr>
-          <w:rFonts w:ascii="TH Sarabun New" w:hAnsi="TH Sarabun New" w:cs="TH Sarabun New" w:eastAsia="TH Sarabun New"/>
-          <w:sz w:val="32"/>
-          <w:szCs w:val="32"/>
-        </w:rPr>
-        <w:t>ทั้งนี้ ผู้ยื่นข้อเสนอจะต้องได้คะแนนรวมในด้านคุณภาพไม่ต่ำกว่าเจ็ดสิบ (๗๐) คะแนน จึงจะมีสิทธิ์ผ่านการพิจารณาและเข้าสู่ขั้นตอนการเปรียบเทียบราคาต่อไป</w:t>
-      </w:r>
-    </w:p>
-    <w:p>
-      <w:pPr>
-        <w:spacing w:line="240" w:lineRule="auto"/>
-        <w:ind w:firstLine="709"/>
-      </w:pPr>
-      <w:r>
-        <w:rPr>
-          <w:rFonts w:ascii="TH Sarabun New" w:hAnsi="TH Sarabun New" w:cs="TH Sarabun New" w:eastAsia="TH Sarabun New"/>
-          <w:sz w:val="32"/>
-          <w:szCs w:val="32"/>
-        </w:rPr>
-        <w:t>ตารางเกณฑ์การให้คะแนนประกอบด้วยรายละเอียดดังนี้</w:t>
+        <w:t>การประเมินข้อเสนอแบ่งออกเป็นองค์ประกอบหลัก พร้อมทั้งกำหนดน้ำหนักคะแนนและวิธีให้คะแนน ดังแสดงรายละเอียดตามตารางต่อไปนี้</w:t>
       </w:r>
     </w:p>
     <w:tbl>
@@ -3872,7 +2152,7 @@
                 <w:sz w:val="32"/>
                 <w:szCs w:val="32"/>
               </w:rPr>
-              <w:t>ความเข้าใจขอบเขตงาน</w:t>
+              <w:t>ด้านคุณภาพ</w:t>
             </w:r>
           </w:p>
         </w:tc>
@@ -3892,7 +2172,7 @@
                 <w:sz w:val="32"/>
                 <w:szCs w:val="32"/>
               </w:rPr>
-              <w:t>๒๐</w:t>
+              <w:t>๗๐</w:t>
             </w:r>
           </w:p>
         </w:tc>
@@ -3912,193 +2192,7 @@
                 <w:sz w:val="32"/>
                 <w:szCs w:val="32"/>
               </w:rPr>
-              <w:t>พิจารณาจากความสมบูรณ์และความเหมาะสมของแนวทางการดำเนินงานที่นำเสนอ</w:t>
-            </w:r>
-          </w:p>
-        </w:tc>
-      </w:tr>
-      <w:tr>
-        <w:tc>
-          <w:tcPr>
-            <w:tcW w:type="dxa" w:w="3247"/>
-          </w:tcPr>
-          <w:p>
-            <w:pPr>
-              <w:spacing w:line="240" w:lineRule="auto"/>
-            </w:pPr>
-            <w:r/>
-            <w:r>
-              <w:rPr>
-                <w:rFonts w:ascii="TH Sarabun New" w:hAnsi="TH Sarabun New" w:cs="TH Sarabun New" w:eastAsia="TH Sarabun New"/>
-                <w:b w:val="0"/>
-                <w:sz w:val="32"/>
-                <w:szCs w:val="32"/>
-              </w:rPr>
-              <w:t>สถาปัตยกรรมระบบ</w:t>
-            </w:r>
-          </w:p>
-        </w:tc>
-        <w:tc>
-          <w:tcPr>
-            <w:tcW w:type="dxa" w:w="3247"/>
-          </w:tcPr>
-          <w:p>
-            <w:pPr>
-              <w:spacing w:line="240" w:lineRule="auto"/>
-            </w:pPr>
-            <w:r/>
-            <w:r>
-              <w:rPr>
-                <w:rFonts w:ascii="TH Sarabun New" w:hAnsi="TH Sarabun New" w:cs="TH Sarabun New" w:eastAsia="TH Sarabun New"/>
-                <w:b w:val="0"/>
-                <w:sz w:val="32"/>
-                <w:szCs w:val="32"/>
-              </w:rPr>
-              <w:t>๒๐</w:t>
-            </w:r>
-          </w:p>
-        </w:tc>
-        <w:tc>
-          <w:tcPr>
-            <w:tcW w:type="dxa" w:w="3247"/>
-          </w:tcPr>
-          <w:p>
-            <w:pPr>
-              <w:spacing w:line="240" w:lineRule="auto"/>
-            </w:pPr>
-            <w:r/>
-            <w:r>
-              <w:rPr>
-                <w:rFonts w:ascii="TH Sarabun New" w:hAnsi="TH Sarabun New" w:cs="TH Sarabun New" w:eastAsia="TH Sarabun New"/>
-                <w:b w:val="0"/>
-                <w:sz w:val="32"/>
-                <w:szCs w:val="32"/>
-              </w:rPr>
-              <w:t>พิจารณาจากความทันสมัย ประสิทธิภาพ และความมั่นคงปลอดภัยของโครงสร้างระบบที่ออกแบบ</w:t>
-            </w:r>
-          </w:p>
-        </w:tc>
-      </w:tr>
-      <w:tr>
-        <w:tc>
-          <w:tcPr>
-            <w:tcW w:type="dxa" w:w="3247"/>
-          </w:tcPr>
-          <w:p>
-            <w:pPr>
-              <w:spacing w:line="240" w:lineRule="auto"/>
-            </w:pPr>
-            <w:r/>
-            <w:r>
-              <w:rPr>
-                <w:rFonts w:ascii="TH Sarabun New" w:hAnsi="TH Sarabun New" w:cs="TH Sarabun New" w:eastAsia="TH Sarabun New"/>
-                <w:b w:val="0"/>
-                <w:sz w:val="32"/>
-                <w:szCs w:val="32"/>
-              </w:rPr>
-              <w:t>แผนการทดสอบและรับรองผลงาน</w:t>
-            </w:r>
-          </w:p>
-        </w:tc>
-        <w:tc>
-          <w:tcPr>
-            <w:tcW w:type="dxa" w:w="3247"/>
-          </w:tcPr>
-          <w:p>
-            <w:pPr>
-              <w:spacing w:line="240" w:lineRule="auto"/>
-            </w:pPr>
-            <w:r/>
-            <w:r>
-              <w:rPr>
-                <w:rFonts w:ascii="TH Sarabun New" w:hAnsi="TH Sarabun New" w:cs="TH Sarabun New" w:eastAsia="TH Sarabun New"/>
-                <w:b w:val="0"/>
-                <w:sz w:val="32"/>
-                <w:szCs w:val="32"/>
-              </w:rPr>
-              <w:t>๑๕</w:t>
-            </w:r>
-          </w:p>
-        </w:tc>
-        <w:tc>
-          <w:tcPr>
-            <w:tcW w:type="dxa" w:w="3247"/>
-          </w:tcPr>
-          <w:p>
-            <w:pPr>
-              <w:spacing w:line="240" w:lineRule="auto"/>
-            </w:pPr>
-            <w:r/>
-            <w:r>
-              <w:rPr>
-                <w:rFonts w:ascii="TH Sarabun New" w:hAnsi="TH Sarabun New" w:cs="TH Sarabun New" w:eastAsia="TH Sarabun New"/>
-                <w:b w:val="0"/>
-                <w:sz w:val="32"/>
-                <w:szCs w:val="32"/>
-              </w:rPr>
-              <w:t>พิจารณาจากความครอบคลุม ความเป็นระบบ และความเป็นไปได้ในการดำเนินการทดสอบยอมรับโดยผู้ใช้</w:t>
-            </w:r>
-          </w:p>
-        </w:tc>
-      </w:tr>
-      <w:tr>
-        <w:tc>
-          <w:tcPr>
-            <w:tcW w:type="dxa" w:w="3247"/>
-          </w:tcPr>
-          <w:p>
-            <w:pPr>
-              <w:spacing w:line="240" w:lineRule="auto"/>
-            </w:pPr>
-            <w:r/>
-            <w:r>
-              <w:rPr>
-                <w:rFonts w:ascii="TH Sarabun New" w:hAnsi="TH Sarabun New" w:cs="TH Sarabun New" w:eastAsia="TH Sarabun New"/>
-                <w:b w:val="0"/>
-                <w:sz w:val="32"/>
-                <w:szCs w:val="32"/>
-              </w:rPr>
-              <w:t>ทีมบุคลากรประจำโครงการ</w:t>
-            </w:r>
-          </w:p>
-        </w:tc>
-        <w:tc>
-          <w:tcPr>
-            <w:tcW w:type="dxa" w:w="3247"/>
-          </w:tcPr>
-          <w:p>
-            <w:pPr>
-              <w:spacing w:line="240" w:lineRule="auto"/>
-            </w:pPr>
-            <w:r/>
-            <w:r>
-              <w:rPr>
-                <w:rFonts w:ascii="TH Sarabun New" w:hAnsi="TH Sarabun New" w:cs="TH Sarabun New" w:eastAsia="TH Sarabun New"/>
-                <w:b w:val="0"/>
-                <w:sz w:val="32"/>
-                <w:szCs w:val="32"/>
-              </w:rPr>
-              <w:t>๑๕</w:t>
-            </w:r>
-          </w:p>
-        </w:tc>
-        <w:tc>
-          <w:tcPr>
-            <w:tcW w:type="dxa" w:w="3247"/>
-          </w:tcPr>
-          <w:p>
-            <w:pPr>
-              <w:spacing w:line="240" w:lineRule="auto"/>
-            </w:pPr>
-            <w:r/>
-            <w:r>
-              <w:rPr>
-                <w:rFonts w:ascii="TH Sarabun New" w:hAnsi="TH Sarabun New" w:cs="TH Sarabun New" w:eastAsia="TH Sarabun New"/>
-                <w:b w:val="0"/>
-                <w:sz w:val="32"/>
-                <w:szCs w:val="32"/>
-              </w:rPr>
-              <w:t>พิจารณาจากประสบการณ์ ความเชี่ยวชาญ และคุณสมบัติของบุคลากรหลักที่เข้าร่วมโครงการ</w:t>
+              <w:t>ประเมินจากความเข้าใจในขอบเขตงาน สถาปัตยกรรมระบบ แผนการทดสอบ และศักยภาพของทีมงาน โดยผู้ยื่นข้อเสนอด้านคุณภาพจะต้องได้คะแนนรวมไม่ต่ำกว่าร้อยละเจ็ดสิบ (คะแนนผ่านขั้นต่ำ ๗๐ คะแนน) จึงจะถือว่าผ่านเกณฑ์การประเมิน</w:t>
             </w:r>
           </w:p>
         </w:tc>
@@ -4160,7 +2254,7 @@
                 <w:sz w:val="32"/>
                 <w:szCs w:val="32"/>
               </w:rPr>
-              <w:t>พิจารณาจากราคารวมตามข้อเสนอ (เป็นเกณฑ์การให้คะแนน)</w:t>
+              <w:t>ประเมินจากวงเงินเสนอราคาของผู้ยื่นข้อเสนอที่ผ่านเกณฑ์การประเมินด้านคุณภาพ โดยข้อเสนอที่มีราคาต่ำที่สุดจะได้คะแนนเต็ม และข้อเสนออื่นจะได้รับคะแนนลดหลั่นลงไปตามสัดส่วน</w:t>
             </w:r>
           </w:p>
         </w:tc>
@@ -4238,7 +2332,7 @@
           <w:sz w:val="32"/>
           <w:szCs w:val="32"/>
         </w:rPr>
-        <w:t>หมายเหตุ: การพิจารณาจะดำเนินการโดยคณะกรรมการฯ และหากผู้ยื่นข้อเสนอไม่ส่งเอกสารในหัวข้อใด จะถือว่าได้คะแนนในหัวข้อนั้นเท่ากับศูนย์ (๐) คะแนน ทั้งนี้ ผู้ประกอบการที่เป็นวิสาหกิจขนาดกลางและขนาดย่อมที่จดทะเบียนถูกต้องตามกฎหมาย รวมถึงพัสดุที่ผลิตในประเทศไทยเมื่อเข้าเงื่อนไข จะได้รับการพิจารณาให้เพิ่มน้ำหนักคะแนนด้วย</w:t>
+        <w:t>หมายเหตุ: ผู้ยื่นข้อเสนอรายใดไม่จัดส่งเอกสารหรือหลักฐานตามที่กำหนดในข้อเสนอแนะด้านคุณภาพ จะไม่ได้รับการพิจารณาและไม่ได้คะแนนในข้อนั้น ทั้งนี้ การพิจารณาผลการประกวดราคาอิเล็กทรอนิกส์จะเป็นไปตามระเบียบกระทรวงการคลังว่าด้วยการจัดซื้อจัดจ้างและการบริหารพัสดุภาครัฐ พ.ศ. ๒๕๖๐ และประกาศที่เกี่ยวข้องโดยเคร่งครัด</w:t>
       </w:r>
     </w:p>
     <w:p>
@@ -4266,7 +2360,7 @@
           <w:sz w:val="32"/>
           <w:szCs w:val="32"/>
         </w:rPr>
-        <w:t>การดำเนินการสำรองข้อมูลของระบบต้องเป็นไปในลักษณะอัตโนมัติและดำเนินการทุกวัน โดยกำหนดให้จุดกู้คืนข้อมูลไม่เกินยี่สิบสี่ชั่วโมง และเวลาที่ใช้ในการกู้คืนข้อมูลทั้งหมดจะต้องไม่เกินแปดชั่วโมง นอกจากนี้ ผู้รับจ้างต้องจัดเก็บบันทึกการสำรองข้อมูลไว้เป็นระยะเวลาไม่น้อยกว่าสามสิบวัน และผู้รับจ้างต้องดำเนินการทดสอบการกู้คืนระบบอย่างน้อยปีละสองครั้ง</w:t>
+        <w:t>ผู้รับจ้างต้องดำเนินการสำรองข้อมูลของระบบงานทั้งหมดโดยอัตโนมัติเป็นรายวัน พร้อมทั้งกำหนดจุดกู้คืนข้อมูลย้อนหลังไม่เกินยี่สิบสี่ชั่วโมง และระยะเวลากู้คืนข้อมูลให้แล้วเสร็จไม่เกินแปดชั่วโมง ทั้งนี้ ต้องจัดเก็บข้อมูลสำรองไว้อย่างน้อยสามสิบวัน และดำเนินการซ้อมการกู้คืนข้อมูลปีละสองครั้งตลอดระยะเวลาสัญญา</w:t>
       </w:r>
     </w:p>
     <w:p>
@@ -4294,556 +2388,7 @@
           <w:sz w:val="32"/>
           <w:szCs w:val="32"/>
         </w:rPr>
-        <w:t>ผู้รับจ้างต้องดำเนินการส่งมอบผลงานในลักษณะของเอกสารและทรัพย์สินทางปัญญาที่พัฒนาขึ้นตามขอบเขตงาน โดยมิใช่การจัดซื้อครุภัณฑ์หรือเครื่องคอมพิวเตอร์ชนิดพกพาให้แก่หน่วยงาน ผู้รับจ้างจะต้องส่งมอบรายการเอกสารดังต่อไปนี้:</w:t>
-      </w:r>
-    </w:p>
-    <w:p>
-      <w:pPr>
-        <w:spacing w:line="240" w:lineRule="auto"/>
-        <w:ind w:firstLine="709"/>
-      </w:pPr>
-      <w:r>
-        <w:rPr>
-          <w:rFonts w:ascii="TH Sarabun New" w:hAnsi="TH Sarabun New" w:cs="TH Sarabun New" w:eastAsia="TH Sarabun New"/>
-          <w:sz w:val="32"/>
-          <w:szCs w:val="32"/>
-        </w:rPr>
-        <w:t>1. เอกสารวิเคราะห์ออกแบบระบบ</w:t>
-      </w:r>
-    </w:p>
-    <w:p>
-      <w:pPr>
-        <w:spacing w:line="240" w:lineRule="auto"/>
-        <w:ind w:firstLine="709"/>
-      </w:pPr>
-      <w:r>
-        <w:rPr>
-          <w:rFonts w:ascii="TH Sarabun New" w:hAnsi="TH Sarabun New" w:cs="TH Sarabun New" w:eastAsia="TH Sarabun New"/>
-          <w:sz w:val="32"/>
-          <w:szCs w:val="32"/>
-        </w:rPr>
-        <w:t>2. ซอร์สโค้ดของโปรแกรมและฐานข้อมูลทั้งหมด</w:t>
-      </w:r>
-    </w:p>
-    <w:p>
-      <w:pPr>
-        <w:spacing w:line="240" w:lineRule="auto"/>
-        <w:ind w:firstLine="709"/>
-      </w:pPr>
-      <w:r>
-        <w:rPr>
-          <w:rFonts w:ascii="TH Sarabun New" w:hAnsi="TH Sarabun New" w:cs="TH Sarabun New" w:eastAsia="TH Sarabun New"/>
-          <w:sz w:val="32"/>
-          <w:szCs w:val="32"/>
-        </w:rPr>
-        <w:t>3. คู่มือสำหรับผู้ใช้งานระบบ</w:t>
-      </w:r>
-    </w:p>
-    <w:p>
-      <w:pPr>
-        <w:spacing w:line="240" w:lineRule="auto"/>
-        <w:ind w:firstLine="709"/>
-      </w:pPr>
-      <w:r>
-        <w:rPr>
-          <w:rFonts w:ascii="TH Sarabun New" w:hAnsi="TH Sarabun New" w:cs="TH Sarabun New" w:eastAsia="TH Sarabun New"/>
-          <w:sz w:val="32"/>
-          <w:szCs w:val="32"/>
-        </w:rPr>
-        <w:t>4. คู่มือสำหรับเจ้าหน้าที่ดูแลรักษาระบบ</w:t>
-      </w:r>
-    </w:p>
-    <w:p>
-      <w:pPr>
-        <w:spacing w:line="240" w:lineRule="auto"/>
-        <w:ind w:firstLine="709"/>
-      </w:pPr>
-      <w:r>
-        <w:rPr>
-          <w:rFonts w:ascii="TH Sarabun New" w:hAnsi="TH Sarabun New" w:cs="TH Sarabun New" w:eastAsia="TH Sarabun New"/>
-          <w:sz w:val="32"/>
-          <w:szCs w:val="32"/>
-        </w:rPr>
-        <w:t>5. รายงานผลการทดสอบระบบ</w:t>
-      </w:r>
-    </w:p>
-    <w:p>
-      <w:pPr>
-        <w:spacing w:line="240" w:lineRule="auto"/>
-        <w:ind w:firstLine="709"/>
-      </w:pPr>
-      <w:r>
-        <w:rPr>
-          <w:rFonts w:ascii="TH Sarabun New" w:hAnsi="TH Sarabun New" w:cs="TH Sarabun New" w:eastAsia="TH Sarabun New"/>
-          <w:sz w:val="32"/>
-          <w:szCs w:val="32"/>
-        </w:rPr>
-        <w:t>6. รายงานการฝึกอบรม</w:t>
-      </w:r>
-    </w:p>
-    <w:p>
-      <w:pPr>
-        <w:spacing w:line="240" w:lineRule="auto"/>
-        <w:ind w:firstLine="709"/>
-      </w:pPr>
-      <w:r>
-        <w:rPr>
-          <w:rFonts w:ascii="TH Sarabun New" w:hAnsi="TH Sarabun New" w:cs="TH Sarabun New" w:eastAsia="TH Sarabun New"/>
-          <w:sz w:val="32"/>
-          <w:szCs w:val="32"/>
-        </w:rPr>
-        <w:t>การส่งมอบเอกสารดังกล่าวให้เป็นไปตามงวดงานและการจ่ายเงิน ดังนี้:</w:t>
-      </w:r>
-    </w:p>
-    <w:tbl>
-      <w:tblPr>
-        <w:tblStyle w:val="TableGrid"/>
-        <w:tblW w:type="auto" w:w="0"/>
-        <w:tblLook w:firstColumn="1" w:firstRow="1" w:lastColumn="0" w:lastRow="0" w:noHBand="0" w:noVBand="1" w:val="04A0"/>
-      </w:tblPr>
-      <w:tblGrid>
-        <w:gridCol w:w="2435"/>
-        <w:gridCol w:w="2435"/>
-        <w:gridCol w:w="2435"/>
-        <w:gridCol w:w="2435"/>
-      </w:tblGrid>
-      <w:tr>
-        <w:tc>
-          <w:tcPr>
-            <w:tcW w:type="dxa" w:w="2435"/>
-          </w:tcPr>
-          <w:p>
-            <w:pPr>
-              <w:spacing w:line="240" w:lineRule="auto"/>
-            </w:pPr>
-            <w:r/>
-            <w:r>
-              <w:rPr>
-                <w:rFonts w:ascii="TH Sarabun New" w:hAnsi="TH Sarabun New" w:cs="TH Sarabun New" w:eastAsia="TH Sarabun New"/>
-                <w:b/>
-                <w:sz w:val="32"/>
-                <w:szCs w:val="32"/>
-              </w:rPr>
-              <w:t>งวดที่</w:t>
-            </w:r>
-          </w:p>
-        </w:tc>
-        <w:tc>
-          <w:tcPr>
-            <w:tcW w:type="dxa" w:w="2435"/>
-          </w:tcPr>
-          <w:p>
-            <w:pPr>
-              <w:spacing w:line="240" w:lineRule="auto"/>
-            </w:pPr>
-            <w:r/>
-            <w:r>
-              <w:rPr>
-                <w:rFonts w:ascii="TH Sarabun New" w:hAnsi="TH Sarabun New" w:cs="TH Sarabun New" w:eastAsia="TH Sarabun New"/>
-                <w:b/>
-                <w:sz w:val="32"/>
-                <w:szCs w:val="32"/>
-              </w:rPr>
-              <w:t>ระยะเวลาดำเนินการ (นับถัดจากวันลงนามในสัญญา)</w:t>
-            </w:r>
-          </w:p>
-        </w:tc>
-        <w:tc>
-          <w:tcPr>
-            <w:tcW w:type="dxa" w:w="2435"/>
-          </w:tcPr>
-          <w:p>
-            <w:pPr>
-              <w:spacing w:line="240" w:lineRule="auto"/>
-            </w:pPr>
-            <w:r/>
-            <w:r>
-              <w:rPr>
-                <w:rFonts w:ascii="TH Sarabun New" w:hAnsi="TH Sarabun New" w:cs="TH Sarabun New" w:eastAsia="TH Sarabun New"/>
-                <w:b/>
-                <w:sz w:val="32"/>
-                <w:szCs w:val="32"/>
-              </w:rPr>
-              <w:t>สัดส่วนการจ่ายเงิน</w:t>
-            </w:r>
-          </w:p>
-        </w:tc>
-        <w:tc>
-          <w:tcPr>
-            <w:tcW w:type="dxa" w:w="2435"/>
-          </w:tcPr>
-          <w:p>
-            <w:pPr>
-              <w:spacing w:line="240" w:lineRule="auto"/>
-            </w:pPr>
-            <w:r/>
-            <w:r>
-              <w:rPr>
-                <w:rFonts w:ascii="TH Sarabun New" w:hAnsi="TH Sarabun New" w:cs="TH Sarabun New" w:eastAsia="TH Sarabun New"/>
-                <w:b/>
-                <w:sz w:val="32"/>
-                <w:szCs w:val="32"/>
-              </w:rPr>
-              <w:t>รายการเอกสารหลักที่ต้องส่งมอบ</w:t>
-            </w:r>
-          </w:p>
-        </w:tc>
-      </w:tr>
-      <w:tr>
-        <w:tc>
-          <w:tcPr>
-            <w:tcW w:type="dxa" w:w="2435"/>
-          </w:tcPr>
-          <w:p>
-            <w:pPr>
-              <w:spacing w:line="240" w:lineRule="auto"/>
-            </w:pPr>
-            <w:r/>
-            <w:r>
-              <w:rPr>
-                <w:rFonts w:ascii="TH Sarabun New" w:hAnsi="TH Sarabun New" w:cs="TH Sarabun New" w:eastAsia="TH Sarabun New"/>
-                <w:b w:val="0"/>
-                <w:sz w:val="32"/>
-                <w:szCs w:val="32"/>
-              </w:rPr>
-              <w:t>๑</w:t>
-            </w:r>
-          </w:p>
-        </w:tc>
-        <w:tc>
-          <w:tcPr>
-            <w:tcW w:type="dxa" w:w="2435"/>
-          </w:tcPr>
-          <w:p>
-            <w:pPr>
-              <w:spacing w:line="240" w:lineRule="auto"/>
-            </w:pPr>
-            <w:r/>
-            <w:r>
-              <w:rPr>
-                <w:rFonts w:ascii="TH Sarabun New" w:hAnsi="TH Sarabun New" w:cs="TH Sarabun New" w:eastAsia="TH Sarabun New"/>
-                <w:b w:val="0"/>
-                <w:sz w:val="32"/>
-                <w:szCs w:val="32"/>
-              </w:rPr>
-              <w:t>ภายใน ๔๕ วัน</w:t>
-            </w:r>
-          </w:p>
-        </w:tc>
-        <w:tc>
-          <w:tcPr>
-            <w:tcW w:type="dxa" w:w="2435"/>
-          </w:tcPr>
-          <w:p>
-            <w:pPr>
-              <w:spacing w:line="240" w:lineRule="auto"/>
-            </w:pPr>
-            <w:r/>
-            <w:r>
-              <w:rPr>
-                <w:rFonts w:ascii="TH Sarabun New" w:hAnsi="TH Sarabun New" w:cs="TH Sarabun New" w:eastAsia="TH Sarabun New"/>
-                <w:b w:val="0"/>
-                <w:sz w:val="32"/>
-                <w:szCs w:val="32"/>
-              </w:rPr>
-              <w:t>ร้อยละ ๒๐</w:t>
-            </w:r>
-          </w:p>
-        </w:tc>
-        <w:tc>
-          <w:tcPr>
-            <w:tcW w:type="dxa" w:w="2435"/>
-          </w:tcPr>
-          <w:p>
-            <w:pPr>
-              <w:spacing w:line="240" w:lineRule="auto"/>
-            </w:pPr>
-            <w:r/>
-            <w:r>
-              <w:rPr>
-                <w:rFonts w:ascii="TH Sarabun New" w:hAnsi="TH Sarabun New" w:cs="TH Sarabun New" w:eastAsia="TH Sarabun New"/>
-                <w:b w:val="0"/>
-                <w:sz w:val="32"/>
-                <w:szCs w:val="32"/>
-              </w:rPr>
-              <w:t>เอกสารวิเคราะห์ออกแบบและต้นแบบหน้าจอระบบ</w:t>
-            </w:r>
-          </w:p>
-        </w:tc>
-      </w:tr>
-      <w:tr>
-        <w:tc>
-          <w:tcPr>
-            <w:tcW w:type="dxa" w:w="2435"/>
-          </w:tcPr>
-          <w:p>
-            <w:pPr>
-              <w:spacing w:line="240" w:lineRule="auto"/>
-            </w:pPr>
-            <w:r/>
-            <w:r>
-              <w:rPr>
-                <w:rFonts w:ascii="TH Sarabun New" w:hAnsi="TH Sarabun New" w:cs="TH Sarabun New" w:eastAsia="TH Sarabun New"/>
-                <w:b w:val="0"/>
-                <w:sz w:val="32"/>
-                <w:szCs w:val="32"/>
-              </w:rPr>
-              <w:t>๒</w:t>
-            </w:r>
-          </w:p>
-        </w:tc>
-        <w:tc>
-          <w:tcPr>
-            <w:tcW w:type="dxa" w:w="2435"/>
-          </w:tcPr>
-          <w:p>
-            <w:pPr>
-              <w:spacing w:line="240" w:lineRule="auto"/>
-            </w:pPr>
-            <w:r/>
-            <w:r>
-              <w:rPr>
-                <w:rFonts w:ascii="TH Sarabun New" w:hAnsi="TH Sarabun New" w:cs="TH Sarabun New" w:eastAsia="TH Sarabun New"/>
-                <w:b w:val="0"/>
-                <w:sz w:val="32"/>
-                <w:szCs w:val="32"/>
-              </w:rPr>
-              <w:t>ภายใน ๑๒๐ วัน</w:t>
-            </w:r>
-          </w:p>
-        </w:tc>
-        <w:tc>
-          <w:tcPr>
-            <w:tcW w:type="dxa" w:w="2435"/>
-          </w:tcPr>
-          <w:p>
-            <w:pPr>
-              <w:spacing w:line="240" w:lineRule="auto"/>
-            </w:pPr>
-            <w:r/>
-            <w:r>
-              <w:rPr>
-                <w:rFonts w:ascii="TH Sarabun New" w:hAnsi="TH Sarabun New" w:cs="TH Sarabun New" w:eastAsia="TH Sarabun New"/>
-                <w:b w:val="0"/>
-                <w:sz w:val="32"/>
-                <w:szCs w:val="32"/>
-              </w:rPr>
-              <w:t>ร้อยละ ๔๐</w:t>
-            </w:r>
-          </w:p>
-        </w:tc>
-        <w:tc>
-          <w:tcPr>
-            <w:tcW w:type="dxa" w:w="2435"/>
-          </w:tcPr>
-          <w:p>
-            <w:pPr>
-              <w:spacing w:line="240" w:lineRule="auto"/>
-            </w:pPr>
-            <w:r/>
-            <w:r>
-              <w:rPr>
-                <w:rFonts w:ascii="TH Sarabun New" w:hAnsi="TH Sarabun New" w:cs="TH Sarabun New" w:eastAsia="TH Sarabun New"/>
-                <w:b w:val="0"/>
-                <w:sz w:val="32"/>
-                <w:szCs w:val="32"/>
-              </w:rPr>
-              <w:t>ระบบที่พัฒนาแล้วในสภาพแวดล้อมทดสอบ พร้อมรายงานผลการเชื่อมโยงและการทดสอบ</w:t>
-            </w:r>
-          </w:p>
-        </w:tc>
-      </w:tr>
-      <w:tr>
-        <w:tc>
-          <w:tcPr>
-            <w:tcW w:type="dxa" w:w="2435"/>
-          </w:tcPr>
-          <w:p>
-            <w:pPr>
-              <w:spacing w:line="240" w:lineRule="auto"/>
-            </w:pPr>
-            <w:r/>
-            <w:r>
-              <w:rPr>
-                <w:rFonts w:ascii="TH Sarabun New" w:hAnsi="TH Sarabun New" w:cs="TH Sarabun New" w:eastAsia="TH Sarabun New"/>
-                <w:b w:val="0"/>
-                <w:sz w:val="32"/>
-                <w:szCs w:val="32"/>
-              </w:rPr>
-              <w:t>๓</w:t>
-            </w:r>
-          </w:p>
-        </w:tc>
-        <w:tc>
-          <w:tcPr>
-            <w:tcW w:type="dxa" w:w="2435"/>
-          </w:tcPr>
-          <w:p>
-            <w:pPr>
-              <w:spacing w:line="240" w:lineRule="auto"/>
-            </w:pPr>
-            <w:r/>
-            <w:r>
-              <w:rPr>
-                <w:rFonts w:ascii="TH Sarabun New" w:hAnsi="TH Sarabun New" w:cs="TH Sarabun New" w:eastAsia="TH Sarabun New"/>
-                <w:b w:val="0"/>
-                <w:sz w:val="32"/>
-                <w:szCs w:val="32"/>
-              </w:rPr>
-              <w:t>ภายใน ๑๖๐ วัน</w:t>
-            </w:r>
-          </w:p>
-        </w:tc>
-        <w:tc>
-          <w:tcPr>
-            <w:tcW w:type="dxa" w:w="2435"/>
-          </w:tcPr>
-          <w:p>
-            <w:pPr>
-              <w:spacing w:line="240" w:lineRule="auto"/>
-            </w:pPr>
-            <w:r/>
-            <w:r>
-              <w:rPr>
-                <w:rFonts w:ascii="TH Sarabun New" w:hAnsi="TH Sarabun New" w:cs="TH Sarabun New" w:eastAsia="TH Sarabun New"/>
-                <w:b w:val="0"/>
-                <w:sz w:val="32"/>
-                <w:szCs w:val="32"/>
-              </w:rPr>
-              <w:t>ร้อยละ ๒๕</w:t>
-            </w:r>
-          </w:p>
-        </w:tc>
-        <w:tc>
-          <w:tcPr>
-            <w:tcW w:type="dxa" w:w="2435"/>
-          </w:tcPr>
-          <w:p>
-            <w:pPr>
-              <w:spacing w:line="240" w:lineRule="auto"/>
-            </w:pPr>
-            <w:r/>
-            <w:r>
-              <w:rPr>
-                <w:rFonts w:ascii="TH Sarabun New" w:hAnsi="TH Sarabun New" w:cs="TH Sarabun New" w:eastAsia="TH Sarabun New"/>
-                <w:b w:val="0"/>
-                <w:sz w:val="32"/>
-                <w:szCs w:val="32"/>
-              </w:rPr>
-              <w:t>ระบบที่พร้อมใช้งานจริง รายงานการทดสอบยอมรับโดยผู้ใช้ และรายงานการฝึกอบรม</w:t>
-            </w:r>
-          </w:p>
-        </w:tc>
-      </w:tr>
-      <w:tr>
-        <w:tc>
-          <w:tcPr>
-            <w:tcW w:type="dxa" w:w="2435"/>
-          </w:tcPr>
-          <w:p>
-            <w:pPr>
-              <w:spacing w:line="240" w:lineRule="auto"/>
-            </w:pPr>
-            <w:r/>
-            <w:r>
-              <w:rPr>
-                <w:rFonts w:ascii="TH Sarabun New" w:hAnsi="TH Sarabun New" w:cs="TH Sarabun New" w:eastAsia="TH Sarabun New"/>
-                <w:b w:val="0"/>
-                <w:sz w:val="32"/>
-                <w:szCs w:val="32"/>
-              </w:rPr>
-              <w:t>๔</w:t>
-            </w:r>
-          </w:p>
-        </w:tc>
-        <w:tc>
-          <w:tcPr>
-            <w:tcW w:type="dxa" w:w="2435"/>
-          </w:tcPr>
-          <w:p>
-            <w:pPr>
-              <w:spacing w:line="240" w:lineRule="auto"/>
-            </w:pPr>
-            <w:r/>
-            <w:r>
-              <w:rPr>
-                <w:rFonts w:ascii="TH Sarabun New" w:hAnsi="TH Sarabun New" w:cs="TH Sarabun New" w:eastAsia="TH Sarabun New"/>
-                <w:b w:val="0"/>
-                <w:sz w:val="32"/>
-                <w:szCs w:val="32"/>
-              </w:rPr>
-              <w:t>ภายใน ๑๘๐ วัน</w:t>
-            </w:r>
-          </w:p>
-        </w:tc>
-        <w:tc>
-          <w:tcPr>
-            <w:tcW w:type="dxa" w:w="2435"/>
-          </w:tcPr>
-          <w:p>
-            <w:pPr>
-              <w:spacing w:line="240" w:lineRule="auto"/>
-            </w:pPr>
-            <w:r/>
-            <w:r>
-              <w:rPr>
-                <w:rFonts w:ascii="TH Sarabun New" w:hAnsi="TH Sarabun New" w:cs="TH Sarabun New" w:eastAsia="TH Sarabun New"/>
-                <w:b w:val="0"/>
-                <w:sz w:val="32"/>
-                <w:szCs w:val="32"/>
-              </w:rPr>
-              <w:t>ร้อยละ ๑๕</w:t>
-            </w:r>
-          </w:p>
-        </w:tc>
-        <w:tc>
-          <w:tcPr>
-            <w:tcW w:type="dxa" w:w="2435"/>
-          </w:tcPr>
-          <w:p>
-            <w:pPr>
-              <w:spacing w:line="240" w:lineRule="auto"/>
-            </w:pPr>
-            <w:r/>
-            <w:r>
-              <w:rPr>
-                <w:rFonts w:ascii="TH Sarabun New" w:hAnsi="TH Sarabun New" w:cs="TH Sarabun New" w:eastAsia="TH Sarabun New"/>
-                <w:b w:val="0"/>
-                <w:sz w:val="32"/>
-                <w:szCs w:val="32"/>
-              </w:rPr>
-              <w:t>ซอร์สโค้ดทั้งหมด คู่มือฉบับสมบูรณ์ และแผนการบำรุงรักษา</w:t>
-            </w:r>
-          </w:p>
-        </w:tc>
-      </w:tr>
-    </w:tbl>
-    <w:p>
-      <w:pPr>
-        <w:spacing w:line="240" w:lineRule="auto"/>
-        <w:ind w:firstLine="709"/>
-      </w:pPr>
-      <w:r>
-        <w:rPr>
-          <w:rFonts w:ascii="TH Sarabun New" w:hAnsi="TH Sarabun New" w:cs="TH Sarabun New" w:eastAsia="TH Sarabun New"/>
-          <w:sz w:val="32"/>
-          <w:szCs w:val="32"/>
-        </w:rPr>
-        <w:t>นอกจากนี้ ผู้รับจ้างจะต้องดำเนินการส่งมอบและโอนถ่ายกรรมสิทธิ์ในซอร์สโค้ด ฐานข้อมูล และเอกสารที่พัฒนาภายใต้สัญญานี้ให้เป็นของกรมบัญชีกลางทั้งหมด ตามหลักเกณฑ์ลิขสิทธิ์และกรรมสิทธิ์ที่กำหนดไว้ในสัญญา</w:t>
-      </w:r>
-    </w:p>
-    <w:p>
-      <w:pPr>
-        <w:spacing w:line="240" w:lineRule="auto"/>
-        <w:ind w:firstLine="709"/>
-      </w:pPr>
-      <w:r>
-        <w:rPr>
-          <w:rFonts w:ascii="TH Sarabun New" w:hAnsi="TH Sarabun New" w:cs="TH Sarabun New" w:eastAsia="TH Sarabun New"/>
-          <w:sz w:val="32"/>
-          <w:szCs w:val="32"/>
-        </w:rPr>
-        <w:t>การส่งมอบผลงานทุกรายการจะต้องผ่านการตรวจสอบโดยคณะกรรมการตรวจรับพัสดุ และต้องดำเนินการตามข้อกำหนดด้านความมั่นคงปลอดภัยและการสำรองข้อมูลอย่างเคร่งครัด โดยผู้รับจ้างต้องจัดให้มีการสำรองข้อมูลอัตโนมัติรายวัน มีจุดกู้คืนไม่เกิน ๒๔ ชั่วโมง และเวลากู้คืนไม่เกิน ๘ ชั่วโมง พร้อมทั้งซ้อมกู้คืนระบบปีละ ๒ ครั้ง</w:t>
+        <w:t>ผู้รับจ้างจะต้องดำเนินการส่งมอบเอกสารและผลงานตามงวดงานที่กำหนดไว้ในสัญญาให้แก่ผู้ซื้อ โดยผลงานที่ส่งมอบต้องถูกต้องครบถ้วนตามขอบเขตของงานและข้อกำหนดทางเทคนิค ประกอบด้วย เอกสารการวิเคราะห์และออกแบบระบบงาน ต้นแบบหน้าจอการใช้งาน ระบบสารสนเทศในสภาพแวดล้อมทดสอบพร้อมรายงานการทดสอบการเชื่อมโยงข้อมูล ระบบสารสนเทศพร้อมใช้งานจริงในสภาพแวดล้อมจริง รายงานการทดสอบการยอมรับโดยผู้ใช้ รายงานผลการฝึกอบรม ซอร์สโค้ดของโปรแกรมคอมพิวเตอร์ทั้งหมด คู่มือการใช้งานสำหรับผู้ใช้ คู่มือการดูแลระบบสำหรับผู้ดูแลระบบ และแผนการบำรุงรักษาระบบสารสนเทศ ทั้งนี้ การส่งมอบผลงานดังกล่าวไม่รวมถึงการส่งมอบครุภัณฑ์หรือเครื่องคอมพิวเตอร์แต่อย่างใด การส่งมอบแต่ละงวดจะต้องจัดทำเป็นหนังสือยื่นต่อผู้ซื้อเพื่อตรวจสอบและดำเนินการตรวจรับต่อไปตามระเบียบของทางราชการ</w:t>
       </w:r>
     </w:p>
     <w:p>
@@ -4871,77 +2416,7 @@
           <w:sz w:val="32"/>
           <w:szCs w:val="32"/>
         </w:rPr>
-        <w:t>วงเงินงบประมาณที่ได้รับจัดสรร</w:t>
-      </w:r>
-    </w:p>
-    <w:p>
-      <w:pPr>
-        <w:spacing w:line="240" w:lineRule="auto"/>
-        <w:ind w:firstLine="709"/>
-      </w:pPr>
-      <w:r>
-        <w:rPr>
-          <w:rFonts w:ascii="TH Sarabun New" w:hAnsi="TH Sarabun New" w:cs="TH Sarabun New" w:eastAsia="TH Sarabun New"/>
-          <w:sz w:val="32"/>
-          <w:szCs w:val="32"/>
-        </w:rPr>
-        <w:t>โครงการนี้ใช้จ่ายจากงบดำเนินงานประจำปี เป็นจำนวนเงินทั้งสิ้น ๒,๕๐๐,๐๐๐ บาท (สองล้านห้าแสนบาทถ้วน) โดยเป็นวงเงินรวมภาษีมูลค่าเพิ่มและค่าใช้จ่ายทั้งปวงแล้ว</w:t>
-      </w:r>
-    </w:p>
-    <w:p>
-      <w:pPr>
-        <w:spacing w:line="240" w:lineRule="auto"/>
-        <w:ind w:firstLine="709"/>
-      </w:pPr>
-      <w:r>
-        <w:rPr>
-          <w:rFonts w:ascii="TH Sarabun New" w:hAnsi="TH Sarabun New" w:cs="TH Sarabun New" w:eastAsia="TH Sarabun New"/>
-          <w:sz w:val="32"/>
-          <w:szCs w:val="32"/>
-        </w:rPr>
-        <w:t>ราคากลางในการจัดซื้อจัดจ้าง</w:t>
-      </w:r>
-    </w:p>
-    <w:p>
-      <w:pPr>
-        <w:spacing w:line="240" w:lineRule="auto"/>
-        <w:ind w:firstLine="709"/>
-      </w:pPr>
-      <w:r>
-        <w:rPr>
-          <w:rFonts w:ascii="TH Sarabun New" w:hAnsi="TH Sarabun New" w:cs="TH Sarabun New" w:eastAsia="TH Sarabun New"/>
-          <w:sz w:val="32"/>
-          <w:szCs w:val="32"/>
-        </w:rPr>
-        <w:t>กำหนดราคากลางไว้ที่จำนวนเงินทั้งสิ้น ๒,๔๘๐,๐๐๐ บาท (สองล้านสี่แสนแปดหมื่นบาทถ้วน) ซึ่งเป็นราคาที่รวมภาษีมูลค่าเพิ่มและค่าใช้จ่ายทั้งปวงแล้ว</w:t>
-      </w:r>
-    </w:p>
-    <w:p>
-      <w:pPr>
-        <w:spacing w:line="240" w:lineRule="auto"/>
-        <w:ind w:firstLine="709"/>
-      </w:pPr>
-      <w:r>
-        <w:rPr>
-          <w:rFonts w:ascii="TH Sarabun New" w:hAnsi="TH Sarabun New" w:cs="TH Sarabun New" w:eastAsia="TH Sarabun New"/>
-          <w:sz w:val="32"/>
-          <w:szCs w:val="32"/>
-        </w:rPr>
-        <w:t>วิธีการจัดซื้อจัดจ้าง</w:t>
-      </w:r>
-    </w:p>
-    <w:p>
-      <w:pPr>
-        <w:spacing w:line="240" w:lineRule="auto"/>
-        <w:ind w:firstLine="709"/>
-      </w:pPr>
-      <w:r>
-        <w:rPr>
-          <w:rFonts w:ascii="TH Sarabun New" w:hAnsi="TH Sarabun New" w:cs="TH Sarabun New" w:eastAsia="TH Sarabun New"/>
-          <w:sz w:val="32"/>
-          <w:szCs w:val="32"/>
-        </w:rPr>
-        <w:t>การดำเนินการจัดซื้อจัดจ้างครั้งนี้ใช้วิธีประกวดราคาอิเล็กทรอนิกส์ ผ่านระบบ e-GP ตามพระราชบัญญัติการจัดซื้อจัดจ้างและการบริหารพัสดุภาครัฐ พ.ศ. ๒๕๖๐</w:t>
+        <w:t>การจัดซื้อจัดจ้างโครงการนี้ ได้รับการจัดสรรงบประมาณรายจ่ายประจำปีจากงบดำเนินงานประจำปี เป็นจำนวนเงินทั้งสิ้น ๒,๕๐๐,๐๐๐ บาท (สองล้านห้าแสนบาทถ้วน) โดยมีวงเงินราคากลางในการจัดหาพัสดุ เป็นจำนวนเงินทั้งสิ้น ๒,๔๘๐,๐๐๐ บาท (สองล้านสี่แสนแปดหมื่นบาทถ้วน) ซึ่งเป็นราคาที่รวมภาษีมูลค่าเพิ่มและค่าใช้จ่ายทั้งปวงไว้ด้วยแล้ว ทั้งนี้ การดำเนินกิจצการดังกล่าวจะดำเนินการด้วยวิธีประกาศเชิญชวนทั่วไปด้วยวิธีประกวดราคาอิเล็กทรอนิกส์ ตามพระราชบัญญัติการจัดซื้อจัดจ้างและการบริหารพัสดุภาครัฐ พ.ศ. ๒๕๖๐ และระเบียบกระทรวงการคลังว่าด้วยการจัดซื้อจัดจ้างและการบริหารพัสดุภาครัฐ พ.ศ. ๒๕๖๐ รวมถึงกฎกระทรวงและประกาศที่เกี่ยวข้องที่ออกตามความในพระราชบัญญัติดังกล่าว</w:t>
       </w:r>
     </w:p>
     <w:p>
@@ -4969,7 +2444,7 @@
           <w:sz w:val="32"/>
           <w:szCs w:val="32"/>
         </w:rPr>
-        <w:t>ระยะเวลาดำเนินการจัดซื้อจัดจ้างนี้มีกำหนดรวมทั้งสิ้น หนึ่งร้อยแปดสิบวัน นับถัดจากวันลงนามในสัญญา โดยผู้รับจ้างจะต้องส่งมอบผลงานตามงวดงานต่างๆ ดังรายละเอียดต่อไปนี้</w:t>
+        <w:t>ผู้รับจ้างต้องดำเนินการให้แล้วเสร็จภายในระยะเวลารวมทั้งสิ้น ๑๘๐ วัน นับถัดจากวันลงนามในสัญญา โดยมีรายละเอียดและกำหนดเวลาการส่งมอบผลงานในแต่ละงวด ดังแสดงรายละเอียดตามตารางกำหนดเวลาการส่งมอบผลงาน</w:t>
       </w:r>
     </w:p>
     <w:tbl>
@@ -5082,7 +2557,7 @@
                 <w:sz w:val="32"/>
                 <w:szCs w:val="32"/>
               </w:rPr>
-              <w:t>เอกสารวิเคราะห์ออกแบบและต้นแบบหน้าจอ</w:t>
+              <w:t>ส่งมอบเอกสารวิเคราะห์ออกแบบและต้นแบบหน้าจอ</w:t>
             </w:r>
           </w:p>
         </w:tc>
@@ -5144,7 +2619,7 @@
                 <w:sz w:val="32"/>
                 <w:szCs w:val="32"/>
               </w:rPr>
-              <w:t>ระบบในสภาพแวดล้อมทดสอบพร้อมรายงานทดสอบเชื่อมโยง</w:t>
+              <w:t>ส่งมอบระบบในสภาพแวดล้อมทดสอบพร้อมรายงานทดสอบเชื่อมโยง</w:t>
             </w:r>
           </w:p>
         </w:tc>
@@ -5206,7 +2681,7 @@
                 <w:sz w:val="32"/>
                 <w:szCs w:val="32"/>
               </w:rPr>
-              <w:t>ระบบใช้งานจริง รายงานการทดสอบยอมรับโดยผู้ใช้ และรายงานการอบรม</w:t>
+              <w:t>ส่งมอบระบบใช้งานจริง รายงานการทดสอบยอมรับโดยผู้ใช้ และรายงานการฝึกอบรม</w:t>
             </w:r>
           </w:p>
         </w:tc>
@@ -5268,7 +2743,7 @@
                 <w:sz w:val="32"/>
                 <w:szCs w:val="32"/>
               </w:rPr>
-              <w:t>ซอร์สโค้ด คู่มือผู้ใช้ คู่มือผู้ดูแลระบบ และแผนบำรุงรักษา</w:t>
+              <w:t>ส่งมอบซอร์สโค้ด คู่มือผู้ใช้ คู่มือผู้ดูแลระบบ และแผนบำรุงรักษา</w:t>
             </w:r>
           </w:p>
         </w:tc>
@@ -5305,7 +2780,7 @@
           <w:sz w:val="32"/>
           <w:szCs w:val="32"/>
         </w:rPr>
-        <w:t>ทั้งนี้ ผู้รับจ้างจะต้องแจ้งกำหนดส่งมอบผลงานให้คณะกรรมการตรวจรับพัสดุทราบเป็นลายลักษณ์อักษรล่วงหน้าก่อนถึงกำหนดส่งมอบในแต่ละงวดด้วย</w:t>
+        <w:t>ผู้รับจ้างต้องมีหนังสือแจ้งกำหนดการส่งมอบงานในแต่ละงวดให้ผู้ว่าจ้างทราบล่วงหน้าเป็นลายลักษณ์อักษร เพื่อให้คณะกรรมการตรวจรับพัสดุสามารถดำเนินการตรวจสอบผลงานได้ตามกำหนดเวลาต่อไป</w:t>
       </w:r>
     </w:p>
     <w:p>
@@ -5333,21 +2808,7 @@
           <w:sz w:val="32"/>
           <w:szCs w:val="32"/>
         </w:rPr>
-        <w:t>งวดงานและการจ่ายเงิน</w:t>
-      </w:r>
-    </w:p>
-    <w:p>
-      <w:pPr>
-        <w:spacing w:line="240" w:lineRule="auto"/>
-        <w:ind w:firstLine="709"/>
-      </w:pPr>
-      <w:r>
-        <w:rPr>
-          <w:rFonts w:ascii="TH Sarabun New" w:hAnsi="TH Sarabun New" w:cs="TH Sarabun New" w:eastAsia="TH Sarabun New"/>
-          <w:sz w:val="32"/>
-          <w:szCs w:val="32"/>
-        </w:rPr>
-        <w:t>การชำระค่าจ้างให้แก่ผู้รับจ้างจะดำเนินการตามความก้าวหน้าของผลงานที่ส่งมอบและผ่านการตรวจรับพัสดุโดยคณะกรรมการตรวจรับพัสดุเป็นรายงวด โดยมีรายละเอียดดังนี้</w:t>
+        <w:t>การจ่ายเงินค่าจ้างให้แก่ผู้รับจ้าง กรมบัญชีกลางจะแบ่งการจ่ายเงินออกเป็นงวด ๆ ตามผลงานที่ได้ส่งมอบจริง โดยกำหนดจำนวนงวดการจ่ายเงินออกเป็น ๔ งวด ดังรายละเอียดตามตารางการจ่ายเงินดังต่อไปนี้</w:t>
       </w:r>
     </w:p>
     <w:tbl>
@@ -5502,7 +2963,7 @@
                 <w:sz w:val="32"/>
                 <w:szCs w:val="32"/>
               </w:rPr>
-              <w:t>เอกสารวิเคราะห์ออกแบบและต้นแบบหน้าจอ</w:t>
+              <w:t>ส่งมอบเอกสารวิเคราะห์ออกแบบและต้นแบบหน้าจอ</w:t>
             </w:r>
           </w:p>
         </w:tc>
@@ -5562,6 +3023,7 @@
                 <w:sz w:val="32"/>
                 <w:szCs w:val="32"/>
               </w:rPr>
+              <w:t>๕๐๐,๐๐๐</w:t>
             </w:r>
           </w:p>
         </w:tc>
@@ -5603,7 +3065,7 @@
                 <w:sz w:val="32"/>
                 <w:szCs w:val="32"/>
               </w:rPr>
-              <w:t>ระบบในสภาพแวดล้อมทดสอบพร้อมรายงานทดสอบเชื่อมโยง</w:t>
+              <w:t>ส่งมอบระบบในสภาพแวดล้อมทดสอบพร้อมรายงานทดสอบเชื่อมโยง</w:t>
             </w:r>
           </w:p>
         </w:tc>
@@ -5663,6 +3125,7 @@
                 <w:sz w:val="32"/>
                 <w:szCs w:val="32"/>
               </w:rPr>
+              <w:t>๑,๐๐๐,๐๐๐</w:t>
             </w:r>
           </w:p>
         </w:tc>
@@ -5704,7 +3167,7 @@
                 <w:sz w:val="32"/>
                 <w:szCs w:val="32"/>
               </w:rPr>
-              <w:t>ระบบใช้งานจริง รายงานการทดสอบยอมรับโดยผู้ใช้ และการฝึกอบรม</w:t>
+              <w:t>ส่งมอบระบบใช้งานจริง รายงานการทดสอบยอมรับโดยผู้ใช้ และการอบรม</w:t>
             </w:r>
           </w:p>
         </w:tc>
@@ -5764,6 +3227,7 @@
                 <w:sz w:val="32"/>
                 <w:szCs w:val="32"/>
               </w:rPr>
+              <w:t>๖๒๕,๐๐๐</w:t>
             </w:r>
           </w:p>
         </w:tc>
@@ -5805,7 +3269,7 @@
                 <w:sz w:val="32"/>
                 <w:szCs w:val="32"/>
               </w:rPr>
-              <w:t>ซอร์สโค้ด คู่มือผู้ใช้ คู่มือผู้ดูแลระบบ และแผนบำรุงรักษา</w:t>
+              <w:t>ส่งมอบซอร์สโค้ด คู่มือ และแผนบำรุงรักษา</w:t>
             </w:r>
           </w:p>
         </w:tc>
@@ -5865,6 +3329,7 @@
                 <w:sz w:val="32"/>
                 <w:szCs w:val="32"/>
               </w:rPr>
+              <w:t>๓๗๕,๐๐๐</w:t>
             </w:r>
           </w:p>
         </w:tc>
@@ -5964,6 +3429,7 @@
                 <w:sz w:val="32"/>
                 <w:szCs w:val="32"/>
               </w:rPr>
+              <w:t>๒,๕๐๐,๐๐๐</w:t>
             </w:r>
           </w:p>
         </w:tc>
@@ -5980,7 +3446,7 @@
           <w:sz w:val="32"/>
           <w:szCs w:val="32"/>
         </w:rPr>
-        <w:t>โดยงวดที่ ๑ ผู้ซื้อจะชำระเงินในอัตราร้อยละ ๒๐ ของจำนวนเงินในสัญญา เมื่อผู้รับจ้างส่งมอบเอกสารวิเคราะห์ออกแบบและต้นแบบหน้าจอ และคณะกรรมการตรวจรับพัสดุได้ตรวจรับเรียบร้อยแล้ว</w:t>
+        <w:t>เงื่อนไขการเบิกจ่ายแต่ละงวด กำหนดให้งวดที่ ๑ ชำระเงินในอัตราร้อยละ ๒๐ ของจำนวนเงินในสัญญา เมื่อผู้รับจ้างส่งมอบงานงวดที่ ๑ และคณะกรรมการตรวจรับพัสดุได้ตรวจรับเรียบร้อยแล้ว งวดที่ ๒ ชำระเงินในอัตราร้อยละ ๔๐ ของจำนวนเงินในสัญญา เมื่อผู้รับจ้างส่งมอบงานงวดที่ ๒ และคณะกรรมการตรวจรับพัสดุได้ตรวจรับเรียบร้อยแล้ว งวดที่ ๓ ชำระเงินในอัตราร้อยละ ๒๕ ของจำนวนเงินในสัญญา เมื่อผู้รับจ้างส่งมอบงานงวดที่ ๓ และคณะกรรมการตรวจรับพัสดุได้ตรวจรับเรียบร้อยแล้ว และงวดที่ ๔ ชำระเงินในอัตราร้อยละ ๑๕ ของจำนวนเงินในสัญญา เมื่อผู้รับจ้างส่งมอบงานงวดที่ ๔ และคณะกรรมการตรวจรับพัสดุได้ตรวจรับเรียบร้อยแล้ว</w:t>
       </w:r>
     </w:p>
     <w:p>
@@ -5994,119 +3460,7 @@
           <w:sz w:val="32"/>
           <w:szCs w:val="32"/>
         </w:rPr>
-        <w:t>งวดที่ ๒ ผู้ซื้อจะชำระเงินในอัตราร้อยละ ๔๐ ของจำนวนเงินในสัญญา เมื่อผู้รับจ้างส่งมอบระบบในสภาพแวดล้อมทดสอบพร้อมรายงานทดสอบเชื่อมโยง และคณะกรรมการตรวจรับพัสดุได้ตรวจรับเรียบร้อยแล้ว</w:t>
-      </w:r>
-    </w:p>
-    <w:p>
-      <w:pPr>
-        <w:spacing w:line="240" w:lineRule="auto"/>
-        <w:ind w:firstLine="709"/>
-      </w:pPr>
-      <w:r>
-        <w:rPr>
-          <w:rFonts w:ascii="TH Sarabun New" w:hAnsi="TH Sarabun New" w:cs="TH Sarabun New" w:eastAsia="TH Sarabun New"/>
-          <w:sz w:val="32"/>
-          <w:szCs w:val="32"/>
-        </w:rPr>
-        <w:t>งวดที่ ๓ ผู้ซื้อจะชำระเงินในอัตราร้อยละ ๒๕ ของจำนวนเงินในสัญญา เมื่อผู้รับจ้างส่งมอบระบบใช้งานจริง รายงานการทดสอบยอมรับโดยผู้ใช้ และดำเนินการฝึกอบรมครบถ้วน และคณะกรรมการตรวจรับพัสดุได้ตรวจรับเรียบร้อยแล้ว</w:t>
-      </w:r>
-    </w:p>
-    <w:p>
-      <w:pPr>
-        <w:spacing w:line="240" w:lineRule="auto"/>
-        <w:ind w:firstLine="709"/>
-      </w:pPr>
-      <w:r>
-        <w:rPr>
-          <w:rFonts w:ascii="TH Sarabun New" w:hAnsi="TH Sarabun New" w:cs="TH Sarabun New" w:eastAsia="TH Sarabun New"/>
-          <w:sz w:val="32"/>
-          <w:szCs w:val="32"/>
-        </w:rPr>
-        <w:t>งวดที่ ๔ ผู้ซื้อจะชำระเงินในอัตราร้อยละ ๑๕ ของจำนวนเงินในสัญญา เมื่อผู้รับจ้างส่งมอบซอร์สโค้ด คู่มือ และแผนบำรุงรักษาครบถ้วน และคณะกรรมการตรวจรับพัสดุได้ตรวจรับเรียบร้อยแล้ว</w:t>
-      </w:r>
-    </w:p>
-    <w:p>
-      <w:pPr>
-        <w:spacing w:line="240" w:lineRule="auto"/>
-        <w:ind w:firstLine="709"/>
-      </w:pPr>
-      <w:r>
-        <w:rPr>
-          <w:rFonts w:ascii="TH Sarabun New" w:hAnsi="TH Sarabun New" w:cs="TH Sarabun New" w:eastAsia="TH Sarabun New"/>
-          <w:sz w:val="32"/>
-          <w:szCs w:val="32"/>
-        </w:rPr>
-        <w:t>การจ่ายเงินทุกงวดให้เป็นไปตามหลักเกณฑ์ที่กำหนด โดยมีการหักเงินประกันผลงานในอัตราร้อยละ ๕ ของจำนวนเงินแต่ละงวด ซึ่งจะคืนให้กับผู้รับจ้างเมื่อพ้นกำหนดระยะเวลาการรับประกันความชำรุดบกพร่องครบถ้วนแล้ว</w:t>
-      </w:r>
-    </w:p>
-    <w:p>
-      <w:pPr>
-        <w:spacing w:line="240" w:lineRule="auto"/>
-        <w:ind w:firstLine="709"/>
-      </w:pPr>
-      <w:r>
-        <w:rPr>
-          <w:rFonts w:ascii="TH Sarabun New" w:hAnsi="TH Sarabun New" w:cs="TH Sarabun New" w:eastAsia="TH Sarabun New"/>
-          <w:sz w:val="32"/>
-          <w:szCs w:val="32"/>
-        </w:rPr>
-        <w:t>ค่าปรับกรณีส่งมอบล่าช้า ให้คำนวณเป็นรายวัน ในอัตราร้อยละ ๐.๑๐ ของวงเงินในงวดที่ส่งมอบล่าช้า นับตั้งแต่วันที่ต้องส่งมอบจนถึงวันที่ตรวจรับพัสดุเสร็จสิ้น</w:t>
-      </w:r>
-    </w:p>
-    <w:p>
-      <w:pPr>
-        <w:spacing w:line="240" w:lineRule="auto"/>
-        <w:ind w:firstLine="709"/>
-      </w:pPr>
-      <w:r>
-        <w:rPr>
-          <w:rFonts w:ascii="TH Sarabun New" w:hAnsi="TH Sarabun New" w:cs="TH Sarabun New" w:eastAsia="TH Sarabun New"/>
-          <w:sz w:val="32"/>
-          <w:szCs w:val="32"/>
-        </w:rPr>
-        <w:t>การรับประกันความชำรุดบกพร่อง ผู้รับจ้างต้องดำเนินการรับประกันระบบเป็นระยะเวลา ๓๖๕ วัน นับถัดจากวันตรวจรับงวดสุดท้ายให้แล้วเสร็จสมบูรณ์</w:t>
-      </w:r>
-    </w:p>
-    <w:p>
-      <w:pPr>
-        <w:spacing w:line="240" w:lineRule="auto"/>
-        <w:ind w:firstLine="709"/>
-      </w:pPr>
-      <w:r>
-        <w:rPr>
-          <w:rFonts w:ascii="TH Sarabun New" w:hAnsi="TH Sarabun New" w:cs="TH Sarabun New" w:eastAsia="TH Sarabun New"/>
-          <w:sz w:val="32"/>
-          <w:szCs w:val="32"/>
-        </w:rPr>
-        <w:t>ทรัพย์สินทางปัญญาลิขสิทธิ์ ซอร์สโค้ด และฐานข้อมูลทั้งหมดที่พัฒนาขึ้นภายใต้สัญญานี้ ถือเป็นกรรมสิทธิ์ของกรมบัญชีกลางแต่เพียงผู้เดียว</w:t>
-      </w:r>
-    </w:p>
-    <w:p>
-      <w:pPr>
-        <w:spacing w:line="240" w:lineRule="auto"/>
-        <w:ind w:firstLine="709"/>
-      </w:pPr>
-      <w:r>
-        <w:rPr>
-          <w:rFonts w:ascii="TH Sarabun New" w:hAnsi="TH Sarabun New" w:cs="TH Sarabun New" w:eastAsia="TH Sarabun New"/>
-          <w:sz w:val="32"/>
-          <w:szCs w:val="32"/>
-        </w:rPr>
-        <w:t>ในการดำเนินการ ผู้รับจ้างต้องรักษาความลับและคุ้มครองข้อมูลส่วนบุคคลตามพระราชบัญญัติคุ้มครองข้อมูลส่วนบุคคลอย่างเคร่งครัด ห้ามนำข้อมูลไปใช้เพื่อการฝึกปัญญาประดิษฐ์ภายนอก และจะต้องทำลายข้อมูลทั้งหมดเมื่อสิ้นสุดสัญญาโดยไม่คิดค่าใช้จ่ายใด ๆ เพิ่มเติมทั้งสิ้น</w:t>
-      </w:r>
-    </w:p>
-    <w:p>
-      <w:pPr>
-        <w:spacing w:line="240" w:lineRule="auto"/>
-        <w:ind w:firstLine="709"/>
-      </w:pPr>
-      <w:r>
-        <w:rPr>
-          <w:rFonts w:ascii="TH Sarabun New" w:hAnsi="TH Sarabun New" w:cs="TH Sarabun New" w:eastAsia="TH Sarabun New"/>
-          <w:sz w:val="32"/>
-          <w:szCs w:val="32"/>
-        </w:rPr>
-        <w:t>ในกรณีที่ผู้รับจ้างส่งมอบงานล่าช้ากว่ากำหนดเวลาตามงวดงาน ผู้ซื้อสงวนสิทธิ์ในการเรียกเก็บค่าปรับเป็นรายวัน โดยให้คำนวณจากวงเงินของงวดงานนั้น ๆ</w:t>
+        <w:t>การหักเงินประกันผลงาน กรมบัญชีกลางจะทำการหักเงินประกันผลงานจากจำนวนเงินที่ต้องจ่ายในแต่ละงวดในอัตราร้อยละ ๕ ของเงินแต่ละงวด เพื่อเป็นหลักประกันความชำรุดบกพร่อง และจะคืนเงินประกันผลงานดังกล่าวให้แก่ผู้รับจ้างเมื่อพ้นกำหนดระยะเวลารับประกันความชำรุดบกพร่องเป็นเวลา ๑ ปี นับถัดจากวันตรวจรับงานงวดสุดท้ายเรียบร้อยแล้ว</w:t>
       </w:r>
     </w:p>
     <w:p>
@@ -6134,7 +3488,7 @@
           <w:sz w:val="32"/>
           <w:szCs w:val="32"/>
         </w:rPr>
-        <w:t>ผู้รับจ้างจะต้องวางเงินประกันผลงานในอัตราร้อยละ ๕ ของมูลค่าเงินที่ได้รับในแต่ละงวด โดยให้หักเป็นเงินประกันผลงาน และจะดำเนินการคืนเงินประกันผลงานดังกล่าวเมื่อพ้นกำหนดระยะเวลาการรับประกันความชำรุดบกพร่องแล้ว</w:t>
+        <w:t>ผู้รับจ้างต้องวางหลักประกันการสัญญาในวันลงนามในสัญญา เป็นจำนวนเงินร้อยละห้าของวงเงินสัญญา เพื่อเป็นการประกันความเสียหายอันอาจเกิดขึ้นจากการปฏิบัติงานตามสัญญาหรือความชำรุดบกพร่องที่เกิดขึ้นจากการปฏิบัติงานของผู้รับจ้าง</w:t>
       </w:r>
     </w:p>
     <w:p>
@@ -6148,21 +3502,7 @@
           <w:sz w:val="32"/>
           <w:szCs w:val="32"/>
         </w:rPr>
-        <w:t>กรณีผู้รับจ้างส่งมอบงานล่าช้ากว่ากำหนด จะต้องชำระค่าปรับเป็นรายวัน ในอัตราร้อยละ ๐.๑๐ ของวงเงินในงวดที่ส่งมอบล่าช้า โดยให้คำนวณค่าปรับตั้งแต่วันถัดจากวันที่ครบกำหนดจนถึงวันที่ส่งมอบงานจริง</w:t>
-      </w:r>
-    </w:p>
-    <w:p>
-      <w:pPr>
-        <w:spacing w:line="240" w:lineRule="auto"/>
-        <w:ind w:firstLine="709"/>
-      </w:pPr>
-      <w:r>
-        <w:rPr>
-          <w:rFonts w:ascii="TH Sarabun New" w:hAnsi="TH Sarabun New" w:cs="TH Sarabun New" w:eastAsia="TH Sarabun New"/>
-          <w:sz w:val="32"/>
-          <w:szCs w:val="32"/>
-        </w:rPr>
-        <w:t>ผู้รับจ้างจะต้องรับประกันระบบและผลงานของโครงการเป็นระยะเวลาสามร้อยหกสิบห้าวัน นับถัดจากวันตรวจรับงวดสุดท้าย หากเกิดความชำรุดบกพร่องใด ๆ ในช่วงเวลารับประกัน ผู้รับจ้างต้องดำเนินการแก้ไขให้แล้วเสร็จโดยไม่คิดค่าใช้จ่ายใด ๆ เพิ่มเติมทั้งสิ้น</w:t>
+        <w:t>กรมบัญชีกลางจะคืนหลักประกันสัญญาให้แก่ผู้รับจ้างโดยไม่มีดอกเบี้ย เมื่อพ้นกำหนดระยะเวลารับประกันความชำรุดบกพร่องตามสัญญาแล้ว</w:t>
       </w:r>
     </w:p>
     <w:p>
@@ -6190,7 +3530,63 @@
           <w:sz w:val="32"/>
           <w:szCs w:val="32"/>
         </w:rPr>
-        <w:t>ค่าปรับส่งมอบล่าช้าร้อยละ 0.10 ต่อวันของวงเงินงวดที่ส่งมอบช้า</w:t>
+        <w:t>ในกรณีที่ผู้รับจ้างไม่สามารถส่งมอบงานให้แล้วเสร็จภายในระยะเวลาที่กำหนดตามสัญญา กรมบัญชีกลางจะกำหนดค่าปรับในอัตราร้อยละ ๐.๑๐ (ศูนย์จุดหนึ่งศูนย์) ต่อวันของวงเงินงวดที่ส่งมอบช้า นับถัดจากวันลงนามในสัญญาหรือตามกำหนดเวลาแล้วแต่กรณี จนกว่าผู้รับจ้างจะนำส่งมอบงานแล้วเสร็จบริบูรณ์</w:t>
+      </w:r>
+    </w:p>
+    <w:p>
+      <w:pPr>
+        <w:spacing w:line="240" w:lineRule="auto"/>
+        <w:ind w:firstLine="709"/>
+      </w:pPr>
+      <w:r>
+        <w:rPr>
+          <w:rFonts w:ascii="TH Sarabun New" w:hAnsi="TH Sarabun New" w:cs="TH Sarabun New" w:eastAsia="TH Sarabun New"/>
+          <w:sz w:val="32"/>
+          <w:szCs w:val="32"/>
+        </w:rPr>
+        <w:t>การคำนวณค่าปรับดังกล่าวจะคิดคำนวณจากมูลค่าของงานงวดที่ส่งมอบล่าช้า เว้นแต่ในกรณีที่ความล่าช้ามิได้เกิดจากความผิดหรือความบกพร่องของผู้รับจ้าง หรือเกิดจากเหตุสุดวิสัย หรือเป็นกรณีที่อยู่ในอำนาจของหัวหน้าหน่วยงานของรัฐที่จะพิจารณาผ่อนผันการ</w:t>
+      </w:r>
+    </w:p>
+    <w:p>
+      <w:pPr>
+        <w:spacing w:line="240" w:lineRule="auto"/>
+        <w:ind w:firstLine="709"/>
+      </w:pPr>
+      <w:r>
+        <w:rPr>
+          <w:rFonts w:ascii="TH Sarabun New" w:hAnsi="TH Sarabun New" w:cs="TH Sarabun New" w:eastAsia="TH Sarabun New"/>
+          <w:sz w:val="32"/>
+          <w:szCs w:val="32"/>
+        </w:rPr>
+        <w:t>ลดหรือขยายเวลาตามกฎหมายและระเบียบที่เกี่ยวข้อง</w:t>
+      </w:r>
+    </w:p>
+    <w:p>
+      <w:pPr>
+        <w:spacing w:line="240" w:lineRule="auto"/>
+        <w:ind w:firstLine="709"/>
+      </w:pPr>
+      <w:r>
+        <w:rPr>
+          <w:rFonts w:ascii="TH Sarabun New" w:hAnsi="TH Sarabun New" w:cs="TH Sarabun New" w:eastAsia="TH Sarabun New"/>
+          <w:sz w:val="32"/>
+          <w:szCs w:val="32"/>
+        </w:rPr>
+        <w:t>ผู้รับจ้างจะต้องชำระค่าปรับที่เกิดขึ้นให้แล้วเสร็จโดยพลัน หรือยินยอมให้กรมบัญชีกลางหักเงินจากงวดงานที่ต้องจ่าย หรือหักจากหลักประกันสัญญาที่ผู้รับจ้างได้วางไว้กับทางราชการโดยไม่ต้องบอกกล่าวล่วงหน้า ทั้งนี้ หากพ้นกำหนดเวลาการรับประกันความชำรุดบกพร่องแล้วยัง</w:t>
+      </w:r>
+    </w:p>
+    <w:p>
+      <w:pPr>
+        <w:spacing w:line="240" w:lineRule="auto"/>
+        <w:ind w:firstLine="709"/>
+      </w:pPr>
+      <w:r>
+        <w:rPr>
+          <w:rFonts w:ascii="TH Sarabun New" w:hAnsi="TH Sarabun New" w:cs="TH Sarabun New" w:eastAsia="TH Sarabun New"/>
+          <w:sz w:val="32"/>
+          <w:szCs w:val="32"/>
+        </w:rPr>
+        <w:t>มีค่าปรับค้างชำระ ผู้รับจ้างจะต้องรับผิดชอบชำระให้ครบถ้วนจนแล้วเสร็จโดยไม่คิดค่าใช้จ่ายใด ๆ เพิ่มเติมทั้งสิ้น ตามพระราชบัญญัติการจัดซื้อจัดจ้างและการบริหารพัสดุภาครัฐ พ.ศ. ๒๕๖๐</w:t>
       </w:r>
     </w:p>
     <w:p>
@@ -6218,7 +3614,7 @@
           <w:sz w:val="32"/>
           <w:szCs w:val="32"/>
         </w:rPr>
-        <w:t>การรับประกันความชำรุดบกพร่องของระบบ</w:t>
+        <w:t>ผู้รับจ้างจะต้องรับประกันความชำรุดบกพร่องของงานจ้างพัฒนาระบบสารสนเทศบริหารสัญญาจัดซื้อจัดจ้างภาครัฐ เป็นระยะเวลาสามร้อยหกสิบห้าวัน นับถัดจากวันที่คณะกรรมการตรวจรับพัสดุได้ทำการตรวจรับมอบงานงวดสุดท้ายเรียบร้อยแล้ว โดยผู้รับจ้างต้องจัดให้มีบริการบำรุงรักษาและแก้ไขข้อขัดข้องของระบบงาน ตลอดจนอุปกรณ์และส่วนประกอบที่เกี่ยวข้องอย่างต่อเนื่อง</w:t>
       </w:r>
     </w:p>
     <w:p>
@@ -6232,7 +3628,7 @@
           <w:sz w:val="32"/>
           <w:szCs w:val="32"/>
         </w:rPr>
-        <w:t>ผู้รับจ้างจะต้องดำเนินการรับประกันระบบสารสนเทศเป็นระยะเวลา ๓๖๕ วัน นับถัดจากวันตรวจรับงวดสุดท้ายของการพัฒนาระบบ โดยในระหว่างระยะเวลารับประกันดังกล่าว ผู้รับจ้างมีหน้าที่รับผิดชอบในการแก้ไขความชำรุดบกพร่องของระบบทั้งหมดที่เกิดขึ้น ไม่ว่ากรณีใด ๆ ก็ตาม ซึ่งรวมถึงการปรับปรุงซอฟต์แวร์และการดำเนินการให้ระบบมีความพร้อมใช้งานอย่างต่อเนื่องตลอดเวลา</w:t>
+        <w:t>ในกรณีที่ระบบสารสนเทศเกิดความชำรุดบกพร่อง ขัดข้อง หรือไม่สามารถใช้งานได้ตามปกติ ผู้รับจ้างจะต้องจัดส่งเจ้าหน้าที่ผู้มีความเชี่ยวชาญเข้าดำเนินการแก้ไขและบำรุงรักษา โดยมีเวลาตอบสนองต่อปัญหาไม่เกินสี่ชั่วโมง และต้องดำเนินการแก้ไขข้อขัดข้องให้แล้วเสร็จสมบูรณ์ภายในยี่สิบสี่ชั่วโมง นับแต่เวลาที่ได้รับแจ้งจากกรมบัญชีกลาง ทั้งนี้ เพื่อให้ระบบมีความพร้อมใช้งานไม่ต่ำกว่าร้อยละเก้าจุดห้าศูนย์ตลอดระยะเวลารับประกันความชำรุดบกพร่องดังกล่าว</w:t>
       </w:r>
     </w:p>
     <w:p>
@@ -6246,63 +3642,7 @@
           <w:sz w:val="32"/>
           <w:szCs w:val="32"/>
         </w:rPr>
-        <w:t>ผู้รับจ้างจะต้องจัดเตรียมบุคลากรและทรัพยากรเพื่อตอบสนองต่อปัญหาหรือความชำรุดบกพร่องของระบบ โดยมีรายละเอียดดังนี้</w:t>
-      </w:r>
-    </w:p>
-    <w:p>
-      <w:pPr>
-        <w:spacing w:line="240" w:lineRule="auto"/>
-        <w:ind w:firstLine="709"/>
-      </w:pPr>
-      <w:r>
-        <w:rPr>
-          <w:rFonts w:ascii="TH Sarabun New" w:hAnsi="TH Sarabun New" w:cs="TH Sarabun New" w:eastAsia="TH Sarabun New"/>
-          <w:sz w:val="32"/>
-          <w:szCs w:val="32"/>
-        </w:rPr>
-        <w:t>๑. ระยะเวลาในการตอบสนอง: ต้องไม่เกิน ๔ ชั่วโมง นับตั้งแต่ได้รับแจ้งจากหน่วยงานผู้ซื้อ</w:t>
-      </w:r>
-    </w:p>
-    <w:p>
-      <w:pPr>
-        <w:spacing w:line="240" w:lineRule="auto"/>
-        <w:ind w:firstLine="709"/>
-      </w:pPr>
-      <w:r>
-        <w:rPr>
-          <w:rFonts w:ascii="TH Sarabun New" w:hAnsi="TH Sarabun New" w:cs="TH Sarabun New" w:eastAsia="TH Sarabun New"/>
-          <w:sz w:val="32"/>
-          <w:szCs w:val="32"/>
-        </w:rPr>
-        <w:t>๒. ระยะเวลาดำเนินการแก้ไขให้แล้วเสร็จ: ต้องไม่เกิน ๒๔ ชั่วโมง นับจากวันที่มีการตอบสนอง</w:t>
-      </w:r>
-    </w:p>
-    <w:p>
-      <w:pPr>
-        <w:spacing w:line="240" w:lineRule="auto"/>
-        <w:ind w:firstLine="709"/>
-      </w:pPr>
-      <w:r>
-        <w:rPr>
-          <w:rFonts w:ascii="TH Sarabun New" w:hAnsi="TH Sarabun New" w:cs="TH Sarabun New" w:eastAsia="TH Sarabun New"/>
-          <w:sz w:val="32"/>
-          <w:szCs w:val="32"/>
-        </w:rPr>
-        <w:t>๓. ความพร้อมใช้งานของระบบ: ผู้รับจ้างต้องรับประกันความพร้อมใช้งานของระบบให้อยู่ในระดับไม่ต่ำกว่าร้อยละ ๙๙.๕</w:t>
-      </w:r>
-    </w:p>
-    <w:p>
-      <w:pPr>
-        <w:spacing w:line="240" w:lineRule="auto"/>
-        <w:ind w:firstLine="709"/>
-      </w:pPr>
-      <w:r>
-        <w:rPr>
-          <w:rFonts w:ascii="TH Sarabun New" w:hAnsi="TH Sarabun New" w:cs="TH Sarabun New" w:eastAsia="TH Sarabun New"/>
-          <w:sz w:val="32"/>
-          <w:szCs w:val="32"/>
-        </w:rPr>
-        <w:t>การให้บริการ การแก้ไข และการบำรุงรักษาที่เกี่ยวข้องกับการรับประกันความชำรุดบกพร่องทั้งหมดนี้ ให้ถือว่าดำเนินการโดยไม่คิดค่าใช้จ่ายใด ๆ เพิ่มเติมทั้งสิ้น โดยผู้ซื้อมีสิทธิ์ในการตรวจสอบและเรียกให้มีการแก้ไขปรับปรุงซอฟต์แวร์ได้ตลอดระยะเวลาดังกล่าว</w:t>
+        <w:t>การดำเนินการแก้ไข ปรับปรุง เปลี่ยนแปลง หรือบำรุงรักษาระบบงานทั้งหมดตลอดระยะเวลารับประกันความชำรุดบกพร่องนี้ ผู้รับจ้างจะต้องเป็นผู้รับภาระค่าใช้จ่ายทั้งสิ้น โดยไม่คิดค่าใช้จ่ายใด ๆ เพิ่มเติมทั้งสิ้นจากกรมบัญชีกลาง</w:t>
       </w:r>
     </w:p>
     <w:p>
@@ -6330,7 +3670,7 @@
           <w:sz w:val="32"/>
           <w:szCs w:val="32"/>
         </w:rPr>
-        <w:t>ลิขสิทธิ์และกรรมสิทธิ์ในผลงานที่ผู้รับจ้างดำเนินการพัฒนาขึ้นภายใต้สัญญาฉบับนี้ ไม่ว่าจะเป็นซอร์สโค้ดทั้งหมด ฐานข้อมูล โครงสร้างของระบบ และเอกสารประกอบการพัฒนาทุกประเภท ถือเป็นทรัพย์สินทางปัญญา กรรมสิทธิ์ และลิขสิทธิ์โดยสมบูรณ์ตกเป็นของกรมบัญชีกลางทันทีที่ดำเนินการส่งมอบผลงานดังกล่าวให้แก่หน่วยงานผู้ว่าจ้างแล้ว</w:t>
+        <w:t>บรรดาสิทธิ์โดยชอบด้วยกฎหมาย ลิขสิทธิ์ สิทธิบัตร หรือสิทธิทางปัญญาใด ๆ ในบรรดาซอร์สโค้ด ฐานข้อมูล โปรแกรมคอมพิวเตอร์ เอกสารการวิเคราะห์ ออกแบบ คู่มือ และผลงานทั้งหมดที่ผู้รับจ้างได้พัฒนา จัดทำ หรือเรียบเรียงขึ้นภายใต้การดำเนินงานตามสัญญานี้ ให้ตกเป็นกรรมสิทธิ์ของกรมบัญชีกลางทันทีที่ได้จัดทำหรือส่งมอบผลงานนั้น ๆ</w:t>
       </w:r>
     </w:p>
     <w:p>
@@ -6344,7 +3684,7 @@
           <w:sz w:val="32"/>
           <w:szCs w:val="32"/>
         </w:rPr>
-        <w:t>ผู้รับจ้างตกลงและรับรองว่าจะไม่นำซอร์สโค้ด ฐานข้อมูล หรือองค์ความรู้ใด ๆ ที่พัฒนาขึ้นเพื่อการพัฒนาระบบสารสนเทศบริหารสัญญาจัดซื้อจัดจ้างภาครัฐไปใช้ประโยชน์หรือเผยแพร่แก่บุคคลภายนอก ไม่ว่าด้วยรูปแบบใดก็ตาม ทั้งนี้ ผู้รับจ้างต้องให้ความร่วมมือในการส่งมอบซอร์สโค้ดฉบับสมบูรณ์ล่าสุด คู่มือผู้ดูแลระบบ และข้อมูลที่เกี่ยวข้องทั้งหมด โดยไม่คิดค่าใช้จ่ายใด ๆ เพิ่มเติมทั้งสิ้น</w:t>
+        <w:t>ผู้รับจ้างมีหน้าที่ส่งมอบซอร์สโค้ดฉบับสมบูรณ์ล่าสุด พร้อมทั้งเอกสารที่เกี่ยวข้องทั้งหมดให้แก่กรมบัญชีกลางอย่างครบถ้วน โดยกรมบัญชีกลางมีสิทธิในการนำไปใช้ ดัดแปลง พัฒนาต่อ หรืออนุญาตให้บุคคลอื่นดำเนินการแทนได้โดยไม่คิดค่าใช้จ่ายใด ๆ เพิ่มเติมทั้งสิ้น และผู้รับจ้างไม่มีสิทธิเรียกเก็บค่าตอบแทนหรือค่าลิขสิทธิ์เพิ่มเติมใด ๆ ทั้งสิ้น</w:t>
       </w:r>
     </w:p>
     <w:p>
@@ -6358,7 +3698,7 @@
           <w:sz w:val="32"/>
           <w:szCs w:val="32"/>
         </w:rPr>
-        <w:t>นอกจากนี้ ในกรณีที่มีการกล่าวอ้างว่าผลงานที่พัฒนาขึ้นภายใต้สัญญานี้มีการละเมิดลิขสิทธิ์หรือสิทธิของบุคคลภายนอก ผู้รับจ้างจะต้องเป็นผู้รับผิดชอบในการดำเนินการทางกฎหมายทั้งหมด และชดใช้ค่าเสียหายใด ๆ ที่เกิดขึ้นแก่กรมบัญชีกลางให้เป็นไปโดยสมบูรณ์</w:t>
+        <w:t>ในกรณีที่ผลงานที่ผู้รับจ้างส่งมอบหรือนำมาใช้ในการดำเนินงานตามสัญญานี้ไปละเมิดลิขสิทธิ์ สิทธิบัตร หรือสิทธิทางปัญญาของบุคคลภายนอก ผู้รับจ้างจะต้องรับผิดชอบในความเสียหาย ค่าฤชาธรรมเนียม และค่าใช้จ่ายทั้งปวงที่เกิดขึ้นแต่เพียงผู้เดียว โดยกรมบัญชีกลางไม่ต้องร่วมรับผิดชอบใด ๆ ทั้งสิ้น และผู้รับจ้างต้องดำเนินการแก้ไขให้การดำเนินงานเป็นไปตามสัญญาโดยไม่กระทบต่อสิทธิของกรมบัญชีกลาง</w:t>
       </w:r>
     </w:p>
     <w:p>
@@ -6386,7 +3726,49 @@
           <w:sz w:val="32"/>
           <w:szCs w:val="32"/>
         </w:rPr>
-        <w:t>ผู้รับจ้างจะต้องจัดทำข้อตกลงไม่เปิดเผยข้อมูลที่เป็นความลับกับผู้ซื้อ และให้มีการลงนามในเอกสารดังกล่าวพร้อมกับการลงนามในสัญญา ผู้รับจ้างต้องดำเนินการเก็บรักษาและใช้ข้อมูลที่ได้รับจากผู้ซื้ออย่างเคร่งครัดตามพระราชบัญญัติคุ้มครองข้อมูลส่วนบุคคล พ.ศ. ๒๕๖๒ (PDPA) โดยห้ามนำข้อมูลใด ๆ ที่เกี่ยวข้องกับระบบงานไปใช้ในการฝึกปัญญาประดิษฐ์หรือพัฒนาแบบจำลองภายนอกโดยเด็ดขาด ทั้งนี้ เมื่อสัญญาจ้างพัฒนาระบบสารสนเทศสิ้นสุดลง ผู้รับจ้างมีหน้าที่ต้องส่งคืน หรือดำเนินการทำลายข้อมูลทั้งหมดที่อยู่ในความครอบครองของผู้รับจ้างให้เป็นลายลักษณ์อักษร และจะต้องแจ้งยืนยันการดำเนินการดังกล่าวต่อผู้ซื้อเพื่อเป็นหลักฐานต่อไป</w:t>
+        <w:t>ผู้รับจ้างต้องจัดทำและลงนามในข้อตกลงไม่เปิดเผยข้อมูลที่เป็นความลับพร้อมกับการลงนามในสัญญาจ้าง เพื่อรักษาความลับและความปลอดภัยของข้อมูลทั้งหมดที่ได้รับหรือเข้าถึงจากการดำเนินงานตามโครงการนี้</w:t>
+      </w:r>
+    </w:p>
+    <w:p>
+      <w:pPr>
+        <w:spacing w:line="240" w:lineRule="auto"/>
+        <w:ind w:firstLine="709"/>
+      </w:pPr>
+      <w:r>
+        <w:rPr>
+          <w:rFonts w:ascii="TH Sarabun New" w:hAnsi="TH Sarabun New" w:cs="TH Sarabun New" w:eastAsia="TH Sarabun New"/>
+          <w:sz w:val="32"/>
+          <w:szCs w:val="32"/>
+        </w:rPr>
+        <w:t>ผู้รับจ้างต้องปฏิบัติตามพระราชบัญญัติคุ้มครองข้อมูลส่วนบุคคล พ.ศ. ๒๕๖๒ และกฎหมาย ระเบียบ หรือประกาศที่เกี่ยวข้องกับการคุ้มครองข้อมูลส่วนบุคคลอย่างเคร่งครัด โดยห้ามนำข้อมูลส่วนบุคคลหรือข้อมูลสารสนเทศของทางราชการไปใช้ นอกเหนือวัตถุประสงค์ของโครงการ หรือนำไปฝึกโมเดลปัญญาประดิษฐ์ภายนอก หรือเปิดเผยต่อบุคคลภายนอกโดยไม่ได้รับความยินยอมเป็นลายลักษณ์อักษรจากกรมบัญชีกลาง</w:t>
+      </w:r>
+    </w:p>
+    <w:p>
+      <w:pPr>
+        <w:spacing w:line="240" w:lineRule="auto"/>
+        <w:ind w:firstLine="709"/>
+      </w:pPr>
+      <w:r>
+        <w:rPr>
+          <w:rFonts w:ascii="TH Sarabun New" w:hAnsi="TH Sarabun New" w:cs="TH Sarabun New" w:eastAsia="TH Sarabun New"/>
+          <w:sz w:val="32"/>
+          <w:szCs w:val="32"/>
+        </w:rPr>
+        <w:t>ผู้รับจ้างต้องควบคุมการเข้าถึงพื้นที่ปฏิบัติงานและระบบสารสนเทศให้จำกัดเฉพาะบุคลากรผู้มีหน้าที่เกี่ยวข้องเท่านั้น ตลอดจนต้องมีมาตรการรักษาความมั่นคงปลอดภัยของข้อมูลอย่างรัดกุมตลอดระยะเวลาดำเนินการ</w:t>
+      </w:r>
+    </w:p>
+    <w:p>
+      <w:pPr>
+        <w:spacing w:line="240" w:lineRule="auto"/>
+        <w:ind w:firstLine="709"/>
+      </w:pPr>
+      <w:r>
+        <w:rPr>
+          <w:rFonts w:ascii="TH Sarabun New" w:hAnsi="TH Sarabun New" w:cs="TH Sarabun New" w:eastAsia="TH Sarabun New"/>
+          <w:sz w:val="32"/>
+          <w:szCs w:val="32"/>
+        </w:rPr>
+        <w:t>เมื่อสัญญาสิ้นสุดลง หรือเมื่อกรมบัญชีกลางร้องขอ ผู้รับจ้างต้องส่งคืนข้อมูลทั้งหมดหรือทำลายข้อมูลที่อยู่ในความครอบครอง พร้อมทั้งทำหนังสือแจ้งยืนยันการดำเนินการดังกล่าวเป็นลายลักษณ์อักษรให้กรมบัญชีกลางทราบโดยเร็ว โดยไม่มีค่าใช้จ่ายใด ๆ เพิ่มเติมทั้งสิ้น</w:t>
       </w:r>
     </w:p>
     <w:p>
@@ -6414,91 +3796,7 @@
           <w:sz w:val="32"/>
           <w:szCs w:val="32"/>
         </w:rPr>
-        <w:t>หน่วยงานผู้รับผิดชอบและสถานที่ติดต่อ</w:t>
-      </w:r>
-    </w:p>
-    <w:p>
-      <w:pPr>
-        <w:spacing w:line="240" w:lineRule="auto"/>
-        <w:ind w:firstLine="709"/>
-      </w:pPr>
-      <w:r>
-        <w:rPr>
-          <w:rFonts w:ascii="TH Sarabun New" w:hAnsi="TH Sarabun New" w:cs="TH Sarabun New" w:eastAsia="TH Sarabun New"/>
-          <w:sz w:val="32"/>
-          <w:szCs w:val="32"/>
-        </w:rPr>
-        <w:t>กองการพัสดุ กรมบัญชีกลาง</w:t>
-      </w:r>
-    </w:p>
-    <w:p>
-      <w:pPr>
-        <w:spacing w:line="240" w:lineRule="auto"/>
-        <w:ind w:firstLine="709"/>
-      </w:pPr>
-      <w:r>
-        <w:rPr>
-          <w:rFonts w:ascii="TH Sarabun New" w:hAnsi="TH Sarabun New" w:cs="TH Sarabun New" w:eastAsia="TH Sarabun New"/>
-          <w:sz w:val="32"/>
-          <w:szCs w:val="32"/>
-        </w:rPr>
-        <w:t>ถนนพระรามที่ ๖ แขวงพญาไท เขตพญาไท กรุงเทพมหานคร</w:t>
-      </w:r>
-    </w:p>
-    <w:p>
-      <w:pPr>
-        <w:spacing w:line="240" w:lineRule="auto"/>
-        <w:ind w:firstLine="709"/>
-      </w:pPr>
-      <w:r>
-        <w:rPr>
-          <w:rFonts w:ascii="TH Sarabun New" w:hAnsi="TH Sarabun New" w:cs="TH Sarabun New" w:eastAsia="TH Sarabun New"/>
-          <w:sz w:val="32"/>
-          <w:szCs w:val="32"/>
-        </w:rPr>
-        <w:t>โทรศัพท์ ๐-๒๑๒๗-๗๐๐๐</w:t>
-      </w:r>
-    </w:p>
-    <w:p>
-      <w:pPr>
-        <w:spacing w:line="240" w:lineRule="auto"/>
-        <w:ind w:firstLine="709"/>
-      </w:pPr>
-      <w:r>
-        <w:rPr>
-          <w:rFonts w:ascii="TH Sarabun New" w:hAnsi="TH Sarabun New" w:cs="TH Sarabun New" w:eastAsia="TH Sarabun New"/>
-          <w:sz w:val="32"/>
-          <w:szCs w:val="32"/>
-        </w:rPr>
-        <w:t>ไปรษณีย์อิเล็กทรอนิกส์ @..th</w:t>
-      </w:r>
-    </w:p>
-    <w:p>
-      <w:pPr>
-        <w:spacing w:line="240" w:lineRule="auto"/>
-        <w:ind w:firstLine="709"/>
-      </w:pPr>
-      <w:r>
-        <w:rPr>
-          <w:rFonts w:ascii="TH Sarabun New" w:hAnsi="TH Sarabun New" w:cs="TH Sarabun New" w:eastAsia="TH Sarabun New"/>
-          <w:sz w:val="32"/>
-          <w:szCs w:val="32"/>
-        </w:rPr>
-        <w:t>ผู้สนใจสามารถเสนอแนะและวิจารณ์ร่างขอบเขตของงาน (TOR) ได้ที่หน่วยงานดังกล่าว</w:t>
-      </w:r>
-    </w:p>
-    <w:p>
-      <w:pPr>
-        <w:spacing w:line="240" w:lineRule="auto"/>
-        <w:ind w:firstLine="709"/>
-      </w:pPr>
-      <w:r>
-        <w:rPr>
-          <w:rFonts w:ascii="TH Sarabun New" w:hAnsi="TH Sarabun New" w:cs="TH Sarabun New" w:eastAsia="TH Sarabun New"/>
-          <w:sz w:val="32"/>
-          <w:szCs w:val="32"/>
-        </w:rPr>
-        <w:t>หมายเหตุ: การดำเนินการจัดซื้อจัดจ้างนี้เป็นไปตามพระราชบัญญัติการจัดซื้อจัดจ้างและการบริหารพัสดุภาครัฐ พ.ศ. ๒๕๖๐ และหากงบประมาณรายจ่ายประจำปีได้ยังไม่ได้รับการจัดสรร จะดำเนินการตามระเบียบที่เกี่ยวข้องต่อไป</w:t>
+        <w:t>กองการพัสดุ กรมบัญชีกลาง ถนนพระรามที่ 6 แขวงพญาไท เขตพญาไท กรุงเทพมหานคร 10400 หมายเลขโทรศัพท์ 0-2127-7000 ไปรษณีย์อิเล็กทรอนิกส์ @..th และเว็บไซต์ของกรมบัญชีกลาง สำหรับผู้ยื่นข้อเสนอที่ต้องการเสนอแนะหรือวิจารณ์ร่างขอบเขตของงานนี้ สามารถส่งข้อเสนอ ฯ มายังหน่วยงานตามที่อยู่ดังกล่าวได้โดยตรง ทั้งนี้ โครงการดังกล่าวอยู่ระหว่างดำเนินการตามพระราชบัญญัติการจัดซื้อจัดจ้างและการบริหารพัสดุภาครัฐ พ.ศ. 2560 และจะดำเนินการลงนามในสัญญาเมื่อได้รับการจัดสรรงบประมาณรายจ่ายประจำปีแล้ว</w:t>
       </w:r>
     </w:p>
     <w:p>

</xml_diff>